<commit_message>
Exec summary: restore Experiment 1-3 and Biggest limitation sections with plain-language agent drafts for Jason to rewrite
Co-Authored-By: Claude Fable 5.1 <noreply@anthropic.com>

Claude-Session: https://claude.ai/code/session_011eNoRh7HnqxwuUuQK5Y4fW
</commit_message>
<xml_diff>
--- a/writeup/mats12-report.docx
+++ b/writeup/mats12-report.docx
@@ -34,7 +34,7 @@
         <w:t xml:space="preserve">September 2026</w:t>
       </w:r>
     </w:p>
-    <w:bookmarkStart w:id="17" w:name="executive-summary"/>
+    <w:bookmarkStart w:id="21" w:name="executive-summary"/>
     <w:p>
       <w:pPr>
         <w:pStyle w:val="Heading1"/>
@@ -216,7 +216,61 @@
         <w:t xml:space="preserve"> </w:t>
       </w:r>
       <w:r>
-        <w:t xml:space="preserve">## High-level takeaways</w:t>
+        <w:t xml:space="preserve">## Experiment 1 — Does J-Lens beat the logit lens at binding?</w:t>
+      </w:r>
+    </w:p>
+    <w:p>
+      <w:pPr>
+        <w:pStyle w:val="BodyText"/>
+      </w:pPr>
+      <w:r>
+        <w:t xml:space="preserve">I ran J-Lens and the logit lens on the same 160 held-out prompts at the frozen layers. J-Lens scored 0.781 and the logit lens 0.688, against a 0.519 shuffled-label control. Both beat the control. But the model’s own next-token guess at the same spot was already 0.800, so this alone does not show that either lens read the binding.</w:t>
+      </w:r>
+    </w:p>
+    <w:bookmarkEnd w:id="16"/>
+    <w:bookmarkStart w:id="17" w:name="experiment-2-do-the-controls-hold"/>
+    <w:p>
+      <w:pPr>
+        <w:pStyle w:val="Heading2"/>
+      </w:pPr>
+      <w:r>
+        <w:t xml:space="preserve">Experiment 2 — Do the controls hold?</w:t>
+      </w:r>
+    </w:p>
+    <w:p>
+      <w:pPr>
+        <w:pStyle w:val="FirstParagraph"/>
+      </w:pPr>
+      <w:r>
+        <w:t xml:space="preserve">Two controls ran on every read. Shuffling the labels scored about 0.52. Putting a random map of the same size in place of J-Lens scored about 0.50. Both sit at chance, so the score in Experiment 1 is not coming from the pipeline itself.</w:t>
+      </w:r>
+    </w:p>
+    <w:bookmarkEnd w:id="17"/>
+    <w:bookmarkStart w:id="18" w:name="X444d33cdc79da0ce4be1444b3a46153c51831c6"/>
+    <w:p>
+      <w:pPr>
+        <w:pStyle w:val="Heading2"/>
+      </w:pPr>
+      <w:r>
+        <w:t xml:space="preserve">Experiment 3 — What replaced the causal test</w:t>
+      </w:r>
+    </w:p>
+    <w:p>
+      <w:pPr>
+        <w:pStyle w:val="FirstParagraph"/>
+      </w:pPr>
+      <w:r>
+        <w:t xml:space="preserve">The causal test could not run: the released J-Lens code gives no way to separate its part of the residual from the rest. In its place I used the records where the model’s own guess pointed to the wrong city (32 to 40 of the 160). A lens that reads binding should still get these right. J-Lens got 0.344 and 0.125, below chance. A probe trained with the answer key read 0.525 at the same spot, so no method found a binding signal there.</w:t>
+      </w:r>
+    </w:p>
+    <w:bookmarkEnd w:id="18"/>
+    <w:bookmarkStart w:id="19" w:name="high-level-takeaways"/>
+    <w:p>
+      <w:pPr>
+        <w:pStyle w:val="Heading2"/>
+      </w:pPr>
+      <w:r>
+        <w:t xml:space="preserve">High-level takeaways</w:t>
       </w:r>
     </w:p>
     <w:p>
@@ -285,9 +339,27 @@
         <w:t xml:space="preserve">Key Limitaion: I tested just one model (Qwen3.5.4B), only tested on fitted lens, and only tested on small task.</w:t>
       </w:r>
     </w:p>
-    <w:bookmarkEnd w:id="16"/>
-    <w:bookmarkEnd w:id="17"/>
-    <w:bookmarkStart w:id="23" w:name="randomly-selected-raw-examples"/>
+    <w:bookmarkEnd w:id="19"/>
+    <w:bookmarkStart w:id="20" w:name="biggest-limitation"/>
+    <w:p>
+      <w:pPr>
+        <w:pStyle w:val="Heading2"/>
+      </w:pPr>
+      <w:r>
+        <w:t xml:space="preserve">Biggest limitation</w:t>
+      </w:r>
+    </w:p>
+    <w:p>
+      <w:pPr>
+        <w:pStyle w:val="FirstParagraph"/>
+      </w:pPr>
+      <w:r>
+        <w:t xml:space="preserve">One model, one released lens, one small task with six cities. At the position that matters most, even a probe trained with the answers found nothing, so I cannot say whether the binding is stored at some layer or position I did not read. I also did not test whether changing the residual changes the answer.</w:t>
+      </w:r>
+    </w:p>
+    <w:bookmarkEnd w:id="20"/>
+    <w:bookmarkEnd w:id="21"/>
+    <w:bookmarkStart w:id="27" w:name="randomly-selected-raw-examples"/>
     <w:p>
       <w:pPr>
         <w:pStyle w:val="Heading1"/>
@@ -443,7 +515,7 @@
         <w:t xml:space="preserve">committed run output; agent-unverified.</w:t>
       </w:r>
     </w:p>
-    <w:bookmarkStart w:id="18" w:name="example-1-success-real-zero-035-bba-t6"/>
+    <w:bookmarkStart w:id="22" w:name="example-1-success-real-zero-035-bba-t6"/>
     <w:p>
       <w:pPr>
         <w:pStyle w:val="Heading3"/>
@@ -729,8 +801,8 @@
         </w:tc>
       </w:tr>
     </w:tbl>
-    <w:bookmarkEnd w:id="18"/>
-    <w:bookmarkStart w:id="19" w:name="example-2-success-real-zero-047-aba-t6"/>
+    <w:bookmarkEnd w:id="22"/>
+    <w:bookmarkStart w:id="23" w:name="example-2-success-real-zero-047-aba-t6"/>
     <w:p>
       <w:pPr>
         <w:pStyle w:val="Heading3"/>
@@ -1016,8 +1088,8 @@
         </w:tc>
       </w:tr>
     </w:tbl>
-    <w:bookmarkEnd w:id="19"/>
-    <w:bookmarkStart w:id="20" w:name="example-3-failure-real-zero-035-bab-t6"/>
+    <w:bookmarkEnd w:id="23"/>
+    <w:bookmarkStart w:id="24" w:name="example-3-failure-real-zero-035-bab-t6"/>
     <w:p>
       <w:pPr>
         <w:pStyle w:val="Heading3"/>
@@ -1303,8 +1375,8 @@
         </w:tc>
       </w:tr>
     </w:tbl>
-    <w:bookmarkEnd w:id="20"/>
-    <w:bookmarkStart w:id="21" w:name="example-4-failure-real-zero-023-bba-t6"/>
+    <w:bookmarkEnd w:id="24"/>
+    <w:bookmarkStart w:id="25" w:name="example-4-failure-real-zero-023-bba-t6"/>
     <w:p>
       <w:pPr>
         <w:pStyle w:val="Heading3"/>
@@ -1590,8 +1662,8 @@
         </w:tc>
       </w:tr>
     </w:tbl>
-    <w:bookmarkEnd w:id="21"/>
-    <w:bookmarkStart w:id="22" w:name="X08d12fc239e1304c729fa2c498dcd7bd419b671"/>
+    <w:bookmarkEnd w:id="25"/>
+    <w:bookmarkStart w:id="26" w:name="X08d12fc239e1304c729fa2c498dcd7bd419b671"/>
     <w:p>
       <w:pPr>
         <w:pStyle w:val="Heading3"/>
@@ -1884,9 +1956,9 @@
         </w:pict>
       </w:r>
     </w:p>
-    <w:bookmarkEnd w:id="22"/>
-    <w:bookmarkEnd w:id="23"/>
-    <w:bookmarkStart w:id="30" w:name="motivation-and-research-question"/>
+    <w:bookmarkEnd w:id="26"/>
+    <w:bookmarkEnd w:id="27"/>
+    <w:bookmarkStart w:id="34" w:name="motivation-and-research-question"/>
     <w:p>
       <w:pPr>
         <w:pStyle w:val="Heading1"/>
@@ -1931,7 +2003,7 @@
         <w:t xml:space="preserve">the model’s answer?</w:t>
       </w:r>
     </w:p>
-    <w:bookmarkStart w:id="24" w:name="what-j-lens-is-briefly"/>
+    <w:bookmarkStart w:id="28" w:name="what-j-lens-is-briefly"/>
     <w:p>
       <w:pPr>
         <w:pStyle w:val="Heading2"/>
@@ -1948,8 +2020,8 @@
         <w:t xml:space="preserve">J-Lens is defined from first principles in §2.1.</w:t>
       </w:r>
     </w:p>
-    <w:bookmarkEnd w:id="24"/>
-    <w:bookmarkStart w:id="28" w:name="X44758b870a0731464fb2764574cc64fea7fcb2d"/>
+    <w:bookmarkEnd w:id="28"/>
+    <w:bookmarkStart w:id="32" w:name="X44758b870a0731464fb2764574cc64fea7fcb2d"/>
     <w:p>
       <w:pPr>
         <w:pStyle w:val="Heading2"/>
@@ -2055,18 +2127,18 @@
           <wp:inline>
             <wp:extent cx="4373880" cy="2142308"/>
             <wp:effectExtent b="0" l="0" r="0" t="0"/>
-            <wp:docPr descr="The binding problem: two prompts, the same four concepts, opposite pairings. Only the pairing distinguishes them, so only a reader of the relation can tell them apart." title="" id="26" name="Picture"/>
+            <wp:docPr descr="The binding problem: two prompts, the same four concepts, opposite pairings. Only the pairing distinguishes them, so only a reader of the relation can tell them apart." title="" id="30" name="Picture"/>
             <a:graphic>
               <a:graphicData uri="http://schemas.openxmlformats.org/drawingml/2006/picture">
                 <pic:pic>
                   <pic:nvPicPr>
-                    <pic:cNvPr descr="results/figures/binding-concept/fig1-binding-problem.png" id="27" name="Picture"/>
+                    <pic:cNvPr descr="results/figures/binding-concept/fig1-binding-problem.png" id="31" name="Picture"/>
                     <pic:cNvPicPr>
                       <a:picLocks noChangeArrowheads="1" noChangeAspect="1"/>
                     </pic:cNvPicPr>
                   </pic:nvPicPr>
                   <pic:blipFill>
-                    <a:blip r:embed="rId25"/>
+                    <a:blip r:embed="rId29"/>
                     <a:stretch>
                       <a:fillRect/>
                     </a:stretch>
@@ -2304,8 +2376,8 @@
         <w:t xml:space="preserve">selection, not a linearly decodable stored binding.</w:t>
       </w:r>
     </w:p>
-    <w:bookmarkEnd w:id="28"/>
-    <w:bookmarkStart w:id="29" w:name="the-gap"/>
+    <w:bookmarkEnd w:id="32"/>
+    <w:bookmarkStart w:id="33" w:name="the-gap"/>
     <w:p>
       <w:pPr>
         <w:pStyle w:val="Heading2"/>
@@ -2383,9 +2455,9 @@
         </w:pict>
       </w:r>
     </w:p>
-    <w:bookmarkEnd w:id="29"/>
-    <w:bookmarkEnd w:id="30"/>
-    <w:bookmarkStart w:id="43" w:name="method"/>
+    <w:bookmarkEnd w:id="33"/>
+    <w:bookmarkEnd w:id="34"/>
+    <w:bookmarkStart w:id="47" w:name="method"/>
     <w:p>
       <w:pPr>
         <w:pStyle w:val="Heading1"/>
@@ -2496,7 +2568,7 @@
         <w:t xml:space="preserve">turns out to be the interesting part, this project has failed.</w:t>
       </w:r>
     </w:p>
-    <w:bookmarkStart w:id="31" w:name="X57525b78a038dd7677b74b2cd929c744f8e7d70"/>
+    <w:bookmarkStart w:id="35" w:name="X57525b78a038dd7677b74b2cd929c744f8e7d70"/>
     <w:p>
       <w:pPr>
         <w:pStyle w:val="Heading2"/>
@@ -2921,8 +2993,8 @@
         <w:t xml:space="preserve">question with no obvious answer in either direction.</w:t>
       </w:r>
     </w:p>
-    <w:bookmarkEnd w:id="31"/>
-    <w:bookmarkStart w:id="32" w:name="substrate-model-lens-and-environment"/>
+    <w:bookmarkEnd w:id="35"/>
+    <w:bookmarkStart w:id="36" w:name="substrate-model-lens-and-environment"/>
     <w:p>
       <w:pPr>
         <w:pStyle w:val="Heading2"/>
@@ -3596,8 +3668,8 @@
         <w:t xml:space="preserve">8.51 GB of 47.7 GB — headroom is not a constraint on this design.</w:t>
       </w:r>
     </w:p>
-    <w:bookmarkEnd w:id="32"/>
-    <w:bookmarkStart w:id="33" w:name="Xe108057b195fe3c9ce8721c4dbab2e15b618e33"/>
+    <w:bookmarkEnd w:id="36"/>
+    <w:bookmarkStart w:id="37" w:name="Xe108057b195fe3c9ce8721c4dbab2e15b618e33"/>
     <w:p>
       <w:pPr>
         <w:pStyle w:val="Heading2"/>
@@ -4225,8 +4297,8 @@
         <w:t xml:space="preserve">, and are never tuned on.</w:t>
       </w:r>
     </w:p>
-    <w:bookmarkEnd w:id="33"/>
-    <w:bookmarkStart w:id="34" w:name="Xca73d2c970aa0db9760c2d5b75ab5af6c348063"/>
+    <w:bookmarkEnd w:id="37"/>
+    <w:bookmarkStart w:id="38" w:name="Xca73d2c970aa0db9760c2d5b75ab5af6c348063"/>
     <w:p>
       <w:pPr>
         <w:pStyle w:val="Heading2"/>
@@ -4599,8 +4671,8 @@
         <w:t xml:space="preserve">contaminated and undetermined references respectively.</w:t>
       </w:r>
     </w:p>
-    <w:bookmarkEnd w:id="34"/>
-    <w:bookmarkStart w:id="42" w:name="arms-metrics-and-controls"/>
+    <w:bookmarkEnd w:id="38"/>
+    <w:bookmarkStart w:id="46" w:name="arms-metrics-and-controls"/>
     <w:p>
       <w:pPr>
         <w:pStyle w:val="Heading2"/>
@@ -4618,18 +4690,18 @@
           <wp:inline>
             <wp:extent cx="4373880" cy="2767148"/>
             <wp:effectExtent b="0" l="0" r="0" t="0"/>
-            <wp:docPr descr="Three instruments on the same residual: the supervised difference-in-means probe as ceiling, J-Lens as the unsupervised reader, and the logit lens as floor." title="" id="36" name="Picture"/>
+            <wp:docPr descr="Three instruments on the same residual: the supervised difference-in-means probe as ceiling, J-Lens as the unsupervised reader, and the logit lens as floor." title="" id="40" name="Picture"/>
             <a:graphic>
               <a:graphicData uri="http://schemas.openxmlformats.org/drawingml/2006/picture">
                 <pic:pic>
                   <pic:nvPicPr>
-                    <pic:cNvPr descr="results/figures/binding-concept/fig3-three-instruments.png" id="37" name="Picture"/>
+                    <pic:cNvPr descr="results/figures/binding-concept/fig3-three-instruments.png" id="41" name="Picture"/>
                     <pic:cNvPicPr>
                       <a:picLocks noChangeArrowheads="1" noChangeAspect="1"/>
                     </pic:cNvPicPr>
                   </pic:nvPicPr>
                   <pic:blipFill>
-                    <a:blip r:embed="rId35"/>
+                    <a:blip r:embed="rId39"/>
                     <a:stretch>
                       <a:fillRect/>
                     </a:stretch>
@@ -4664,7 +4736,7 @@
         <w:t xml:space="preserve">Three instruments on the same residual: the supervised difference-in-means probe as ceiling, J-Lens as the unsupervised reader, and the logit lens as floor.</w:t>
       </w:r>
     </w:p>
-    <w:bookmarkStart w:id="38" w:name="three-arms"/>
+    <w:bookmarkStart w:id="42" w:name="three-arms"/>
     <w:p>
       <w:pPr>
         <w:pStyle w:val="Heading3"/>
@@ -5046,8 +5118,8 @@
         <w:t xml:space="preserve">passive script.)</w:t>
       </w:r>
     </w:p>
-    <w:bookmarkEnd w:id="38"/>
-    <w:bookmarkStart w:id="39" w:name="metrics"/>
+    <w:bookmarkEnd w:id="42"/>
+    <w:bookmarkStart w:id="43" w:name="metrics"/>
     <w:p>
       <w:pPr>
         <w:pStyle w:val="Heading3"/>
@@ -5336,8 +5408,8 @@
         <w:t xml:space="preserve">never form a vocabulary rank and are unaffected.</w:t>
       </w:r>
     </w:p>
-    <w:bookmarkEnd w:id="39"/>
-    <w:bookmarkStart w:id="40" w:name="baselines-and-controls"/>
+    <w:bookmarkEnd w:id="43"/>
+    <w:bookmarkStart w:id="44" w:name="baselines-and-controls"/>
     <w:p>
       <w:pPr>
         <w:pStyle w:val="Heading3"/>
@@ -6297,8 +6369,8 @@
         <w:t xml:space="preserve">11–357 at its selected layers.</w:t>
       </w:r>
     </w:p>
-    <w:bookmarkEnd w:id="40"/>
-    <w:bookmarkStart w:id="41" w:name="Xf1357951e2d3a6b81edaa0ff5b599eb419d4d06"/>
+    <w:bookmarkEnd w:id="44"/>
+    <w:bookmarkStart w:id="45" w:name="Xf1357951e2d3a6b81edaa0ff5b599eb419d4d06"/>
     <w:p>
       <w:pPr>
         <w:pStyle w:val="Heading3"/>
@@ -6415,10 +6487,10 @@
         </w:pict>
       </w:r>
     </w:p>
-    <w:bookmarkEnd w:id="41"/>
-    <w:bookmarkEnd w:id="42"/>
-    <w:bookmarkEnd w:id="43"/>
-    <w:bookmarkStart w:id="44" w:name="preregistration-and-what-was-frozen-when"/>
+    <w:bookmarkEnd w:id="45"/>
+    <w:bookmarkEnd w:id="46"/>
+    <w:bookmarkEnd w:id="47"/>
+    <w:bookmarkStart w:id="48" w:name="preregistration-and-what-was-frozen-when"/>
     <w:p>
       <w:pPr>
         <w:pStyle w:val="Heading1"/>
@@ -6806,8 +6878,8 @@
         </w:pict>
       </w:r>
     </w:p>
-    <w:bookmarkEnd w:id="44"/>
-    <w:bookmarkStart w:id="54" w:name="results"/>
+    <w:bookmarkEnd w:id="48"/>
+    <w:bookmarkStart w:id="58" w:name="results"/>
     <w:p>
       <w:pPr>
         <w:pStyle w:val="Heading1"/>
@@ -6816,7 +6888,7 @@
         <w:t xml:space="preserve">4. Results</w:t>
       </w:r>
     </w:p>
-    <w:bookmarkStart w:id="45" w:name="behavioral-eligibility"/>
+    <w:bookmarkStart w:id="49" w:name="behavioral-eligibility"/>
     <w:p>
       <w:pPr>
         <w:pStyle w:val="Heading2"/>
@@ -7102,8 +7174,8 @@
         <w:t xml:space="preserve">already on its way.</w:t>
       </w:r>
     </w:p>
-    <w:bookmarkEnd w:id="45"/>
-    <w:bookmarkStart w:id="50" w:name="X6f6fe317ba0cb18ffb6dfc71314c6d0ee2f4a72"/>
+    <w:bookmarkEnd w:id="49"/>
+    <w:bookmarkStart w:id="54" w:name="X6f6fe317ba0cb18ffb6dfc71314c6d0ee2f4a72"/>
     <w:p>
       <w:pPr>
         <w:pStyle w:val="Heading2"/>
@@ -7411,12 +7483,12 @@
           <wp:inline>
             <wp:extent cx="4373880" cy="2672926"/>
             <wp:effectExtent b="0" l="0" r="0" t="0"/>
-            <wp:docPr descr="Direction score by position on frozen held-out: both lenses rise at the relation-completing token and track the model’s own next-token preference; the randomised transport stays at chance." title="" id="46" name="Picture"/>
+            <wp:docPr descr="Direction score by position on frozen held-out: both lenses rise at the relation-completing token and track the model’s own next-token preference; the randomised transport stays at chance." title="" id="50" name="Picture"/>
             <a:graphic>
               <a:graphicData uri="http://schemas.openxmlformats.org/drawingml/2006/picture">
                 <pic:pic>
                   <pic:nvPicPr>
-                    <pic:cNvPr descr="results/figures/stage3-frac-by-position.png" id="47" name="Picture"/>
+                    <pic:cNvPr descr="results/figures/stage3-frac-by-position.png" id="51" name="Picture"/>
                     <pic:cNvPicPr>
                       <a:picLocks noChangeArrowheads="1" noChangeAspect="1"/>
                     </pic:cNvPicPr>
@@ -7847,12 +7919,12 @@
           <wp:inline>
             <wp:extent cx="4373880" cy="2870358"/>
             <wp:effectExtent b="0" l="0" r="0" t="0"/>
-            <wp:docPr descr="On records where the model’s own developing preference is wrong, every passive readout is wrong with it." title="" id="48" name="Picture"/>
+            <wp:docPr descr="On records where the model’s own developing preference is wrong, every passive readout is wrong with it." title="" id="52" name="Picture"/>
             <a:graphic>
               <a:graphicData uri="http://schemas.openxmlformats.org/drawingml/2006/picture">
                 <pic:pic>
                   <pic:nvPicPr>
-                    <pic:cNvPr descr="results/figures/stage3-discriminating-set.png" id="49" name="Picture"/>
+                    <pic:cNvPr descr="results/figures/stage3-discriminating-set.png" id="53" name="Picture"/>
                     <pic:cNvPicPr>
                       <a:picLocks noChangeArrowheads="1" noChangeAspect="1"/>
                     </pic:cNvPicPr>
@@ -8330,8 +8402,8 @@
         <w:t xml:space="preserve">instrument, not the model.</w:t>
       </w:r>
     </w:p>
-    <w:bookmarkEnd w:id="50"/>
-    <w:bookmarkStart w:id="51" w:name="layerwise-structure"/>
+    <w:bookmarkEnd w:id="54"/>
+    <w:bookmarkStart w:id="55" w:name="layerwise-structure"/>
     <w:p>
       <w:pPr>
         <w:pStyle w:val="Heading2"/>
@@ -8465,8 +8537,8 @@
         <w:t xml:space="preserve">relation-completing token and is finished by the question mark.</w:t>
       </w:r>
     </w:p>
-    <w:bookmarkEnd w:id="51"/>
-    <w:bookmarkStart w:id="52" w:name="controls"/>
+    <w:bookmarkEnd w:id="55"/>
+    <w:bookmarkStart w:id="56" w:name="controls"/>
     <w:p>
       <w:pPr>
         <w:pStyle w:val="Heading2"/>
@@ -8743,8 +8815,8 @@
         </w:tc>
       </w:tr>
     </w:tbl>
-    <w:bookmarkEnd w:id="52"/>
-    <w:bookmarkStart w:id="53" w:name="causal-arm"/>
+    <w:bookmarkEnd w:id="56"/>
+    <w:bookmarkStart w:id="57" w:name="causal-arm"/>
     <w:p>
       <w:pPr>
         <w:pStyle w:val="Heading2"/>
@@ -8864,9 +8936,9 @@
         </w:pict>
       </w:r>
     </w:p>
-    <w:bookmarkEnd w:id="53"/>
-    <w:bookmarkEnd w:id="54"/>
-    <w:bookmarkStart w:id="55" w:name="error-analysis"/>
+    <w:bookmarkEnd w:id="57"/>
+    <w:bookmarkEnd w:id="58"/>
+    <w:bookmarkStart w:id="59" w:name="error-analysis"/>
     <w:p>
       <w:pPr>
         <w:pStyle w:val="Heading1"/>
@@ -9023,8 +9095,8 @@
         </w:pict>
       </w:r>
     </w:p>
-    <w:bookmarkEnd w:id="55"/>
-    <w:bookmarkStart w:id="56" w:name="sanity-checks-and-red-teaming"/>
+    <w:bookmarkEnd w:id="59"/>
+    <w:bookmarkStart w:id="60" w:name="sanity-checks-and-red-teaming"/>
     <w:p>
       <w:pPr>
         <w:pStyle w:val="Heading1"/>
@@ -9587,8 +9659,8 @@
         </w:pict>
       </w:r>
     </w:p>
-    <w:bookmarkEnd w:id="56"/>
-    <w:bookmarkStart w:id="57" w:name="limitations"/>
+    <w:bookmarkEnd w:id="60"/>
+    <w:bookmarkStart w:id="61" w:name="limitations"/>
     <w:p>
       <w:pPr>
         <w:pStyle w:val="Heading1"/>
@@ -9720,8 +9792,8 @@
         </w:pict>
       </w:r>
     </w:p>
-    <w:bookmarkEnd w:id="57"/>
-    <w:bookmarkStart w:id="58" w:name="what-i-would-do-next"/>
+    <w:bookmarkEnd w:id="61"/>
+    <w:bookmarkStart w:id="62" w:name="what-i-would-do-next"/>
     <w:p>
       <w:pPr>
         <w:pStyle w:val="Heading1"/>
@@ -9861,8 +9933,8 @@
         </w:pict>
       </w:r>
     </w:p>
-    <w:bookmarkEnd w:id="58"/>
-    <w:bookmarkStart w:id="59" w:name="reproducibility"/>
+    <w:bookmarkEnd w:id="62"/>
+    <w:bookmarkStart w:id="63" w:name="reproducibility"/>
     <w:p>
       <w:pPr>
         <w:pStyle w:val="Heading1"/>
@@ -10315,8 +10387,8 @@
         </w:pict>
       </w:r>
     </w:p>
-    <w:bookmarkEnd w:id="59"/>
-    <w:bookmarkStart w:id="60" w:name="time-accounting"/>
+    <w:bookmarkEnd w:id="63"/>
+    <w:bookmarkStart w:id="64" w:name="time-accounting"/>
     <w:p>
       <w:pPr>
         <w:pStyle w:val="Heading1"/>
@@ -10546,8 +10618,8 @@
         </w:pict>
       </w:r>
     </w:p>
-    <w:bookmarkEnd w:id="60"/>
-    <w:bookmarkStart w:id="61" w:name="appendix-where-everything-lives"/>
+    <w:bookmarkEnd w:id="64"/>
+    <w:bookmarkStart w:id="65" w:name="appendix-where-everything-lives"/>
     <w:p>
       <w:pPr>
         <w:pStyle w:val="Heading1"/>
@@ -10654,7 +10726,7 @@
         <w:t xml:space="preserve">.</w:t>
       </w:r>
     </w:p>
-    <w:bookmarkEnd w:id="61"/>
+    <w:bookmarkEnd w:id="65"/>
     <w:sectPr>
       <w:pgMar w:bottom="1020" w:left="1134" w:right="1134" w:top="1020"/>
     </w:sectPr>

</xml_diff>

<commit_message>
Rebuild report after Experiment 1 rewrite
Co-Authored-By: Claude Fable 5.1 <noreply@anthropic.com>

Claude-Session: https://claude.ai/code/session_011eNoRh7HnqxwuUuQK5Y4fW
</commit_message>
<xml_diff>
--- a/writeup/mats12-report.docx
+++ b/writeup/mats12-report.docx
@@ -120,7 +120,7 @@
         <w:t xml:space="preserve"> </w:t>
       </w:r>
       <w:r>
-        <w:t xml:space="preserve">J-Lens scoore 0.781 vs 0.519 for a shuffled-label control end of the fact token. But the next token for the same position is 0.800. On the records where the model is wrong, the lens reduces to 0.344 and 0.125, well below chance. A probe trained with the answer key read 0.525 at the same spot where J-Lens read 0.781, so there was no binding signal there for it to find. Put together, the lens was guessing the model’s answer, not reading its memory.</w:t>
+        <w:t xml:space="preserve">J-Lens scoore 0.781 vs 0.519 for a shuffled-label control end of the fact token. But the next token for the same position is 0.800. On the records where the model is wrong, the lens reduces to 0.344 and 0.125, well below chance. A probe trained with the answer key read 0.525 at the same spot where J-Lens read 0.781, so there was no binding signal there for it to find. My intuition here tells me the lens was guessing the model’s answer, not reading its memory.</w:t>
       </w:r>
       <w:r>
         <w:br/>
@@ -218,13 +218,11 @@
       <w:r>
         <w:t xml:space="preserve">## Experiment 1 — Does J-Lens beat the logit lens at binding?</w:t>
       </w:r>
-    </w:p>
-    <w:p>
-      <w:pPr>
-        <w:pStyle w:val="BodyText"/>
-      </w:pPr>
-      <w:r>
-        <w:t xml:space="preserve">I ran J-Lens and the logit lens on the same 160 held-out prompts at the frozen layers. J-Lens scored 0.781 and the logit lens 0.688, against a 0.519 shuffled-label control. Both beat the control. But the model’s own next-token guess at the same spot was already 0.800, so this alone does not show that either lens read the binding.</w:t>
+      <w:r>
+        <w:t xml:space="preserve"> </w:t>
+      </w:r>
+      <w:r>
+        <w:t xml:space="preserve">The dataset had 50 prompt pairs: 10 for development (40 records) and 40 held out (160 records), not looked at until the layers and positions were frozen. I ran J-Lens and the logit lens on the held-out records at the frozen positions and layers. The logit lens here is the same code with the Jacobian switched off, so the only thing that differs between the two is the Jacobian. At the relation token J-Lens scored 0.781 and the logit lens 0.688, both against a 0.519 shuffled-label control; at the question mark the logit lens was ahead, 0.738 to 0.669. Both beat the control, but the model’s own next-token leaning was already right 80% of the time at that same spot. So on picking the right city it is a wash. Where J-Lens clearly wins is ranking: it puts the correct city at rank 35 of 248K, the logit lens near 1,000. Even so, it still does not appear to be reading any bindings at these layers.</w:t>
       </w:r>
     </w:p>
     <w:bookmarkEnd w:id="16"/>

</xml_diff>

<commit_message>
Rebuild report at the 598-word exec summary
Co-Authored-By: Claude Fable 5.1 <noreply@anthropic.com>

Claude-Session: https://claude.ai/code/session_011eNoRh7HnqxwuUuQK5Y4fW
</commit_message>
<xml_diff>
--- a/writeup/mats12-report.docx
+++ b/writeup/mats12-report.docx
@@ -34,7 +34,7 @@
         <w:t xml:space="preserve">September 2026</w:t>
       </w:r>
     </w:p>
-    <w:bookmarkStart w:id="21" w:name="executive-summary"/>
+    <w:bookmarkStart w:id="16" w:name="executive-summary"/>
     <w:p>
       <w:pPr>
         <w:pStyle w:val="Heading1"/>
@@ -43,13 +43,13 @@
         <w:t xml:space="preserve">Executive summary</w:t>
       </w:r>
     </w:p>
-    <w:bookmarkStart w:id="9" w:name="research-question"/>
+    <w:bookmarkStart w:id="15" w:name="what-problem-am-i-trying-to-solve"/>
     <w:p>
       <w:pPr>
         <w:pStyle w:val="Heading2"/>
       </w:pPr>
       <w:r>
-        <w:t xml:space="preserve">Research Question</w:t>
+        <w:t xml:space="preserve">What problem am I trying to solve?</w:t>
       </w:r>
     </w:p>
     <w:p>
@@ -57,31 +57,7 @@
         <w:pStyle w:val="FirstParagraph"/>
       </w:pPr>
       <w:r>
-        <w:t xml:space="preserve">J-Lens can show you the vocabulary and the bag of concepts at each step or layer, but is it able to read out the binding information, or is it just predicting what the model is about to answer?</w:t>
-      </w:r>
-    </w:p>
-    <w:bookmarkEnd w:id="9"/>
-    <w:bookmarkStart w:id="16" w:name="what-problem-am-i-trying-to-solve"/>
-    <w:p>
-      <w:pPr>
-        <w:pStyle w:val="Heading2"/>
-      </w:pPr>
-      <w:r>
-        <w:t xml:space="preserve">What problem am I trying to solve?</w:t>
-      </w:r>
-    </w:p>
-    <w:p>
-      <w:pPr>
-        <w:pStyle w:val="FirstParagraph"/>
-      </w:pPr>
-      <w:r>
-        <w:t xml:space="preserve">How do we know if the thoughts exposed by an interpretability lens are trustworthy enough to reveal what the model actually represents? I built a small task and experiment to measure, audit, and tell the difference between a guess and the actual answer.</w:t>
-      </w:r>
-      <w:r>
-        <w:br/>
-      </w:r>
-      <w:r>
-        <w:t xml:space="preserve">To answer this question, I built a dataset of prompts. Each prompt contains a pair, such as</w:t>
+        <w:t xml:space="preserve">J-Lens can show the bag of concepts at each layer, but can it read out the binding, or is it just predicting what the model is about to answer? Each prompt holds two facts, such as</w:t>
       </w:r>
       <w:r>
         <w:t xml:space="preserve"> </w:t>
@@ -90,7 +66,7 @@
         <w:t xml:space="preserve">“Helen lives in Prague, and Mark lives in Oslo”</w:t>
       </w:r>
       <w:r>
-        <w:t xml:space="preserve">. For each prompt I swapped pairs changing who goes with what. I then used J-Lens, partway through the computation for the answer, to see if it could tell which city goes with which person. Both cities appear in every prompt, so a method that only detects concepts scores 50%, which is just chance. The intuition says that only binding-access beats chance. However, there is a second way to beat chance, and that is by predicting the answer the model is about to give. My experiment is designed to distinguish between the two.</w:t>
+        <w:t xml:space="preserve">, plus a twin with the pairing swapped. Both cities appear in every prompt, so detecting concepts alone scores 50%, chance. Reading the binding beats that, but so does predicting the answer the model is about to give. My experiment tells the two apart.</w:t>
       </w:r>
       <w:r>
         <w:t xml:space="preserve"> </w:t>
@@ -102,13 +78,7 @@
         <w:t xml:space="preserve"> </w:t>
       </w:r>
       <w:r>
-        <w:t xml:space="preserve">For my experiment I used Qwen3.5-4B with the released pre-fitted J-Lens. Qwen3.5-4B has 32 layers (0-31), with layer 31 being the final answer. J-Lens can read from any of the layers. Using the development dataset, I probed at various points in the prompt: after the facts, during the question, at the question mark, and right before the answer colon. At each of these point I measured the margin. I then froze the layer with the best margin at each position in the sentence. While running the lens I also saved the model’s own answer preference at the same spot, so I could later check the lens on the records where the model itself was leaning wrong.</w:t>
-      </w:r>
-      <w:r>
-        <w:t xml:space="preserve"> </w:t>
-      </w:r>
-      <w:r>
-        <w:t xml:space="preserve">Using the held-out data, I again probed at the frozen layers at each position to measure the margin. A positive value means the lens prefers the correct answer. The magnitude of that number measures how much it’s preferred. Of the 4 popsitions, the interesting one is just after the model is forced to start answering the question.</w:t>
+        <w:t xml:space="preserve">I used Qwen3.5-4B with the released pre-fitted J-Lens. The dataset had 50 prompt pairs: 10 for development (40 records) and 40 held out (160 records), not looked at until the layers and positions were frozen. On development records I read the lens at four spots, measured the margin (correct city minus swapped city), and froze the best layer at each spot. While running the lens I also saved the model’s own answer preference at each spot, to later check the lens where the model itself leaned wrong. Then I read the held-out records once at those settings. The logit lens is the same code with the Jacobian switched off.</w:t>
       </w:r>
       <w:r>
         <w:t xml:space="preserve"> </w:t>
@@ -120,7 +90,7 @@
         <w:t xml:space="preserve"> </w:t>
       </w:r>
       <w:r>
-        <w:t xml:space="preserve">J-Lens scoore 0.781 vs 0.519 for a shuffled-label control end of the fact token. But the next token for the same position is 0.800. On the records where the model is wrong, the lens reduces to 0.344 and 0.125, well below chance. A probe trained with the answer key read 0.525 at the same spot where J-Lens read 0.781, so there was no binding signal there for it to find. My intuition here tells me the lens was guessing the model’s answer, not reading its memory.</w:t>
+        <w:t xml:space="preserve">At the relation token J-Lens picked the correct city 0.781 of the time, against a 0.519 shuffled-label control. But the model’s own next-token leaning was already right 0.800 of the time there, so beating the control alone does not show a read.</w:t>
       </w:r>
       <w:r>
         <w:br/>
@@ -130,18 +100,18 @@
           <wp:inline>
             <wp:extent cx="4267200" cy="2607733"/>
             <wp:effectExtent b="0" l="0" r="0" t="0"/>
-            <wp:docPr descr="Direction score by position on frozen held-out data (n=160): both lenses rise at the token that pins down the answer and track the model’s own next-token preference; the shuffled-label and random-transport controls stay at chance." title="" id="11" name="Picture"/>
+            <wp:docPr descr="Direction score by position on frozen held-out data (n=160): both lenses rise at the token that pins down the answer and track the model’s own next-token preference; the shuffled-label and random-transport controls stay at chance." title="" id="10" name="Picture"/>
             <a:graphic>
               <a:graphicData uri="http://schemas.openxmlformats.org/drawingml/2006/picture">
                 <pic:pic>
                   <pic:nvPicPr>
-                    <pic:cNvPr descr="results/figures/stage3-frac-by-position.png" id="12" name="Picture"/>
+                    <pic:cNvPr descr="results/figures/stage3-frac-by-position.png" id="11" name="Picture"/>
                     <pic:cNvPicPr>
                       <a:picLocks noChangeArrowheads="1" noChangeAspect="1"/>
                     </pic:cNvPicPr>
                   </pic:nvPicPr>
                   <pic:blipFill>
-                    <a:blip r:embed="rId10"/>
+                    <a:blip r:embed="rId9"/>
                     <a:stretch>
                       <a:fillRect/>
                     </a:stretch>
@@ -175,18 +145,18 @@
           <wp:inline>
             <wp:extent cx="4267200" cy="2800349"/>
             <wp:effectExtent b="0" l="0" r="0" t="0"/>
-            <wp:docPr descr="J-Lens accuracy on held-out records, split by whether the model itself was leaning right or wrong. Where the model leaned wrong, every passive readout followed it below chance." title="" id="14" name="Picture"/>
+            <wp:docPr descr="J-Lens accuracy on held-out records, split by whether the model itself was leaning right or wrong. Where the model leaned wrong, every passive readout followed it below chance." title="" id="13" name="Picture"/>
             <a:graphic>
               <a:graphicData uri="http://schemas.openxmlformats.org/drawingml/2006/picture">
                 <pic:pic>
                   <pic:nvPicPr>
-                    <pic:cNvPr descr="results/figures/stage3-discriminating-set.png" id="15" name="Picture"/>
+                    <pic:cNvPr descr="results/figures/stage3-discriminating-set.png" id="14" name="Picture"/>
                     <pic:cNvPicPr>
                       <a:picLocks noChangeArrowheads="1" noChangeAspect="1"/>
                     </pic:cNvPicPr>
                   </pic:nvPicPr>
                   <pic:blipFill>
-                    <a:blip r:embed="rId13"/>
+                    <a:blip r:embed="rId12"/>
                     <a:stretch>
                       <a:fillRect/>
                     </a:stretch>
@@ -222,53 +192,37 @@
         <w:t xml:space="preserve"> </w:t>
       </w:r>
       <w:r>
-        <w:t xml:space="preserve">The dataset had 50 prompt pairs: 10 for development (40 records) and 40 held out (160 records), not looked at until the layers and positions were frozen. I ran J-Lens and the logit lens on the held-out records at the frozen positions and layers. The logit lens here is the same code with the Jacobian switched off, so the only thing that differs between the two is the Jacobian. At the relation token J-Lens scored 0.781 and the logit lens 0.688, both against a 0.519 shuffled-label control; at the question mark the logit lens was ahead, 0.738 to 0.669. Both beat the control, but the model’s own next-token leaning was already right 80% of the time at that same spot. So on picking the right city it is a wash. Where J-Lens clearly wins is ranking: it puts the correct city at rank 35 of 248K, the logit lens near 1,000. Even so, it still does not appear to be reading any bindings at these layers.</w:t>
-      </w:r>
-    </w:p>
-    <w:bookmarkEnd w:id="16"/>
-    <w:bookmarkStart w:id="17" w:name="experiment-2-do-the-controls-hold"/>
-    <w:p>
-      <w:pPr>
-        <w:pStyle w:val="Heading2"/>
-      </w:pPr>
-      <w:r>
-        <w:t xml:space="preserve">Experiment 2 — Do the controls hold?</w:t>
-      </w:r>
-    </w:p>
-    <w:p>
-      <w:pPr>
-        <w:pStyle w:val="FirstParagraph"/>
-      </w:pPr>
-      <w:r>
-        <w:t xml:space="preserve">Two controls ran on every read. Shuffling the labels scored about 0.52. Putting a random map of the same size in place of J-Lens scored about 0.50. Both sit at chance, so the score in Experiment 1 is not coming from the pipeline itself.</w:t>
-      </w:r>
-    </w:p>
-    <w:bookmarkEnd w:id="17"/>
-    <w:bookmarkStart w:id="18" w:name="X444d33cdc79da0ce4be1444b3a46153c51831c6"/>
-    <w:p>
-      <w:pPr>
-        <w:pStyle w:val="Heading2"/>
-      </w:pPr>
-      <w:r>
-        <w:t xml:space="preserve">Experiment 3 — What replaced the causal test</w:t>
-      </w:r>
-    </w:p>
-    <w:p>
-      <w:pPr>
-        <w:pStyle w:val="FirstParagraph"/>
-      </w:pPr>
-      <w:r>
-        <w:t xml:space="preserve">The causal test could not run: the released J-Lens code gives no way to separate its part of the residual from the rest. In its place I used the records where the model’s own guess pointed to the wrong city (32 to 40 of the 160). A lens that reads binding should still get these right. J-Lens got 0.344 and 0.125, below chance. A probe trained with the answer key read 0.525 at the same spot, so no method found a binding signal there.</w:t>
-      </w:r>
-    </w:p>
-    <w:bookmarkEnd w:id="18"/>
-    <w:bookmarkStart w:id="19" w:name="high-level-takeaways"/>
-    <w:p>
-      <w:pPr>
-        <w:pStyle w:val="Heading2"/>
-      </w:pPr>
-      <w:r>
-        <w:t xml:space="preserve">High-level takeaways</w:t>
+        <w:t xml:space="preserve">At the relation token J-Lens scored 0.781 and the logit lens 0.688; at the question mark the logit lens was ahead, 0.738 to 0.669. On picking the right city it is a wash. Where J-Lens clearly wins is ranking: it puts the correct city at rank 35, the logit lens near 1,000.</w:t>
+      </w:r>
+      <w:r>
+        <w:t xml:space="preserve"> </w:t>
+      </w:r>
+      <w:r>
+        <w:t xml:space="preserve">## Experiment 2 — Do the controls hold?</w:t>
+      </w:r>
+      <w:r>
+        <w:t xml:space="preserve"> </w:t>
+      </w:r>
+      <w:r>
+        <w:t xml:space="preserve">First, shuffled labels: I randomly reassigned which city counts as correct (fixed seed) and re-graded. That gave 0.52 and 0.556 at the two spots. Second, a random matrix in place of the J-Lens matrix, same pipeline: direction 0.475-0.537 everywhere and median rank 130K-206K, versus 35 for the real matrix.</w:t>
+      </w:r>
+      <w:r>
+        <w:t xml:space="preserve"> </w:t>
+      </w:r>
+      <w:r>
+        <w:t xml:space="preserve">## Experiment 3 — What replaced the causal test</w:t>
+      </w:r>
+      <w:r>
+        <w:t xml:space="preserve"> </w:t>
+      </w:r>
+      <w:r>
+        <w:t xml:space="preserve">The causal test could not run: the released code cannot separate the J-Lens part of the residual from the rest. Instead I used the 32 to 40 records where the model’s own guess pointed to the wrong city. A lens that reads binding should still get these right. J-Lens got 0.344 and 0.125, below chance. An answer-key probe read 0.525 there, so no method found binding. So the lens was guessing the model’s answer, not reading its memory.</w:t>
+      </w:r>
+      <w:r>
+        <w:t xml:space="preserve"> </w:t>
+      </w:r>
+      <w:r>
+        <w:t xml:space="preserve">## High-level takeaways</w:t>
       </w:r>
     </w:p>
     <w:p>
@@ -280,7 +234,7 @@
         </w:numPr>
       </w:pPr>
       <w:r>
-        <w:t xml:space="preserve">On the task I tested, J-Lens does NOT read what the model has stored for bindings - it simply guesses what the model is about to say.</w:t>
+        <w:t xml:space="preserve">On this task J-Lens does NOT read stored bindings: where the model leaned wrong it followed, 0.344 and 0.125 against 0.500 chance.</w:t>
       </w:r>
       <w:r>
         <w:br/>
@@ -295,7 +249,7 @@
         </w:numPr>
       </w:pPr>
       <w:r>
-        <w:t xml:space="preserve">J-Lens scoring used by most does not catch this; my method allows you to measure whether the readings are saying more than the model’s output, making the use of a Lens more trustworthy.</w:t>
+        <w:t xml:space="preserve">Standard scoring misses this; re-scoring only where the model leans wrong shows whether a reading says more than the output.</w:t>
       </w:r>
     </w:p>
     <w:p>
@@ -307,7 +261,7 @@
         </w:numPr>
       </w:pPr>
       <w:r>
-        <w:t xml:space="preserve">A probe trained with the answer key found nothing to read at the frozen position and layers I scored.</w:t>
+        <w:t xml:space="preserve">A probe trained with the answer key read 0.525 at the frozen spot, chance: nothing there for any method to find.</w:t>
       </w:r>
     </w:p>
     <w:p>
@@ -319,45 +273,24 @@
         </w:numPr>
       </w:pPr>
       <w:r>
-        <w:t xml:space="preserve">J-Lens is better than previous lenses at ranking the right words. J-Lens vs Logit Lens had a ranking of 35 vs 1000 out of 248K words.</w:t>
+        <w:t xml:space="preserve">J-Lens beats the logit lens at ranking the right word: rank 35 versus about 1,000.</w:t>
       </w:r>
       <w:r>
         <w:br/>
       </w:r>
-    </w:p>
-    <w:p>
-      <w:pPr>
-        <w:pStyle w:val="Compact"/>
-        <w:numPr>
-          <w:ilvl w:val="0"/>
-          <w:numId w:val="1001"/>
-        </w:numPr>
-      </w:pPr>
-      <w:r>
-        <w:t xml:space="preserve">Key Limitaion: I tested just one model (Qwen3.5.4B), only tested on fitted lens, and only tested on small task.</w:t>
-      </w:r>
-    </w:p>
-    <w:bookmarkEnd w:id="19"/>
-    <w:bookmarkStart w:id="20" w:name="biggest-limitation"/>
-    <w:p>
-      <w:pPr>
-        <w:pStyle w:val="Heading2"/>
-      </w:pPr>
-      <w:r>
-        <w:t xml:space="preserve">Biggest limitation</w:t>
-      </w:r>
-    </w:p>
-    <w:p>
-      <w:pPr>
-        <w:pStyle w:val="FirstParagraph"/>
-      </w:pPr>
-      <w:r>
-        <w:t xml:space="preserve">One model, one released lens, one small task with six cities. At the position that matters most, even a probe trained with the answers found nothing, so I cannot say whether the binding is stored at some layer or position I did not read. I also did not test whether changing the residual changes the answer.</w:t>
-      </w:r>
-    </w:p>
-    <w:bookmarkEnd w:id="20"/>
-    <w:bookmarkEnd w:id="21"/>
-    <w:bookmarkStart w:id="27" w:name="randomly-selected-raw-examples"/>
+      <w:r>
+        <w:t xml:space="preserve">## Biggest limitation</w:t>
+      </w:r>
+      <w:r>
+        <w:t xml:space="preserve"> </w:t>
+      </w:r>
+      <w:r>
+        <w:t xml:space="preserve">One model, one released lens, one small six-city task. The answer-key probe found nothing at the key position, so the binding may live somewhere I did not read. I did not test whether changing the residual changes the answer.</w:t>
+      </w:r>
+    </w:p>
+    <w:bookmarkEnd w:id="15"/>
+    <w:bookmarkEnd w:id="16"/>
+    <w:bookmarkStart w:id="22" w:name="randomly-selected-raw-examples"/>
     <w:p>
       <w:pPr>
         <w:pStyle w:val="Heading1"/>
@@ -513,7 +446,7 @@
         <w:t xml:space="preserve">committed run output; agent-unverified.</w:t>
       </w:r>
     </w:p>
-    <w:bookmarkStart w:id="22" w:name="example-1-success-real-zero-035-bba-t6"/>
+    <w:bookmarkStart w:id="17" w:name="example-1-success-real-zero-035-bba-t6"/>
     <w:p>
       <w:pPr>
         <w:pStyle w:val="Heading3"/>
@@ -799,8 +732,8 @@
         </w:tc>
       </w:tr>
     </w:tbl>
-    <w:bookmarkEnd w:id="22"/>
-    <w:bookmarkStart w:id="23" w:name="example-2-success-real-zero-047-aba-t6"/>
+    <w:bookmarkEnd w:id="17"/>
+    <w:bookmarkStart w:id="18" w:name="example-2-success-real-zero-047-aba-t6"/>
     <w:p>
       <w:pPr>
         <w:pStyle w:val="Heading3"/>
@@ -1086,8 +1019,8 @@
         </w:tc>
       </w:tr>
     </w:tbl>
-    <w:bookmarkEnd w:id="23"/>
-    <w:bookmarkStart w:id="24" w:name="example-3-failure-real-zero-035-bab-t6"/>
+    <w:bookmarkEnd w:id="18"/>
+    <w:bookmarkStart w:id="19" w:name="example-3-failure-real-zero-035-bab-t6"/>
     <w:p>
       <w:pPr>
         <w:pStyle w:val="Heading3"/>
@@ -1373,8 +1306,8 @@
         </w:tc>
       </w:tr>
     </w:tbl>
-    <w:bookmarkEnd w:id="24"/>
-    <w:bookmarkStart w:id="25" w:name="example-4-failure-real-zero-023-bba-t6"/>
+    <w:bookmarkEnd w:id="19"/>
+    <w:bookmarkStart w:id="20" w:name="example-4-failure-real-zero-023-bba-t6"/>
     <w:p>
       <w:pPr>
         <w:pStyle w:val="Heading3"/>
@@ -1660,8 +1593,8 @@
         </w:tc>
       </w:tr>
     </w:tbl>
-    <w:bookmarkEnd w:id="25"/>
-    <w:bookmarkStart w:id="26" w:name="X08d12fc239e1304c729fa2c498dcd7bd419b671"/>
+    <w:bookmarkEnd w:id="20"/>
+    <w:bookmarkStart w:id="21" w:name="X08d12fc239e1304c729fa2c498dcd7bd419b671"/>
     <w:p>
       <w:pPr>
         <w:pStyle w:val="Heading3"/>
@@ -1954,9 +1887,9 @@
         </w:pict>
       </w:r>
     </w:p>
-    <w:bookmarkEnd w:id="26"/>
-    <w:bookmarkEnd w:id="27"/>
-    <w:bookmarkStart w:id="34" w:name="motivation-and-research-question"/>
+    <w:bookmarkEnd w:id="21"/>
+    <w:bookmarkEnd w:id="22"/>
+    <w:bookmarkStart w:id="29" w:name="motivation-and-research-question"/>
     <w:p>
       <w:pPr>
         <w:pStyle w:val="Heading1"/>
@@ -2001,7 +1934,7 @@
         <w:t xml:space="preserve">the model’s answer?</w:t>
       </w:r>
     </w:p>
-    <w:bookmarkStart w:id="28" w:name="what-j-lens-is-briefly"/>
+    <w:bookmarkStart w:id="23" w:name="what-j-lens-is-briefly"/>
     <w:p>
       <w:pPr>
         <w:pStyle w:val="Heading2"/>
@@ -2018,8 +1951,8 @@
         <w:t xml:space="preserve">J-Lens is defined from first principles in §2.1.</w:t>
       </w:r>
     </w:p>
-    <w:bookmarkEnd w:id="28"/>
-    <w:bookmarkStart w:id="32" w:name="X44758b870a0731464fb2764574cc64fea7fcb2d"/>
+    <w:bookmarkEnd w:id="23"/>
+    <w:bookmarkStart w:id="27" w:name="X44758b870a0731464fb2764574cc64fea7fcb2d"/>
     <w:p>
       <w:pPr>
         <w:pStyle w:val="Heading2"/>
@@ -2125,18 +2058,18 @@
           <wp:inline>
             <wp:extent cx="4373880" cy="2142308"/>
             <wp:effectExtent b="0" l="0" r="0" t="0"/>
-            <wp:docPr descr="The binding problem: two prompts, the same four concepts, opposite pairings. Only the pairing distinguishes them, so only a reader of the relation can tell them apart." title="" id="30" name="Picture"/>
+            <wp:docPr descr="The binding problem: two prompts, the same four concepts, opposite pairings. Only the pairing distinguishes them, so only a reader of the relation can tell them apart." title="" id="25" name="Picture"/>
             <a:graphic>
               <a:graphicData uri="http://schemas.openxmlformats.org/drawingml/2006/picture">
                 <pic:pic>
                   <pic:nvPicPr>
-                    <pic:cNvPr descr="results/figures/binding-concept/fig1-binding-problem.png" id="31" name="Picture"/>
+                    <pic:cNvPr descr="results/figures/binding-concept/fig1-binding-problem.png" id="26" name="Picture"/>
                     <pic:cNvPicPr>
                       <a:picLocks noChangeArrowheads="1" noChangeAspect="1"/>
                     </pic:cNvPicPr>
                   </pic:nvPicPr>
                   <pic:blipFill>
-                    <a:blip r:embed="rId29"/>
+                    <a:blip r:embed="rId24"/>
                     <a:stretch>
                       <a:fillRect/>
                     </a:stretch>
@@ -2374,8 +2307,8 @@
         <w:t xml:space="preserve">selection, not a linearly decodable stored binding.</w:t>
       </w:r>
     </w:p>
-    <w:bookmarkEnd w:id="32"/>
-    <w:bookmarkStart w:id="33" w:name="the-gap"/>
+    <w:bookmarkEnd w:id="27"/>
+    <w:bookmarkStart w:id="28" w:name="the-gap"/>
     <w:p>
       <w:pPr>
         <w:pStyle w:val="Heading2"/>
@@ -2453,9 +2386,9 @@
         </w:pict>
       </w:r>
     </w:p>
-    <w:bookmarkEnd w:id="33"/>
-    <w:bookmarkEnd w:id="34"/>
-    <w:bookmarkStart w:id="47" w:name="method"/>
+    <w:bookmarkEnd w:id="28"/>
+    <w:bookmarkEnd w:id="29"/>
+    <w:bookmarkStart w:id="42" w:name="method"/>
     <w:p>
       <w:pPr>
         <w:pStyle w:val="Heading1"/>
@@ -2566,7 +2499,7 @@
         <w:t xml:space="preserve">turns out to be the interesting part, this project has failed.</w:t>
       </w:r>
     </w:p>
-    <w:bookmarkStart w:id="35" w:name="X57525b78a038dd7677b74b2cd929c744f8e7d70"/>
+    <w:bookmarkStart w:id="30" w:name="X57525b78a038dd7677b74b2cd929c744f8e7d70"/>
     <w:p>
       <w:pPr>
         <w:pStyle w:val="Heading2"/>
@@ -2991,8 +2924,8 @@
         <w:t xml:space="preserve">question with no obvious answer in either direction.</w:t>
       </w:r>
     </w:p>
-    <w:bookmarkEnd w:id="35"/>
-    <w:bookmarkStart w:id="36" w:name="substrate-model-lens-and-environment"/>
+    <w:bookmarkEnd w:id="30"/>
+    <w:bookmarkStart w:id="31" w:name="substrate-model-lens-and-environment"/>
     <w:p>
       <w:pPr>
         <w:pStyle w:val="Heading2"/>
@@ -3666,8 +3599,8 @@
         <w:t xml:space="preserve">8.51 GB of 47.7 GB — headroom is not a constraint on this design.</w:t>
       </w:r>
     </w:p>
-    <w:bookmarkEnd w:id="36"/>
-    <w:bookmarkStart w:id="37" w:name="Xe108057b195fe3c9ce8721c4dbab2e15b618e33"/>
+    <w:bookmarkEnd w:id="31"/>
+    <w:bookmarkStart w:id="32" w:name="Xe108057b195fe3c9ce8721c4dbab2e15b618e33"/>
     <w:p>
       <w:pPr>
         <w:pStyle w:val="Heading2"/>
@@ -4295,8 +4228,8 @@
         <w:t xml:space="preserve">, and are never tuned on.</w:t>
       </w:r>
     </w:p>
-    <w:bookmarkEnd w:id="37"/>
-    <w:bookmarkStart w:id="38" w:name="Xca73d2c970aa0db9760c2d5b75ab5af6c348063"/>
+    <w:bookmarkEnd w:id="32"/>
+    <w:bookmarkStart w:id="33" w:name="Xca73d2c970aa0db9760c2d5b75ab5af6c348063"/>
     <w:p>
       <w:pPr>
         <w:pStyle w:val="Heading2"/>
@@ -4669,8 +4602,8 @@
         <w:t xml:space="preserve">contaminated and undetermined references respectively.</w:t>
       </w:r>
     </w:p>
-    <w:bookmarkEnd w:id="38"/>
-    <w:bookmarkStart w:id="46" w:name="arms-metrics-and-controls"/>
+    <w:bookmarkEnd w:id="33"/>
+    <w:bookmarkStart w:id="41" w:name="arms-metrics-and-controls"/>
     <w:p>
       <w:pPr>
         <w:pStyle w:val="Heading2"/>
@@ -4688,18 +4621,18 @@
           <wp:inline>
             <wp:extent cx="4373880" cy="2767148"/>
             <wp:effectExtent b="0" l="0" r="0" t="0"/>
-            <wp:docPr descr="Three instruments on the same residual: the supervised difference-in-means probe as ceiling, J-Lens as the unsupervised reader, and the logit lens as floor." title="" id="40" name="Picture"/>
+            <wp:docPr descr="Three instruments on the same residual: the supervised difference-in-means probe as ceiling, J-Lens as the unsupervised reader, and the logit lens as floor." title="" id="35" name="Picture"/>
             <a:graphic>
               <a:graphicData uri="http://schemas.openxmlformats.org/drawingml/2006/picture">
                 <pic:pic>
                   <pic:nvPicPr>
-                    <pic:cNvPr descr="results/figures/binding-concept/fig3-three-instruments.png" id="41" name="Picture"/>
+                    <pic:cNvPr descr="results/figures/binding-concept/fig3-three-instruments.png" id="36" name="Picture"/>
                     <pic:cNvPicPr>
                       <a:picLocks noChangeArrowheads="1" noChangeAspect="1"/>
                     </pic:cNvPicPr>
                   </pic:nvPicPr>
                   <pic:blipFill>
-                    <a:blip r:embed="rId39"/>
+                    <a:blip r:embed="rId34"/>
                     <a:stretch>
                       <a:fillRect/>
                     </a:stretch>
@@ -4734,7 +4667,7 @@
         <w:t xml:space="preserve">Three instruments on the same residual: the supervised difference-in-means probe as ceiling, J-Lens as the unsupervised reader, and the logit lens as floor.</w:t>
       </w:r>
     </w:p>
-    <w:bookmarkStart w:id="42" w:name="three-arms"/>
+    <w:bookmarkStart w:id="37" w:name="three-arms"/>
     <w:p>
       <w:pPr>
         <w:pStyle w:val="Heading3"/>
@@ -5116,8 +5049,8 @@
         <w:t xml:space="preserve">passive script.)</w:t>
       </w:r>
     </w:p>
-    <w:bookmarkEnd w:id="42"/>
-    <w:bookmarkStart w:id="43" w:name="metrics"/>
+    <w:bookmarkEnd w:id="37"/>
+    <w:bookmarkStart w:id="38" w:name="metrics"/>
     <w:p>
       <w:pPr>
         <w:pStyle w:val="Heading3"/>
@@ -5406,8 +5339,8 @@
         <w:t xml:space="preserve">never form a vocabulary rank and are unaffected.</w:t>
       </w:r>
     </w:p>
-    <w:bookmarkEnd w:id="43"/>
-    <w:bookmarkStart w:id="44" w:name="baselines-and-controls"/>
+    <w:bookmarkEnd w:id="38"/>
+    <w:bookmarkStart w:id="39" w:name="baselines-and-controls"/>
     <w:p>
       <w:pPr>
         <w:pStyle w:val="Heading3"/>
@@ -6367,8 +6300,8 @@
         <w:t xml:space="preserve">11–357 at its selected layers.</w:t>
       </w:r>
     </w:p>
-    <w:bookmarkEnd w:id="44"/>
-    <w:bookmarkStart w:id="45" w:name="Xf1357951e2d3a6b81edaa0ff5b599eb419d4d06"/>
+    <w:bookmarkEnd w:id="39"/>
+    <w:bookmarkStart w:id="40" w:name="Xf1357951e2d3a6b81edaa0ff5b599eb419d4d06"/>
     <w:p>
       <w:pPr>
         <w:pStyle w:val="Heading3"/>
@@ -6485,10 +6418,10 @@
         </w:pict>
       </w:r>
     </w:p>
-    <w:bookmarkEnd w:id="45"/>
-    <w:bookmarkEnd w:id="46"/>
-    <w:bookmarkEnd w:id="47"/>
-    <w:bookmarkStart w:id="48" w:name="preregistration-and-what-was-frozen-when"/>
+    <w:bookmarkEnd w:id="40"/>
+    <w:bookmarkEnd w:id="41"/>
+    <w:bookmarkEnd w:id="42"/>
+    <w:bookmarkStart w:id="43" w:name="preregistration-and-what-was-frozen-when"/>
     <w:p>
       <w:pPr>
         <w:pStyle w:val="Heading1"/>
@@ -6876,8 +6809,8 @@
         </w:pict>
       </w:r>
     </w:p>
-    <w:bookmarkEnd w:id="48"/>
-    <w:bookmarkStart w:id="58" w:name="results"/>
+    <w:bookmarkEnd w:id="43"/>
+    <w:bookmarkStart w:id="53" w:name="results"/>
     <w:p>
       <w:pPr>
         <w:pStyle w:val="Heading1"/>
@@ -6886,7 +6819,7 @@
         <w:t xml:space="preserve">4. Results</w:t>
       </w:r>
     </w:p>
-    <w:bookmarkStart w:id="49" w:name="behavioral-eligibility"/>
+    <w:bookmarkStart w:id="44" w:name="behavioral-eligibility"/>
     <w:p>
       <w:pPr>
         <w:pStyle w:val="Heading2"/>
@@ -7172,8 +7105,8 @@
         <w:t xml:space="preserve">already on its way.</w:t>
       </w:r>
     </w:p>
-    <w:bookmarkEnd w:id="49"/>
-    <w:bookmarkStart w:id="54" w:name="X6f6fe317ba0cb18ffb6dfc71314c6d0ee2f4a72"/>
+    <w:bookmarkEnd w:id="44"/>
+    <w:bookmarkStart w:id="49" w:name="X6f6fe317ba0cb18ffb6dfc71314c6d0ee2f4a72"/>
     <w:p>
       <w:pPr>
         <w:pStyle w:val="Heading2"/>
@@ -7481,18 +7414,18 @@
           <wp:inline>
             <wp:extent cx="4373880" cy="2672926"/>
             <wp:effectExtent b="0" l="0" r="0" t="0"/>
-            <wp:docPr descr="Direction score by position on frozen held-out: both lenses rise at the relation-completing token and track the model’s own next-token preference; the randomised transport stays at chance." title="" id="50" name="Picture"/>
+            <wp:docPr descr="Direction score by position on frozen held-out: both lenses rise at the relation-completing token and track the model’s own next-token preference; the randomised transport stays at chance." title="" id="45" name="Picture"/>
             <a:graphic>
               <a:graphicData uri="http://schemas.openxmlformats.org/drawingml/2006/picture">
                 <pic:pic>
                   <pic:nvPicPr>
-                    <pic:cNvPr descr="results/figures/stage3-frac-by-position.png" id="51" name="Picture"/>
+                    <pic:cNvPr descr="results/figures/stage3-frac-by-position.png" id="46" name="Picture"/>
                     <pic:cNvPicPr>
                       <a:picLocks noChangeArrowheads="1" noChangeAspect="1"/>
                     </pic:cNvPicPr>
                   </pic:nvPicPr>
                   <pic:blipFill>
-                    <a:blip r:embed="rId10"/>
+                    <a:blip r:embed="rId9"/>
                     <a:stretch>
                       <a:fillRect/>
                     </a:stretch>
@@ -7917,18 +7850,18 @@
           <wp:inline>
             <wp:extent cx="4373880" cy="2870358"/>
             <wp:effectExtent b="0" l="0" r="0" t="0"/>
-            <wp:docPr descr="On records where the model’s own developing preference is wrong, every passive readout is wrong with it." title="" id="52" name="Picture"/>
+            <wp:docPr descr="On records where the model’s own developing preference is wrong, every passive readout is wrong with it." title="" id="47" name="Picture"/>
             <a:graphic>
               <a:graphicData uri="http://schemas.openxmlformats.org/drawingml/2006/picture">
                 <pic:pic>
                   <pic:nvPicPr>
-                    <pic:cNvPr descr="results/figures/stage3-discriminating-set.png" id="53" name="Picture"/>
+                    <pic:cNvPr descr="results/figures/stage3-discriminating-set.png" id="48" name="Picture"/>
                     <pic:cNvPicPr>
                       <a:picLocks noChangeArrowheads="1" noChangeAspect="1"/>
                     </pic:cNvPicPr>
                   </pic:nvPicPr>
                   <pic:blipFill>
-                    <a:blip r:embed="rId13"/>
+                    <a:blip r:embed="rId12"/>
                     <a:stretch>
                       <a:fillRect/>
                     </a:stretch>
@@ -8400,8 +8333,8 @@
         <w:t xml:space="preserve">instrument, not the model.</w:t>
       </w:r>
     </w:p>
-    <w:bookmarkEnd w:id="54"/>
-    <w:bookmarkStart w:id="55" w:name="layerwise-structure"/>
+    <w:bookmarkEnd w:id="49"/>
+    <w:bookmarkStart w:id="50" w:name="layerwise-structure"/>
     <w:p>
       <w:pPr>
         <w:pStyle w:val="Heading2"/>
@@ -8535,8 +8468,8 @@
         <w:t xml:space="preserve">relation-completing token and is finished by the question mark.</w:t>
       </w:r>
     </w:p>
-    <w:bookmarkEnd w:id="55"/>
-    <w:bookmarkStart w:id="56" w:name="controls"/>
+    <w:bookmarkEnd w:id="50"/>
+    <w:bookmarkStart w:id="51" w:name="controls"/>
     <w:p>
       <w:pPr>
         <w:pStyle w:val="Heading2"/>
@@ -8813,8 +8746,8 @@
         </w:tc>
       </w:tr>
     </w:tbl>
-    <w:bookmarkEnd w:id="56"/>
-    <w:bookmarkStart w:id="57" w:name="causal-arm"/>
+    <w:bookmarkEnd w:id="51"/>
+    <w:bookmarkStart w:id="52" w:name="causal-arm"/>
     <w:p>
       <w:pPr>
         <w:pStyle w:val="Heading2"/>
@@ -8934,9 +8867,9 @@
         </w:pict>
       </w:r>
     </w:p>
-    <w:bookmarkEnd w:id="57"/>
-    <w:bookmarkEnd w:id="58"/>
-    <w:bookmarkStart w:id="59" w:name="error-analysis"/>
+    <w:bookmarkEnd w:id="52"/>
+    <w:bookmarkEnd w:id="53"/>
+    <w:bookmarkStart w:id="54" w:name="error-analysis"/>
     <w:p>
       <w:pPr>
         <w:pStyle w:val="Heading1"/>
@@ -9093,8 +9026,8 @@
         </w:pict>
       </w:r>
     </w:p>
-    <w:bookmarkEnd w:id="59"/>
-    <w:bookmarkStart w:id="60" w:name="sanity-checks-and-red-teaming"/>
+    <w:bookmarkEnd w:id="54"/>
+    <w:bookmarkStart w:id="55" w:name="sanity-checks-and-red-teaming"/>
     <w:p>
       <w:pPr>
         <w:pStyle w:val="Heading1"/>
@@ -9657,8 +9590,8 @@
         </w:pict>
       </w:r>
     </w:p>
-    <w:bookmarkEnd w:id="60"/>
-    <w:bookmarkStart w:id="61" w:name="limitations"/>
+    <w:bookmarkEnd w:id="55"/>
+    <w:bookmarkStart w:id="56" w:name="limitations"/>
     <w:p>
       <w:pPr>
         <w:pStyle w:val="Heading1"/>
@@ -9790,8 +9723,8 @@
         </w:pict>
       </w:r>
     </w:p>
-    <w:bookmarkEnd w:id="61"/>
-    <w:bookmarkStart w:id="62" w:name="what-i-would-do-next"/>
+    <w:bookmarkEnd w:id="56"/>
+    <w:bookmarkStart w:id="57" w:name="what-i-would-do-next"/>
     <w:p>
       <w:pPr>
         <w:pStyle w:val="Heading1"/>
@@ -9931,8 +9864,8 @@
         </w:pict>
       </w:r>
     </w:p>
-    <w:bookmarkEnd w:id="62"/>
-    <w:bookmarkStart w:id="63" w:name="reproducibility"/>
+    <w:bookmarkEnd w:id="57"/>
+    <w:bookmarkStart w:id="58" w:name="reproducibility"/>
     <w:p>
       <w:pPr>
         <w:pStyle w:val="Heading1"/>
@@ -10385,8 +10318,8 @@
         </w:pict>
       </w:r>
     </w:p>
-    <w:bookmarkEnd w:id="63"/>
-    <w:bookmarkStart w:id="64" w:name="time-accounting"/>
+    <w:bookmarkEnd w:id="58"/>
+    <w:bookmarkStart w:id="59" w:name="time-accounting"/>
     <w:p>
       <w:pPr>
         <w:pStyle w:val="Heading1"/>
@@ -10616,8 +10549,8 @@
         </w:pict>
       </w:r>
     </w:p>
-    <w:bookmarkEnd w:id="64"/>
-    <w:bookmarkStart w:id="65" w:name="appendix-where-everything-lives"/>
+    <w:bookmarkEnd w:id="59"/>
+    <w:bookmarkStart w:id="60" w:name="appendix-where-everything-lives"/>
     <w:p>
       <w:pPr>
         <w:pStyle w:val="Heading1"/>
@@ -10724,7 +10657,7 @@
         <w:t xml:space="preserve">.</w:t>
       </w:r>
     </w:p>
-    <w:bookmarkEnd w:id="65"/>
+    <w:bookmarkEnd w:id="60"/>
     <w:sectPr>
       <w:pgMar w:bottom="1020" w:left="1134" w:right="1134" w:top="1020"/>
     </w:sectPr>

</xml_diff>

<commit_message>
Rebuild report on the restored full-length exec summary
Co-Authored-By: Claude Fable 5.1 <noreply@anthropic.com>

Claude-Session: https://claude.ai/code/session_011eNoRh7HnqxwuUuQK5Y4fW
</commit_message>
<xml_diff>
--- a/writeup/mats12-report.docx
+++ b/writeup/mats12-report.docx
@@ -34,7 +34,7 @@
         <w:t xml:space="preserve">September 2026</w:t>
       </w:r>
     </w:p>
-    <w:bookmarkStart w:id="16" w:name="executive-summary"/>
+    <w:bookmarkStart w:id="17" w:name="executive-summary"/>
     <w:p>
       <w:pPr>
         <w:pStyle w:val="Heading1"/>
@@ -43,12 +43,30 @@
         <w:t xml:space="preserve">Executive summary</w:t>
       </w:r>
     </w:p>
-    <w:bookmarkStart w:id="15" w:name="what-problem-am-i-trying-to-solve"/>
+    <w:bookmarkStart w:id="9" w:name="research-question"/>
     <w:p>
       <w:pPr>
         <w:pStyle w:val="Heading2"/>
       </w:pPr>
       <w:r>
+        <w:t xml:space="preserve">Research Question</w:t>
+      </w:r>
+    </w:p>
+    <w:p>
+      <w:pPr>
+        <w:pStyle w:val="FirstParagraph"/>
+      </w:pPr>
+      <w:r>
+        <w:t xml:space="preserve">J-Lens can show you the vocabulary and the bag of concepts at each step or layer, but is it able to read out the binding information, or is it just predicting what the model is about to answer?</w:t>
+      </w:r>
+    </w:p>
+    <w:bookmarkEnd w:id="9"/>
+    <w:bookmarkStart w:id="16" w:name="what-problem-am-i-trying-to-solve"/>
+    <w:p>
+      <w:pPr>
+        <w:pStyle w:val="Heading2"/>
+      </w:pPr>
+      <w:r>
         <w:t xml:space="preserve">What problem am I trying to solve?</w:t>
       </w:r>
     </w:p>
@@ -57,7 +75,13 @@
         <w:pStyle w:val="FirstParagraph"/>
       </w:pPr>
       <w:r>
-        <w:t xml:space="preserve">J-Lens can show the bag of concepts at each layer, but can it read out the binding, or is it just predicting what the model is about to answer? Each prompt holds two facts, such as</w:t>
+        <w:t xml:space="preserve">How do we know if the thoughts exposed by an interpretability lens are trustworthy enough to reveal what the model actually represents? I built a small task and experiment to measure, audit, and tell the difference between a guess and the actual answer.</w:t>
+      </w:r>
+      <w:r>
+        <w:br/>
+      </w:r>
+      <w:r>
+        <w:t xml:space="preserve">To answer this question, I built a dataset of prompts. Each prompt contains a pair, such as</w:t>
       </w:r>
       <w:r>
         <w:t xml:space="preserve"> </w:t>
@@ -66,7 +90,7 @@
         <w:t xml:space="preserve">“Helen lives in Prague, and Mark lives in Oslo”</w:t>
       </w:r>
       <w:r>
-        <w:t xml:space="preserve">, plus a twin with the pairing swapped. Both cities appear in every prompt, so detecting concepts alone scores 50%, chance. Reading the binding beats that, but so does predicting the answer the model is about to give. My experiment tells the two apart.</w:t>
+        <w:t xml:space="preserve">. For each prompt I swapped pairs changing who goes with what. I then used J-Lens, partway through the computation for the answer, to see if it could tell which city goes with which person. Both cities appear in every prompt, so a method that only detects concepts scores 50%, which is just chance. The intuition says that only binding-access beats chance. However, there is a second way to beat chance, and that is by predicting the answer the model is about to give. My experiment is designed to distinguish between the two.</w:t>
       </w:r>
       <w:r>
         <w:t xml:space="preserve"> </w:t>
@@ -78,7 +102,13 @@
         <w:t xml:space="preserve"> </w:t>
       </w:r>
       <w:r>
-        <w:t xml:space="preserve">I used Qwen3.5-4B with the released pre-fitted J-Lens. The dataset had 50 prompt pairs: 10 for development (40 records) and 40 held out (160 records), not looked at until the layers and positions were frozen. On development records I read the lens at four spots, measured the margin (correct city minus swapped city), and froze the best layer at each spot. While running the lens I also saved the model’s own answer preference at each spot, to later check the lens where the model itself leaned wrong. Then I read the held-out records once at those settings. The logit lens is the same code with the Jacobian switched off.</w:t>
+        <w:t xml:space="preserve">For my experiment I used Qwen3.5-4B with the released pre-fitted J-Lens. Qwen3.5-4B has 32 layers (0-31), with layer 31 being the final answer. J-Lens can read from any of the layers. Using the development dataset, I probed at various points in the prompt: after the facts, during the question, at the question mark, and right before the answer colon. At each of these points I measured the margin. I then froze the layer with the best margin at each position in the sentence. While running the lens I also saved the model’s own answer preference at the same spot, so I could later check the lens on the records where the model itself was leaning wrong.</w:t>
+      </w:r>
+      <w:r>
+        <w:t xml:space="preserve"> </w:t>
+      </w:r>
+      <w:r>
+        <w:t xml:space="preserve">Using the held-out data, I again probed at the frozen layers at each position to measure the margin. A positive value means the lens prefers the correct answer. The magnitude of that number measures how much it’s preferred. Of the 4 positions, the interesting one is just after the model is forced to start answering the question.</w:t>
       </w:r>
       <w:r>
         <w:t xml:space="preserve"> </w:t>
@@ -90,7 +120,7 @@
         <w:t xml:space="preserve"> </w:t>
       </w:r>
       <w:r>
-        <w:t xml:space="preserve">At the relation token J-Lens picked the correct city 0.781 of the time, against a 0.519 shuffled-label control. But the model’s own next-token leaning was already right 0.800 of the time there, so beating the control alone does not show a read.</w:t>
+        <w:t xml:space="preserve">J-Lens scored 0.781 vs 0.519 for a shuffled-label control at the end of the fact token. But the model’s own next-token leaning was already right 0.800 of the time at that same spot. On the records where the model is wrong, the lens reduces to 0.344 and 0.125, well below chance. A probe trained with the answer key read 0.525 at the same spot where J-Lens read 0.781, so there was no binding signal there for it to find. My intuition here tells me the lens was guessing the model’s answer, not reading its memory.</w:t>
       </w:r>
       <w:r>
         <w:br/>
@@ -100,18 +130,18 @@
           <wp:inline>
             <wp:extent cx="4267200" cy="2607733"/>
             <wp:effectExtent b="0" l="0" r="0" t="0"/>
-            <wp:docPr descr="Direction score by position on frozen held-out data (n=160): both lenses rise at the token that pins down the answer and track the model’s own next-token preference; the shuffled-label and random-transport controls stay at chance." title="" id="10" name="Picture"/>
+            <wp:docPr descr="Direction score by position on frozen held-out data (n=160): both lenses rise at the token that pins down the answer and track the model’s own next-token preference; the shuffled-label and random-transport controls stay at chance." title="" id="11" name="Picture"/>
             <a:graphic>
               <a:graphicData uri="http://schemas.openxmlformats.org/drawingml/2006/picture">
                 <pic:pic>
                   <pic:nvPicPr>
-                    <pic:cNvPr descr="results/figures/stage3-frac-by-position.png" id="11" name="Picture"/>
+                    <pic:cNvPr descr="results/figures/stage3-frac-by-position.png" id="12" name="Picture"/>
                     <pic:cNvPicPr>
                       <a:picLocks noChangeArrowheads="1" noChangeAspect="1"/>
                     </pic:cNvPicPr>
                   </pic:nvPicPr>
                   <pic:blipFill>
-                    <a:blip r:embed="rId9"/>
+                    <a:blip r:embed="rId10"/>
                     <a:stretch>
                       <a:fillRect/>
                     </a:stretch>
@@ -145,18 +175,18 @@
           <wp:inline>
             <wp:extent cx="4267200" cy="2800349"/>
             <wp:effectExtent b="0" l="0" r="0" t="0"/>
-            <wp:docPr descr="J-Lens accuracy on held-out records, split by whether the model itself was leaning right or wrong. Where the model leaned wrong, every passive readout followed it below chance." title="" id="13" name="Picture"/>
+            <wp:docPr descr="J-Lens accuracy on held-out records, split by whether the model itself was leaning right or wrong. Where the model leaned wrong, every passive readout followed it below chance." title="" id="14" name="Picture"/>
             <a:graphic>
               <a:graphicData uri="http://schemas.openxmlformats.org/drawingml/2006/picture">
                 <pic:pic>
                   <pic:nvPicPr>
-                    <pic:cNvPr descr="results/figures/stage3-discriminating-set.png" id="14" name="Picture"/>
+                    <pic:cNvPr descr="results/figures/stage3-discriminating-set.png" id="15" name="Picture"/>
                     <pic:cNvPicPr>
                       <a:picLocks noChangeArrowheads="1" noChangeAspect="1"/>
                     </pic:cNvPicPr>
                   </pic:nvPicPr>
                   <pic:blipFill>
-                    <a:blip r:embed="rId12"/>
+                    <a:blip r:embed="rId13"/>
                     <a:stretch>
                       <a:fillRect/>
                     </a:stretch>
@@ -192,7 +222,7 @@
         <w:t xml:space="preserve"> </w:t>
       </w:r>
       <w:r>
-        <w:t xml:space="preserve">At the relation token J-Lens scored 0.781 and the logit lens 0.688; at the question mark the logit lens was ahead, 0.738 to 0.669. On picking the right city it is a wash. Where J-Lens clearly wins is ranking: it puts the correct city at rank 35, the logit lens near 1,000.</w:t>
+        <w:t xml:space="preserve">The dataset had 50 prompt pairs: 10 for development (40 records) and 40 held out (160 records), not looked at until the layers and positions were frozen. I ran J-Lens and the logit lens on the held-out records at the frozen positions and layers. The logit lens here is the same code with the Jacobian switched off, so the only thing that differs between the two is the Jacobian. At the relation token J-Lens scored 0.781 and the logit lens 0.688, both against a 0.519 shuffled-label control; at the question mark the logit lens was ahead, 0.738 to 0.669. Both beat the control, but the model’s own next-token leaning was already right 80% of the time at that same spot. So on picking the right city it is a wash. Where J-Lens clearly wins is ranking: it puts the correct city at rank 35 of 248K, the logit lens near 1,000. Even so, it still does not appear to be reading any bindings at these layers.</w:t>
       </w:r>
       <w:r>
         <w:t xml:space="preserve"> </w:t>
@@ -204,7 +234,7 @@
         <w:t xml:space="preserve"> </w:t>
       </w:r>
       <w:r>
-        <w:t xml:space="preserve">First, shuffled labels: I randomly reassigned which city counts as correct (fixed seed) and re-graded. That gave 0.52 and 0.556 at the two spots. Second, a random matrix in place of the J-Lens matrix, same pipeline: direction 0.475-0.537 everywhere and median rank 130K-206K, versus 35 for the real matrix.</w:t>
+        <w:t xml:space="preserve">In experiment 2, I used 2 controls. First I shuffled the labels. I took the 160 held-out records with the lens readings computed. For each record I randomly reassign which city is marked correct (drawn from the pool of 6 cities, using a fixed randomizer seed). Then I re-grade the lens reading against the shuffled key. The results were 0.52 at the relation token, 0.556 at the question mark, and 0.35 on the dev set (smaller number of cities). This rules out the model guessing based on unrelated info. The second control was a random matrix used in place of the prefit J-Lens matrix. I ran the full pipeline with the same prompts and the random matrix using the same positions, layers, activations and scoring. The resulting direction was 0.475-0.537 everywhere, and the correct city was a median rank of 130K-206K out of 248,320, versus 35 for the real matrix.</w:t>
       </w:r>
       <w:r>
         <w:t xml:space="preserve"> </w:t>
@@ -212,11 +242,13 @@
       <w:r>
         <w:t xml:space="preserve">## Experiment 3 — What replaced the causal test</w:t>
       </w:r>
-      <w:r>
-        <w:t xml:space="preserve"> </w:t>
-      </w:r>
-      <w:r>
-        <w:t xml:space="preserve">The causal test could not run: the released code cannot separate the J-Lens part of the residual from the rest. Instead I used the 32 to 40 records where the model’s own guess pointed to the wrong city. A lens that reads binding should still get these right. J-Lens got 0.344 and 0.125, below chance. An answer-key probe read 0.525 there, so no method found binding. So the lens was guessing the model’s answer, not reading its memory.</w:t>
+    </w:p>
+    <w:p>
+      <w:pPr>
+        <w:pStyle w:val="BodyText"/>
+      </w:pPr>
+      <w:r>
+        <w:t xml:space="preserve">The causal test could not run: the released J-Lens code gives no way to separate its part of the residual from the rest. In its place I used the records where the model’s own guess pointed to the wrong city (32 to 40 of the 160). A lens that reads binding should still get these right. J-Lens got 0.344 and 0.125, below chance. A probe trained with the answer key read 0.525 at the same spot, so no method found a binding signal there.</w:t>
       </w:r>
       <w:r>
         <w:t xml:space="preserve"> </w:t>
@@ -234,7 +266,7 @@
         </w:numPr>
       </w:pPr>
       <w:r>
-        <w:t xml:space="preserve">On this task J-Lens does NOT read stored bindings: where the model leaned wrong it followed, 0.344 and 0.125 against 0.500 chance.</w:t>
+        <w:t xml:space="preserve">On the task I tested, J-Lens does NOT read what the model has stored for bindings - it simply guesses what the model is about to say. Where the model leaned wrong, J-Lens followed it: 0.344 and 0.125 against 0.500 chance.</w:t>
       </w:r>
       <w:r>
         <w:br/>
@@ -249,7 +281,7 @@
         </w:numPr>
       </w:pPr>
       <w:r>
-        <w:t xml:space="preserve">Standard scoring misses this; re-scoring only where the model leans wrong shows whether a reading says more than the output.</w:t>
+        <w:t xml:space="preserve">J-Lens scoring used by most does not catch this; my method allows you to measure whether the readings are saying more than the model’s output, making the use of a Lens more trustworthy.</w:t>
       </w:r>
     </w:p>
     <w:p>
@@ -261,7 +293,7 @@
         </w:numPr>
       </w:pPr>
       <w:r>
-        <w:t xml:space="preserve">A probe trained with the answer key read 0.525 at the frozen spot, chance: nothing there for any method to find.</w:t>
+        <w:t xml:space="preserve">A probe trained with the answer key found nothing to read at the frozen position and layers I scored: 0.525, which is chance.</w:t>
       </w:r>
     </w:p>
     <w:p>
@@ -273,7 +305,7 @@
         </w:numPr>
       </w:pPr>
       <w:r>
-        <w:t xml:space="preserve">J-Lens beats the logit lens at ranking the right word: rank 35 versus about 1,000.</w:t>
+        <w:t xml:space="preserve">J-Lens is better than previous lenses at ranking the right words. J-Lens vs Logit Lens had a ranking of 35 vs 1000 out of 248K words.</w:t>
       </w:r>
       <w:r>
         <w:br/>
@@ -281,16 +313,18 @@
       <w:r>
         <w:t xml:space="preserve">## Biggest limitation</w:t>
       </w:r>
-      <w:r>
-        <w:t xml:space="preserve"> </w:t>
-      </w:r>
-      <w:r>
-        <w:t xml:space="preserve">One model, one released lens, one small six-city task. The answer-key probe found nothing at the key position, so the binding may live somewhere I did not read. I did not test whether changing the residual changes the answer.</w:t>
-      </w:r>
-    </w:p>
-    <w:bookmarkEnd w:id="15"/>
+    </w:p>
+    <w:p>
+      <w:pPr>
+        <w:pStyle w:val="FirstParagraph"/>
+      </w:pPr>
+      <w:r>
+        <w:t xml:space="preserve">One model, one released lens, one small task with six cities. At the position that matters most, even a probe trained with the answers found nothing, so I cannot say whether the binding is stored at some layer or position I did not read. I also did not test whether changing the residual changes the answer.</w:t>
+      </w:r>
+    </w:p>
     <w:bookmarkEnd w:id="16"/>
-    <w:bookmarkStart w:id="22" w:name="randomly-selected-raw-examples"/>
+    <w:bookmarkEnd w:id="17"/>
+    <w:bookmarkStart w:id="23" w:name="randomly-selected-raw-examples"/>
     <w:p>
       <w:pPr>
         <w:pStyle w:val="Heading1"/>
@@ -446,7 +480,7 @@
         <w:t xml:space="preserve">committed run output; agent-unverified.</w:t>
       </w:r>
     </w:p>
-    <w:bookmarkStart w:id="17" w:name="example-1-success-real-zero-035-bba-t6"/>
+    <w:bookmarkStart w:id="18" w:name="example-1-success-real-zero-035-bba-t6"/>
     <w:p>
       <w:pPr>
         <w:pStyle w:val="Heading3"/>
@@ -732,8 +766,8 @@
         </w:tc>
       </w:tr>
     </w:tbl>
-    <w:bookmarkEnd w:id="17"/>
-    <w:bookmarkStart w:id="18" w:name="example-2-success-real-zero-047-aba-t6"/>
+    <w:bookmarkEnd w:id="18"/>
+    <w:bookmarkStart w:id="19" w:name="example-2-success-real-zero-047-aba-t6"/>
     <w:p>
       <w:pPr>
         <w:pStyle w:val="Heading3"/>
@@ -1019,8 +1053,8 @@
         </w:tc>
       </w:tr>
     </w:tbl>
-    <w:bookmarkEnd w:id="18"/>
-    <w:bookmarkStart w:id="19" w:name="example-3-failure-real-zero-035-bab-t6"/>
+    <w:bookmarkEnd w:id="19"/>
+    <w:bookmarkStart w:id="20" w:name="example-3-failure-real-zero-035-bab-t6"/>
     <w:p>
       <w:pPr>
         <w:pStyle w:val="Heading3"/>
@@ -1306,8 +1340,8 @@
         </w:tc>
       </w:tr>
     </w:tbl>
-    <w:bookmarkEnd w:id="19"/>
-    <w:bookmarkStart w:id="20" w:name="example-4-failure-real-zero-023-bba-t6"/>
+    <w:bookmarkEnd w:id="20"/>
+    <w:bookmarkStart w:id="21" w:name="example-4-failure-real-zero-023-bba-t6"/>
     <w:p>
       <w:pPr>
         <w:pStyle w:val="Heading3"/>
@@ -1593,8 +1627,8 @@
         </w:tc>
       </w:tr>
     </w:tbl>
-    <w:bookmarkEnd w:id="20"/>
-    <w:bookmarkStart w:id="21" w:name="X08d12fc239e1304c729fa2c498dcd7bd419b671"/>
+    <w:bookmarkEnd w:id="21"/>
+    <w:bookmarkStart w:id="22" w:name="X08d12fc239e1304c729fa2c498dcd7bd419b671"/>
     <w:p>
       <w:pPr>
         <w:pStyle w:val="Heading3"/>
@@ -1887,9 +1921,9 @@
         </w:pict>
       </w:r>
     </w:p>
-    <w:bookmarkEnd w:id="21"/>
     <w:bookmarkEnd w:id="22"/>
-    <w:bookmarkStart w:id="29" w:name="motivation-and-research-question"/>
+    <w:bookmarkEnd w:id="23"/>
+    <w:bookmarkStart w:id="30" w:name="motivation-and-research-question"/>
     <w:p>
       <w:pPr>
         <w:pStyle w:val="Heading1"/>
@@ -1934,7 +1968,7 @@
         <w:t xml:space="preserve">the model’s answer?</w:t>
       </w:r>
     </w:p>
-    <w:bookmarkStart w:id="23" w:name="what-j-lens-is-briefly"/>
+    <w:bookmarkStart w:id="24" w:name="what-j-lens-is-briefly"/>
     <w:p>
       <w:pPr>
         <w:pStyle w:val="Heading2"/>
@@ -1951,8 +1985,8 @@
         <w:t xml:space="preserve">J-Lens is defined from first principles in §2.1.</w:t>
       </w:r>
     </w:p>
-    <w:bookmarkEnd w:id="23"/>
-    <w:bookmarkStart w:id="27" w:name="X44758b870a0731464fb2764574cc64fea7fcb2d"/>
+    <w:bookmarkEnd w:id="24"/>
+    <w:bookmarkStart w:id="28" w:name="X44758b870a0731464fb2764574cc64fea7fcb2d"/>
     <w:p>
       <w:pPr>
         <w:pStyle w:val="Heading2"/>
@@ -2058,18 +2092,18 @@
           <wp:inline>
             <wp:extent cx="4373880" cy="2142308"/>
             <wp:effectExtent b="0" l="0" r="0" t="0"/>
-            <wp:docPr descr="The binding problem: two prompts, the same four concepts, opposite pairings. Only the pairing distinguishes them, so only a reader of the relation can tell them apart." title="" id="25" name="Picture"/>
+            <wp:docPr descr="The binding problem: two prompts, the same four concepts, opposite pairings. Only the pairing distinguishes them, so only a reader of the relation can tell them apart." title="" id="26" name="Picture"/>
             <a:graphic>
               <a:graphicData uri="http://schemas.openxmlformats.org/drawingml/2006/picture">
                 <pic:pic>
                   <pic:nvPicPr>
-                    <pic:cNvPr descr="results/figures/binding-concept/fig1-binding-problem.png" id="26" name="Picture"/>
+                    <pic:cNvPr descr="results/figures/binding-concept/fig1-binding-problem.png" id="27" name="Picture"/>
                     <pic:cNvPicPr>
                       <a:picLocks noChangeArrowheads="1" noChangeAspect="1"/>
                     </pic:cNvPicPr>
                   </pic:nvPicPr>
                   <pic:blipFill>
-                    <a:blip r:embed="rId24"/>
+                    <a:blip r:embed="rId25"/>
                     <a:stretch>
                       <a:fillRect/>
                     </a:stretch>
@@ -2307,8 +2341,8 @@
         <w:t xml:space="preserve">selection, not a linearly decodable stored binding.</w:t>
       </w:r>
     </w:p>
-    <w:bookmarkEnd w:id="27"/>
-    <w:bookmarkStart w:id="28" w:name="the-gap"/>
+    <w:bookmarkEnd w:id="28"/>
+    <w:bookmarkStart w:id="29" w:name="the-gap"/>
     <w:p>
       <w:pPr>
         <w:pStyle w:val="Heading2"/>
@@ -2386,9 +2420,9 @@
         </w:pict>
       </w:r>
     </w:p>
-    <w:bookmarkEnd w:id="28"/>
     <w:bookmarkEnd w:id="29"/>
-    <w:bookmarkStart w:id="42" w:name="method"/>
+    <w:bookmarkEnd w:id="30"/>
+    <w:bookmarkStart w:id="43" w:name="method"/>
     <w:p>
       <w:pPr>
         <w:pStyle w:val="Heading1"/>
@@ -2499,7 +2533,7 @@
         <w:t xml:space="preserve">turns out to be the interesting part, this project has failed.</w:t>
       </w:r>
     </w:p>
-    <w:bookmarkStart w:id="30" w:name="X57525b78a038dd7677b74b2cd929c744f8e7d70"/>
+    <w:bookmarkStart w:id="31" w:name="X57525b78a038dd7677b74b2cd929c744f8e7d70"/>
     <w:p>
       <w:pPr>
         <w:pStyle w:val="Heading2"/>
@@ -2924,8 +2958,8 @@
         <w:t xml:space="preserve">question with no obvious answer in either direction.</w:t>
       </w:r>
     </w:p>
-    <w:bookmarkEnd w:id="30"/>
-    <w:bookmarkStart w:id="31" w:name="substrate-model-lens-and-environment"/>
+    <w:bookmarkEnd w:id="31"/>
+    <w:bookmarkStart w:id="32" w:name="substrate-model-lens-and-environment"/>
     <w:p>
       <w:pPr>
         <w:pStyle w:val="Heading2"/>
@@ -3599,8 +3633,8 @@
         <w:t xml:space="preserve">8.51 GB of 47.7 GB — headroom is not a constraint on this design.</w:t>
       </w:r>
     </w:p>
-    <w:bookmarkEnd w:id="31"/>
-    <w:bookmarkStart w:id="32" w:name="Xe108057b195fe3c9ce8721c4dbab2e15b618e33"/>
+    <w:bookmarkEnd w:id="32"/>
+    <w:bookmarkStart w:id="33" w:name="Xe108057b195fe3c9ce8721c4dbab2e15b618e33"/>
     <w:p>
       <w:pPr>
         <w:pStyle w:val="Heading2"/>
@@ -4228,8 +4262,8 @@
         <w:t xml:space="preserve">, and are never tuned on.</w:t>
       </w:r>
     </w:p>
-    <w:bookmarkEnd w:id="32"/>
-    <w:bookmarkStart w:id="33" w:name="Xca73d2c970aa0db9760c2d5b75ab5af6c348063"/>
+    <w:bookmarkEnd w:id="33"/>
+    <w:bookmarkStart w:id="34" w:name="Xca73d2c970aa0db9760c2d5b75ab5af6c348063"/>
     <w:p>
       <w:pPr>
         <w:pStyle w:val="Heading2"/>
@@ -4602,8 +4636,8 @@
         <w:t xml:space="preserve">contaminated and undetermined references respectively.</w:t>
       </w:r>
     </w:p>
-    <w:bookmarkEnd w:id="33"/>
-    <w:bookmarkStart w:id="41" w:name="arms-metrics-and-controls"/>
+    <w:bookmarkEnd w:id="34"/>
+    <w:bookmarkStart w:id="42" w:name="arms-metrics-and-controls"/>
     <w:p>
       <w:pPr>
         <w:pStyle w:val="Heading2"/>
@@ -4621,18 +4655,18 @@
           <wp:inline>
             <wp:extent cx="4373880" cy="2767148"/>
             <wp:effectExtent b="0" l="0" r="0" t="0"/>
-            <wp:docPr descr="Three instruments on the same residual: the supervised difference-in-means probe as ceiling, J-Lens as the unsupervised reader, and the logit lens as floor." title="" id="35" name="Picture"/>
+            <wp:docPr descr="Three instruments on the same residual: the supervised difference-in-means probe as ceiling, J-Lens as the unsupervised reader, and the logit lens as floor." title="" id="36" name="Picture"/>
             <a:graphic>
               <a:graphicData uri="http://schemas.openxmlformats.org/drawingml/2006/picture">
                 <pic:pic>
                   <pic:nvPicPr>
-                    <pic:cNvPr descr="results/figures/binding-concept/fig3-three-instruments.png" id="36" name="Picture"/>
+                    <pic:cNvPr descr="results/figures/binding-concept/fig3-three-instruments.png" id="37" name="Picture"/>
                     <pic:cNvPicPr>
                       <a:picLocks noChangeArrowheads="1" noChangeAspect="1"/>
                     </pic:cNvPicPr>
                   </pic:nvPicPr>
                   <pic:blipFill>
-                    <a:blip r:embed="rId34"/>
+                    <a:blip r:embed="rId35"/>
                     <a:stretch>
                       <a:fillRect/>
                     </a:stretch>
@@ -4667,7 +4701,7 @@
         <w:t xml:space="preserve">Three instruments on the same residual: the supervised difference-in-means probe as ceiling, J-Lens as the unsupervised reader, and the logit lens as floor.</w:t>
       </w:r>
     </w:p>
-    <w:bookmarkStart w:id="37" w:name="three-arms"/>
+    <w:bookmarkStart w:id="38" w:name="three-arms"/>
     <w:p>
       <w:pPr>
         <w:pStyle w:val="Heading3"/>
@@ -5049,8 +5083,8 @@
         <w:t xml:space="preserve">passive script.)</w:t>
       </w:r>
     </w:p>
-    <w:bookmarkEnd w:id="37"/>
-    <w:bookmarkStart w:id="38" w:name="metrics"/>
+    <w:bookmarkEnd w:id="38"/>
+    <w:bookmarkStart w:id="39" w:name="metrics"/>
     <w:p>
       <w:pPr>
         <w:pStyle w:val="Heading3"/>
@@ -5339,8 +5373,8 @@
         <w:t xml:space="preserve">never form a vocabulary rank and are unaffected.</w:t>
       </w:r>
     </w:p>
-    <w:bookmarkEnd w:id="38"/>
-    <w:bookmarkStart w:id="39" w:name="baselines-and-controls"/>
+    <w:bookmarkEnd w:id="39"/>
+    <w:bookmarkStart w:id="40" w:name="baselines-and-controls"/>
     <w:p>
       <w:pPr>
         <w:pStyle w:val="Heading3"/>
@@ -6300,8 +6334,8 @@
         <w:t xml:space="preserve">11–357 at its selected layers.</w:t>
       </w:r>
     </w:p>
-    <w:bookmarkEnd w:id="39"/>
-    <w:bookmarkStart w:id="40" w:name="Xf1357951e2d3a6b81edaa0ff5b599eb419d4d06"/>
+    <w:bookmarkEnd w:id="40"/>
+    <w:bookmarkStart w:id="41" w:name="Xf1357951e2d3a6b81edaa0ff5b599eb419d4d06"/>
     <w:p>
       <w:pPr>
         <w:pStyle w:val="Heading3"/>
@@ -6418,10 +6452,10 @@
         </w:pict>
       </w:r>
     </w:p>
-    <w:bookmarkEnd w:id="40"/>
     <w:bookmarkEnd w:id="41"/>
     <w:bookmarkEnd w:id="42"/>
-    <w:bookmarkStart w:id="43" w:name="preregistration-and-what-was-frozen-when"/>
+    <w:bookmarkEnd w:id="43"/>
+    <w:bookmarkStart w:id="44" w:name="preregistration-and-what-was-frozen-when"/>
     <w:p>
       <w:pPr>
         <w:pStyle w:val="Heading1"/>
@@ -6809,8 +6843,8 @@
         </w:pict>
       </w:r>
     </w:p>
-    <w:bookmarkEnd w:id="43"/>
-    <w:bookmarkStart w:id="53" w:name="results"/>
+    <w:bookmarkEnd w:id="44"/>
+    <w:bookmarkStart w:id="54" w:name="results"/>
     <w:p>
       <w:pPr>
         <w:pStyle w:val="Heading1"/>
@@ -6819,7 +6853,7 @@
         <w:t xml:space="preserve">4. Results</w:t>
       </w:r>
     </w:p>
-    <w:bookmarkStart w:id="44" w:name="behavioral-eligibility"/>
+    <w:bookmarkStart w:id="45" w:name="behavioral-eligibility"/>
     <w:p>
       <w:pPr>
         <w:pStyle w:val="Heading2"/>
@@ -7105,8 +7139,8 @@
         <w:t xml:space="preserve">already on its way.</w:t>
       </w:r>
     </w:p>
-    <w:bookmarkEnd w:id="44"/>
-    <w:bookmarkStart w:id="49" w:name="X6f6fe317ba0cb18ffb6dfc71314c6d0ee2f4a72"/>
+    <w:bookmarkEnd w:id="45"/>
+    <w:bookmarkStart w:id="50" w:name="X6f6fe317ba0cb18ffb6dfc71314c6d0ee2f4a72"/>
     <w:p>
       <w:pPr>
         <w:pStyle w:val="Heading2"/>
@@ -7414,18 +7448,18 @@
           <wp:inline>
             <wp:extent cx="4373880" cy="2672926"/>
             <wp:effectExtent b="0" l="0" r="0" t="0"/>
-            <wp:docPr descr="Direction score by position on frozen held-out: both lenses rise at the relation-completing token and track the model’s own next-token preference; the randomised transport stays at chance." title="" id="45" name="Picture"/>
+            <wp:docPr descr="Direction score by position on frozen held-out: both lenses rise at the relation-completing token and track the model’s own next-token preference; the randomised transport stays at chance." title="" id="46" name="Picture"/>
             <a:graphic>
               <a:graphicData uri="http://schemas.openxmlformats.org/drawingml/2006/picture">
                 <pic:pic>
                   <pic:nvPicPr>
-                    <pic:cNvPr descr="results/figures/stage3-frac-by-position.png" id="46" name="Picture"/>
+                    <pic:cNvPr descr="results/figures/stage3-frac-by-position.png" id="47" name="Picture"/>
                     <pic:cNvPicPr>
                       <a:picLocks noChangeArrowheads="1" noChangeAspect="1"/>
                     </pic:cNvPicPr>
                   </pic:nvPicPr>
                   <pic:blipFill>
-                    <a:blip r:embed="rId9"/>
+                    <a:blip r:embed="rId10"/>
                     <a:stretch>
                       <a:fillRect/>
                     </a:stretch>
@@ -7850,18 +7884,18 @@
           <wp:inline>
             <wp:extent cx="4373880" cy="2870358"/>
             <wp:effectExtent b="0" l="0" r="0" t="0"/>
-            <wp:docPr descr="On records where the model’s own developing preference is wrong, every passive readout is wrong with it." title="" id="47" name="Picture"/>
+            <wp:docPr descr="On records where the model’s own developing preference is wrong, every passive readout is wrong with it." title="" id="48" name="Picture"/>
             <a:graphic>
               <a:graphicData uri="http://schemas.openxmlformats.org/drawingml/2006/picture">
                 <pic:pic>
                   <pic:nvPicPr>
-                    <pic:cNvPr descr="results/figures/stage3-discriminating-set.png" id="48" name="Picture"/>
+                    <pic:cNvPr descr="results/figures/stage3-discriminating-set.png" id="49" name="Picture"/>
                     <pic:cNvPicPr>
                       <a:picLocks noChangeArrowheads="1" noChangeAspect="1"/>
                     </pic:cNvPicPr>
                   </pic:nvPicPr>
                   <pic:blipFill>
-                    <a:blip r:embed="rId12"/>
+                    <a:blip r:embed="rId13"/>
                     <a:stretch>
                       <a:fillRect/>
                     </a:stretch>
@@ -8333,8 +8367,8 @@
         <w:t xml:space="preserve">instrument, not the model.</w:t>
       </w:r>
     </w:p>
-    <w:bookmarkEnd w:id="49"/>
-    <w:bookmarkStart w:id="50" w:name="layerwise-structure"/>
+    <w:bookmarkEnd w:id="50"/>
+    <w:bookmarkStart w:id="51" w:name="layerwise-structure"/>
     <w:p>
       <w:pPr>
         <w:pStyle w:val="Heading2"/>
@@ -8468,8 +8502,8 @@
         <w:t xml:space="preserve">relation-completing token and is finished by the question mark.</w:t>
       </w:r>
     </w:p>
-    <w:bookmarkEnd w:id="50"/>
-    <w:bookmarkStart w:id="51" w:name="controls"/>
+    <w:bookmarkEnd w:id="51"/>
+    <w:bookmarkStart w:id="52" w:name="controls"/>
     <w:p>
       <w:pPr>
         <w:pStyle w:val="Heading2"/>
@@ -8746,8 +8780,8 @@
         </w:tc>
       </w:tr>
     </w:tbl>
-    <w:bookmarkEnd w:id="51"/>
-    <w:bookmarkStart w:id="52" w:name="causal-arm"/>
+    <w:bookmarkEnd w:id="52"/>
+    <w:bookmarkStart w:id="53" w:name="causal-arm"/>
     <w:p>
       <w:pPr>
         <w:pStyle w:val="Heading2"/>
@@ -8867,9 +8901,9 @@
         </w:pict>
       </w:r>
     </w:p>
-    <w:bookmarkEnd w:id="52"/>
     <w:bookmarkEnd w:id="53"/>
-    <w:bookmarkStart w:id="54" w:name="error-analysis"/>
+    <w:bookmarkEnd w:id="54"/>
+    <w:bookmarkStart w:id="55" w:name="error-analysis"/>
     <w:p>
       <w:pPr>
         <w:pStyle w:val="Heading1"/>
@@ -9026,8 +9060,8 @@
         </w:pict>
       </w:r>
     </w:p>
-    <w:bookmarkEnd w:id="54"/>
-    <w:bookmarkStart w:id="55" w:name="sanity-checks-and-red-teaming"/>
+    <w:bookmarkEnd w:id="55"/>
+    <w:bookmarkStart w:id="56" w:name="sanity-checks-and-red-teaming"/>
     <w:p>
       <w:pPr>
         <w:pStyle w:val="Heading1"/>
@@ -9590,8 +9624,8 @@
         </w:pict>
       </w:r>
     </w:p>
-    <w:bookmarkEnd w:id="55"/>
-    <w:bookmarkStart w:id="56" w:name="limitations"/>
+    <w:bookmarkEnd w:id="56"/>
+    <w:bookmarkStart w:id="57" w:name="limitations"/>
     <w:p>
       <w:pPr>
         <w:pStyle w:val="Heading1"/>
@@ -9723,8 +9757,8 @@
         </w:pict>
       </w:r>
     </w:p>
-    <w:bookmarkEnd w:id="56"/>
-    <w:bookmarkStart w:id="57" w:name="what-i-would-do-next"/>
+    <w:bookmarkEnd w:id="57"/>
+    <w:bookmarkStart w:id="58" w:name="what-i-would-do-next"/>
     <w:p>
       <w:pPr>
         <w:pStyle w:val="Heading1"/>
@@ -9864,8 +9898,8 @@
         </w:pict>
       </w:r>
     </w:p>
-    <w:bookmarkEnd w:id="57"/>
-    <w:bookmarkStart w:id="58" w:name="reproducibility"/>
+    <w:bookmarkEnd w:id="58"/>
+    <w:bookmarkStart w:id="59" w:name="reproducibility"/>
     <w:p>
       <w:pPr>
         <w:pStyle w:val="Heading1"/>
@@ -10318,8 +10352,8 @@
         </w:pict>
       </w:r>
     </w:p>
-    <w:bookmarkEnd w:id="58"/>
-    <w:bookmarkStart w:id="59" w:name="time-accounting"/>
+    <w:bookmarkEnd w:id="59"/>
+    <w:bookmarkStart w:id="60" w:name="time-accounting"/>
     <w:p>
       <w:pPr>
         <w:pStyle w:val="Heading1"/>
@@ -10549,8 +10583,8 @@
         </w:pict>
       </w:r>
     </w:p>
-    <w:bookmarkEnd w:id="59"/>
-    <w:bookmarkStart w:id="60" w:name="appendix-where-everything-lives"/>
+    <w:bookmarkEnd w:id="60"/>
+    <w:bookmarkStart w:id="61" w:name="appendix-where-everything-lives"/>
     <w:p>
       <w:pPr>
         <w:pStyle w:val="Heading1"/>
@@ -10657,7 +10691,7 @@
         <w:t xml:space="preserve">.</w:t>
       </w:r>
     </w:p>
-    <w:bookmarkEnd w:id="60"/>
+    <w:bookmarkEnd w:id="61"/>
     <w:sectPr>
       <w:pgMar w:bottom="1020" w:left="1134" w:right="1134" w:top="1020"/>
     </w:sectPr>

</xml_diff>

<commit_message>
Rebuild report after the 18-item exec summary fix list
Co-Authored-By: Claude Fable 5.1 <noreply@anthropic.com>

Claude-Session: https://claude.ai/code/session_011eNoRh7HnqxwuUuQK5Y4fW
</commit_message>
<xml_diff>
--- a/writeup/mats12-report.docx
+++ b/writeup/mats12-report.docx
@@ -102,13 +102,13 @@
         <w:t xml:space="preserve"> </w:t>
       </w:r>
       <w:r>
-        <w:t xml:space="preserve">For my experiment I used Qwen3.5-4B with the released pre-fitted J-Lens. Qwen3.5-4B has 32 layers (0-31), with layer 31 being the final answer. J-Lens can read from any of the layers. Using the development dataset, I probed at various points in the prompt: after the facts, during the question, at the question mark, and right before the answer colon. At each of these points I measured the margin. I then froze the layer with the best margin at each position in the sentence. While running the lens I also saved the model’s own answer preference at the same spot, so I could later check the lens on the records where the model itself was leaning wrong.</w:t>
-      </w:r>
-      <w:r>
-        <w:t xml:space="preserve"> </w:t>
-      </w:r>
-      <w:r>
-        <w:t xml:space="preserve">Using the held-out data, I again probed at the frozen layers at each position to measure the margin. A positive value means the lens prefers the correct answer. The magnitude of that number measures how much it’s preferred. Of the 4 positions, the interesting one is just after the model is forced to start answering the question.</w:t>
+        <w:t xml:space="preserve">For my experiment I used Qwen3.5-4B with the released pre-fitted J-Lens. Qwen3.5-4B has 32 layers; J-Lens can read from layers 0-30. Using the development dataset, I probed at various points in the prompt: after the facts, during the question, at the question mark, and right before the answer colon. At each of these points I measured the margin. I then froze the layer with the best margin at each position in the sentence. While running the lens I also saved the model’s own answer preference at the same spot, so I could later check the lens on the records where the model itself was leaning wrong.</w:t>
+      </w:r>
+      <w:r>
+        <w:t xml:space="preserve"> </w:t>
+      </w:r>
+      <w:r>
+        <w:t xml:space="preserve">Using the held-out data, I again probed at the frozen layers at each position to measure the margin. A positive value means the lens prefers the correct answer. The magnitude of that number measures how much it’s preferred. Of the 4 positions, the interesting one is the word in the question that first pins down the answer.</w:t>
       </w:r>
       <w:r>
         <w:t xml:space="preserve"> </w:t>
@@ -120,7 +120,7 @@
         <w:t xml:space="preserve"> </w:t>
       </w:r>
       <w:r>
-        <w:t xml:space="preserve">J-Lens scored 0.781 vs 0.519 for a shuffled-label control at the end of the fact token. But the model’s own next-token leaning was already right 0.800 of the time at that same spot. On the records where the model is wrong, the lens reduces to 0.344 and 0.125, well below chance. A probe trained with the answer key read 0.525 at the same spot where J-Lens read 0.781, so there was no binding signal there for it to find. My intuition here tells me the lens was guessing the model’s answer, not reading its memory.</w:t>
+        <w:t xml:space="preserve">J-Lens scored 0.781 vs 0.519 for a shuffled-label control at the relation token. But the model’s own next-token leaning was already right 0.800 of the time at that same spot. On the records where the model is wrong, the lens reduces to 0.344 and 0.125, to chance and below. A probe trained with the answer key read 0.525 at the same spot where J-Lens read 0.781, so there was no binding signal there for it to find. The simplest explanation that fits all three numbers is that the lens was guessing the model’s answer, not reading its memory.</w:t>
       </w:r>
       <w:r>
         <w:br/>
@@ -222,7 +222,7 @@
         <w:t xml:space="preserve"> </w:t>
       </w:r>
       <w:r>
-        <w:t xml:space="preserve">The dataset had 50 prompt pairs: 10 for development (40 records) and 40 held out (160 records), not looked at until the layers and positions were frozen. I ran J-Lens and the logit lens on the held-out records at the frozen positions and layers. The logit lens here is the same code with the Jacobian switched off, so the only thing that differs between the two is the Jacobian. At the relation token J-Lens scored 0.781 and the logit lens 0.688, both against a 0.519 shuffled-label control; at the question mark the logit lens was ahead, 0.738 to 0.669. Both beat the control, but the model’s own next-token leaning was already right 80% of the time at that same spot. So on picking the right city it is a wash. Where J-Lens clearly wins is ranking: it puts the correct city at rank 35 of 248K, the logit lens near 1,000. Even so, it still does not appear to be reading any bindings at these layers.</w:t>
+        <w:t xml:space="preserve">The dataset had 50 prompt pairs: 10 for development (40 records) and 40 held out (160 records), not looked at until the layers and positions were frozen. I ran J-Lens and the logit lens on the held-out records at the frozen positions and layers. The logit lens here is the same code with the Jacobian switched off, so the only thing that differs between the two is the Jacobian. At the relation token J-Lens scored 0.781 and the logit lens 0.688, both against a 0.519 shuffled-label control; at the question mark the logit lens was ahead, 0.738 to 0.669. The model’s own next-token leaning was already right 80% of the time at that same spot. So on picking the right city it is a wash. Where J-Lens clearly wins is ranking: it puts the correct city at rank 35 of 248K, the logit lens near 1,000. Even so, it still does not appear to be reading any bindings at these layers.</w:t>
       </w:r>
       <w:r>
         <w:t xml:space="preserve"> </w:t>
@@ -234,7 +234,7 @@
         <w:t xml:space="preserve"> </w:t>
       </w:r>
       <w:r>
-        <w:t xml:space="preserve">In experiment 2, I used 2 controls. First I shuffled the labels. I took the 160 held-out records with the lens readings computed. For each record I randomly reassign which city is marked correct (drawn from the pool of 6 cities, using a fixed randomizer seed). Then I re-grade the lens reading against the shuffled key. The results were 0.52 at the relation token, 0.556 at the question mark, and 0.35 on the dev set (smaller number of cities). This rules out the model guessing based on unrelated info. The second control was a random matrix used in place of the prefit J-Lens matrix. I ran the full pipeline with the same prompts and the random matrix using the same positions, layers, activations and scoring. The resulting direction was 0.475-0.537 everywhere, and the correct city was a median rank of 130K-206K out of 248,320, versus 35 for the real matrix.</w:t>
+        <w:t xml:space="preserve">In experiment 2, I used 2 controls. First I shuffled the labels. I took the 160 held-out records with the lens readings computed. For each record I randomly reassign which city is marked correct (drawn from the pool of 6 cities, using a fixed randomizer seed). Then I re-grade the lens reading against the shuffled key. The results were 0.52 at the relation token, 0.556 at the question mark, and 0.35 on the dev set. This rules out a scoring step that scores high without the real answer key. The second control was a random matrix used in place of the prefit J-Lens matrix. I ran the full pipeline with the same prompts and the random matrix using the same positions, layers, activations and scoring. The resulting direction was 0.475-0.537 everywhere, and the correct city was a median rank of 130K-206K out of 248,320, versus 35 for the real matrix. So the trained matrix is what does the work.</w:t>
       </w:r>
       <w:r>
         <w:t xml:space="preserve"> </w:t>
@@ -248,7 +248,7 @@
         <w:pStyle w:val="BodyText"/>
       </w:pPr>
       <w:r>
-        <w:t xml:space="preserve">The causal test could not run: the released J-Lens code gives no way to separate its part of the residual from the rest. In its place I used the records where the model’s own guess pointed to the wrong city (32 to 40 of the 160). A lens that reads binding should still get these right. J-Lens got 0.344 and 0.125, below chance. A probe trained with the answer key read 0.525 at the same spot, so no method found a binding signal there.</w:t>
+        <w:t xml:space="preserve">My original plan was to create a test that changes the part of the model’s internal state J-Lens reads and checks whether the model’s answer changes. The piece it needs wasn’t in the released code, and building it was out of scope for 20 hours. So instead, I used the records where the model was already leaning toward the wrong city. I then graded the lens readings I already had on just those records. The intuition here is that the correct answer is still sitting in the prompt, however if the lens still gets it wrong, it’s tending to follow the lean of the model, vs reading any binding information that is likely not present. I used the records where the model’s own guess pointed to the wrong city (32 records at the relation token, 40 at the question mark). A lens that reads binding should still get these right. J-Lens got 0.344 and 0.125, chance and below. A probe trained with the answer key read 0.525 at the same spot, so no method found a binding signal there. The simplest explanation that fits all three numbers is that the lens was guessing the model’s answer, not reading its memory.</w:t>
       </w:r>
       <w:r>
         <w:t xml:space="preserve"> </w:t>
@@ -281,7 +281,7 @@
         </w:numPr>
       </w:pPr>
       <w:r>
-        <w:t xml:space="preserve">J-Lens scoring used by most does not catch this; my method allows you to measure whether the readings are saying more than the model’s output, making the use of a Lens more trustworthy.</w:t>
+        <w:t xml:space="preserve">The standard way of scoring a lens does not catch this; my method allows you to measure whether the readings are saying more than the model’s output, making the use of a Lens more trustworthy.</w:t>
       </w:r>
     </w:p>
     <w:p>
@@ -305,7 +305,7 @@
         </w:numPr>
       </w:pPr>
       <w:r>
-        <w:t xml:space="preserve">J-Lens is better than previous lenses at ranking the right words. J-Lens vs Logit Lens had a ranking of 35 vs 1000 out of 248K words.</w:t>
+        <w:t xml:space="preserve">J-Lens is better than the logit lens at ranking the right words. J-Lens vs Logit Lens had a ranking of 35 vs 1000 out of 248K words.</w:t>
       </w:r>
       <w:r>
         <w:br/>
@@ -319,7 +319,7 @@
         <w:pStyle w:val="FirstParagraph"/>
       </w:pPr>
       <w:r>
-        <w:t xml:space="preserve">One model, one released lens, one small task with six cities. At the position that matters most, even a probe trained with the answers found nothing, so I cannot say whether the binding is stored at some layer or position I did not read. I also did not test whether changing the residual changes the answer.</w:t>
+        <w:t xml:space="preserve">One model, one released lens, one small task with six cities. At the position that matters most, even a probe trained with the answers found nothing, so I cannot say whether the binding is stored at some layer or position I did not read. I also did not test whether changing the residual changes the answer, so my claims are correlation only.</w:t>
       </w:r>
     </w:p>
     <w:bookmarkEnd w:id="16"/>

</xml_diff>

<commit_message>
Rebuild report with paragraph breaks and figure placement
Co-Authored-By: Claude Fable 5.1 <noreply@anthropic.com>

Claude-Session: https://claude.ai/code/session_011eNoRh7HnqxwuUuQK5Y4fW
</commit_message>
<xml_diff>
--- a/writeup/mats12-report.docx
+++ b/writeup/mats12-report.docx
@@ -34,7 +34,7 @@
         <w:t xml:space="preserve">September 2026</w:t>
       </w:r>
     </w:p>
-    <w:bookmarkStart w:id="17" w:name="executive-summary"/>
+    <w:bookmarkStart w:id="24" w:name="executive-summary"/>
     <w:p>
       <w:pPr>
         <w:pStyle w:val="Heading1"/>
@@ -61,7 +61,7 @@
       </w:r>
     </w:p>
     <w:bookmarkEnd w:id="9"/>
-    <w:bookmarkStart w:id="16" w:name="what-problem-am-i-trying-to-solve"/>
+    <w:bookmarkStart w:id="10" w:name="what-problem-am-i-trying-to-solve"/>
     <w:p>
       <w:pPr>
         <w:pStyle w:val="Heading2"/>
@@ -77,9 +77,11 @@
       <w:r>
         <w:t xml:space="preserve">How do we know if the thoughts exposed by an interpretability lens are trustworthy enough to reveal what the model actually represents? I built a small task and experiment to measure, audit, and tell the difference between a guess and the actual answer.</w:t>
       </w:r>
-      <w:r>
-        <w:br/>
-      </w:r>
+    </w:p>
+    <w:p>
+      <w:pPr>
+        <w:pStyle w:val="BodyText"/>
+      </w:pPr>
       <w:r>
         <w:t xml:space="preserve">To answer this question, I built a dataset of prompts. Each prompt contains a pair, such as</w:t>
       </w:r>
@@ -92,56 +94,72 @@
       <w:r>
         <w:t xml:space="preserve">. For each prompt I swapped pairs changing who goes with what. I then used J-Lens, partway through the computation for the answer, to see if it could tell which city goes with which person. Both cities appear in every prompt, so a method that only detects concepts scores 50%, which is just chance. The intuition says that only binding-access beats chance. However, there is a second way to beat chance, and that is by predicting the answer the model is about to give. My experiment is designed to distinguish between the two.</w:t>
       </w:r>
-      <w:r>
-        <w:t xml:space="preserve"> </w:t>
-      </w:r>
-      <w:r>
-        <w:t xml:space="preserve">## Methodology</w:t>
-      </w:r>
-      <w:r>
-        <w:t xml:space="preserve"> </w:t>
-      </w:r>
+    </w:p>
+    <w:bookmarkEnd w:id="10"/>
+    <w:bookmarkStart w:id="11" w:name="methodology"/>
+    <w:p>
+      <w:pPr>
+        <w:pStyle w:val="Heading2"/>
+      </w:pPr>
+      <w:r>
+        <w:t xml:space="preserve">Methodology</w:t>
+      </w:r>
+    </w:p>
+    <w:p>
+      <w:pPr>
+        <w:pStyle w:val="FirstParagraph"/>
+      </w:pPr>
       <w:r>
         <w:t xml:space="preserve">For my experiment I used Qwen3.5-4B with the released pre-fitted J-Lens. Qwen3.5-4B has 32 layers; J-Lens can read from layers 0-30. Using the development dataset, I probed at various points in the prompt: after the facts, during the question, at the question mark, and right before the answer colon. At each of these points I measured the margin. I then froze the layer with the best margin at each position in the sentence. While running the lens I also saved the model’s own answer preference at the same spot, so I could later check the lens on the records where the model itself was leaning wrong.</w:t>
       </w:r>
-      <w:r>
-        <w:t xml:space="preserve"> </w:t>
-      </w:r>
+    </w:p>
+    <w:p>
+      <w:pPr>
+        <w:pStyle w:val="BodyText"/>
+      </w:pPr>
       <w:r>
         <w:t xml:space="preserve">Using the held-out data, I again probed at the frozen layers at each position to measure the margin. A positive value means the lens prefers the correct answer. The magnitude of that number measures how much it’s preferred. Of the 4 positions, the interesting one is the word in the question that first pins down the answer.</w:t>
       </w:r>
-      <w:r>
-        <w:t xml:space="preserve"> </w:t>
-      </w:r>
-      <w:r>
-        <w:t xml:space="preserve">## Results</w:t>
-      </w:r>
-      <w:r>
-        <w:t xml:space="preserve"> </w:t>
-      </w:r>
+    </w:p>
+    <w:bookmarkEnd w:id="11"/>
+    <w:bookmarkStart w:id="15" w:name="results"/>
+    <w:p>
+      <w:pPr>
+        <w:pStyle w:val="Heading2"/>
+      </w:pPr>
+      <w:r>
+        <w:t xml:space="preserve">Results</w:t>
+      </w:r>
+    </w:p>
+    <w:p>
+      <w:pPr>
+        <w:pStyle w:val="FirstParagraph"/>
+      </w:pPr>
       <w:r>
         <w:t xml:space="preserve">J-Lens scored 0.781 vs 0.519 for a shuffled-label control at the relation token. But the model’s own next-token leaning was already right 0.800 of the time at that same spot. On the records where the model is wrong, the lens reduces to 0.344 and 0.125, to chance and below. A probe trained with the answer key read 0.525 at the same spot where J-Lens read 0.781, so there was no binding signal there for it to find. The simplest explanation that fits all three numbers is that the lens was guessing the model’s answer, not reading its memory.</w:t>
       </w:r>
-      <w:r>
-        <w:br/>
-      </w:r>
+    </w:p>
+    <w:p>
+      <w:pPr>
+        <w:pStyle w:val="CaptionedFigure"/>
+      </w:pPr>
       <w:r>
         <w:drawing>
           <wp:inline>
             <wp:extent cx="4267200" cy="2607733"/>
             <wp:effectExtent b="0" l="0" r="0" t="0"/>
-            <wp:docPr descr="Direction score by position on frozen held-out data (n=160): both lenses rise at the token that pins down the answer and track the model’s own next-token preference; the shuffled-label and random-transport controls stay at chance." title="" id="11" name="Picture"/>
+            <wp:docPr descr="Figure 1. Direction score by position on frozen held-out data (n=160): both lenses rise at the token that pins down the answer and track the model’s own next-token preference; the shuffled-label and random-transport controls stay at chance." title="" id="13" name="Picture"/>
             <a:graphic>
               <a:graphicData uri="http://schemas.openxmlformats.org/drawingml/2006/picture">
                 <pic:pic>
                   <pic:nvPicPr>
-                    <pic:cNvPr descr="results/figures/stage3-frac-by-position.png" id="12" name="Picture"/>
+                    <pic:cNvPr descr="results/figures/stage3-frac-by-position.png" id="14" name="Picture"/>
                     <pic:cNvPicPr>
                       <a:picLocks noChangeArrowheads="1" noChangeAspect="1"/>
                     </pic:cNvPicPr>
                   </pic:nvPicPr>
                   <pic:blipFill>
-                    <a:blip r:embed="rId10"/>
+                    <a:blip r:embed="rId12"/>
                     <a:stretch>
                       <a:fillRect/>
                     </a:stretch>
@@ -167,26 +185,90 @@
           </wp:inline>
         </w:drawing>
       </w:r>
-      <w:r>
-        <w:t xml:space="preserve"> </w:t>
-      </w:r>
+    </w:p>
+    <w:p>
+      <w:pPr>
+        <w:pStyle w:val="ImageCaption"/>
+      </w:pPr>
+      <w:r>
+        <w:t xml:space="preserve">Figure 1. Direction score by position on frozen held-out data (n=160): both lenses rise at the token that pins down the answer and track the model’s own next-token preference; the shuffled-label and random-transport controls stay at chance.</w:t>
+      </w:r>
+    </w:p>
+    <w:bookmarkEnd w:id="15"/>
+    <w:bookmarkStart w:id="16" w:name="X4a6fd96a50095f0c1c76a4f92280384136ed846"/>
+    <w:p>
+      <w:pPr>
+        <w:pStyle w:val="Heading2"/>
+      </w:pPr>
+      <w:r>
+        <w:t xml:space="preserve">Experiment 1 — Does J-Lens beat the logit lens at binding?</w:t>
+      </w:r>
+    </w:p>
+    <w:p>
+      <w:pPr>
+        <w:pStyle w:val="FirstParagraph"/>
+      </w:pPr>
+      <w:r>
+        <w:t xml:space="preserve">The dataset had 50 prompt pairs: 10 for development (40 records) and 40 held out (160 records), not looked at until the layers and positions were frozen. I ran J-Lens and the logit lens on the held-out records at the frozen positions and layers. The logit lens here is the same code with the Jacobian switched off, so the only thing that differs between the two is the Jacobian. At the relation token J-Lens scored 0.781 and the logit lens 0.688, both against a 0.519 shuffled-label control; at the question mark the logit lens was ahead, 0.738 to 0.669. The model’s own next-token leaning was already right 80% of the time at that same spot. So on picking the right city it is a wash. Where J-Lens clearly wins is ranking: it puts the correct city at rank 35 of 248K, the logit lens near 1,000. Even so, it still does not appear to be reading any bindings at these layers.</w:t>
+      </w:r>
+    </w:p>
+    <w:bookmarkEnd w:id="16"/>
+    <w:bookmarkStart w:id="17" w:name="experiment-2-do-the-controls-hold"/>
+    <w:p>
+      <w:pPr>
+        <w:pStyle w:val="Heading2"/>
+      </w:pPr>
+      <w:r>
+        <w:t xml:space="preserve">Experiment 2 — Do the controls hold?</w:t>
+      </w:r>
+    </w:p>
+    <w:p>
+      <w:pPr>
+        <w:pStyle w:val="FirstParagraph"/>
+      </w:pPr>
+      <w:r>
+        <w:t xml:space="preserve">In experiment 2, I used 2 controls. First I shuffled the labels. I took the 160 held-out records with the lens readings computed. For each record I randomly reassign which city is marked correct (drawn from the pool of 6 cities, using a fixed randomizer seed). Then I re-grade the lens reading against the shuffled key. The results were 0.52 at the relation token, 0.556 at the question mark, and 0.35 on the dev set. This rules out a scoring step that scores high without the real answer key. The second control was a random matrix used in place of the prefit J-Lens matrix. I ran the full pipeline with the same prompts and the random matrix using the same positions, layers, activations and scoring. The resulting direction was 0.475-0.537 everywhere, and the correct city was a median rank of 130K-206K out of 248,320, versus 35 for the real matrix. So the trained matrix is what does the work.</w:t>
+      </w:r>
+    </w:p>
+    <w:bookmarkEnd w:id="17"/>
+    <w:bookmarkStart w:id="21" w:name="X444d33cdc79da0ce4be1444b3a46153c51831c6"/>
+    <w:p>
+      <w:pPr>
+        <w:pStyle w:val="Heading2"/>
+      </w:pPr>
+      <w:r>
+        <w:t xml:space="preserve">Experiment 3 — What replaced the causal test</w:t>
+      </w:r>
+    </w:p>
+    <w:p>
+      <w:pPr>
+        <w:pStyle w:val="FirstParagraph"/>
+      </w:pPr>
+      <w:r>
+        <w:t xml:space="preserve">My original plan was to create a test that changes the part of the model’s internal state J-Lens reads and checks whether the model’s answer changes. The piece it needs wasn’t in the released code, and building it was out of scope for 20 hours. So instead, I used the records where the model was already leaning toward the wrong city. I then graded the lens readings I already had on just those records. The intuition here is that the correct answer is still sitting in the prompt, however if the lens still gets it wrong, it’s tending to follow the lean of the model, vs reading any binding information that is likely not present. I used the records where the model’s own guess pointed to the wrong city (32 records at the relation token, 40 at the question mark). A lens that reads binding should still get these right. J-Lens got 0.344 and 0.125, chance and below. A probe trained with the answer key read 0.525 at the same spot, so no method found a binding signal there. The simplest explanation that fits all three numbers is that the lens was guessing the model’s answer, not reading its memory.</w:t>
+      </w:r>
+    </w:p>
+    <w:p>
+      <w:pPr>
+        <w:pStyle w:val="CaptionedFigure"/>
+      </w:pPr>
       <w:r>
         <w:drawing>
           <wp:inline>
             <wp:extent cx="4267200" cy="2800349"/>
             <wp:effectExtent b="0" l="0" r="0" t="0"/>
-            <wp:docPr descr="J-Lens accuracy on held-out records, split by whether the model itself was leaning right or wrong. Where the model leaned wrong, every passive readout followed it below chance." title="" id="14" name="Picture"/>
+            <wp:docPr descr="Figure 2. J-Lens accuracy on held-out records, split by whether the model itself was leaning right or wrong. Where the model leaned wrong, every passive readout followed it below chance." title="" id="19" name="Picture"/>
             <a:graphic>
               <a:graphicData uri="http://schemas.openxmlformats.org/drawingml/2006/picture">
                 <pic:pic>
                   <pic:nvPicPr>
-                    <pic:cNvPr descr="results/figures/stage3-discriminating-set.png" id="15" name="Picture"/>
+                    <pic:cNvPr descr="results/figures/stage3-discriminating-set.png" id="20" name="Picture"/>
                     <pic:cNvPicPr>
                       <a:picLocks noChangeArrowheads="1" noChangeAspect="1"/>
                     </pic:cNvPicPr>
                   </pic:nvPicPr>
                   <pic:blipFill>
-                    <a:blip r:embed="rId13"/>
+                    <a:blip r:embed="rId18"/>
                     <a:stretch>
                       <a:fillRect/>
                     </a:stretch>
@@ -212,49 +294,23 @@
           </wp:inline>
         </w:drawing>
       </w:r>
-      <w:r>
-        <w:t xml:space="preserve"> </w:t>
-      </w:r>
-      <w:r>
-        <w:t xml:space="preserve">## Experiment 1 — Does J-Lens beat the logit lens at binding?</w:t>
-      </w:r>
-      <w:r>
-        <w:t xml:space="preserve"> </w:t>
-      </w:r>
-      <w:r>
-        <w:t xml:space="preserve">The dataset had 50 prompt pairs: 10 for development (40 records) and 40 held out (160 records), not looked at until the layers and positions were frozen. I ran J-Lens and the logit lens on the held-out records at the frozen positions and layers. The logit lens here is the same code with the Jacobian switched off, so the only thing that differs between the two is the Jacobian. At the relation token J-Lens scored 0.781 and the logit lens 0.688, both against a 0.519 shuffled-label control; at the question mark the logit lens was ahead, 0.738 to 0.669. The model’s own next-token leaning was already right 80% of the time at that same spot. So on picking the right city it is a wash. Where J-Lens clearly wins is ranking: it puts the correct city at rank 35 of 248K, the logit lens near 1,000. Even so, it still does not appear to be reading any bindings at these layers.</w:t>
-      </w:r>
-      <w:r>
-        <w:t xml:space="preserve"> </w:t>
-      </w:r>
-      <w:r>
-        <w:t xml:space="preserve">## Experiment 2 — Do the controls hold?</w:t>
-      </w:r>
-      <w:r>
-        <w:t xml:space="preserve"> </w:t>
-      </w:r>
-      <w:r>
-        <w:t xml:space="preserve">In experiment 2, I used 2 controls. First I shuffled the labels. I took the 160 held-out records with the lens readings computed. For each record I randomly reassign which city is marked correct (drawn from the pool of 6 cities, using a fixed randomizer seed). Then I re-grade the lens reading against the shuffled key. The results were 0.52 at the relation token, 0.556 at the question mark, and 0.35 on the dev set. This rules out a scoring step that scores high without the real answer key. The second control was a random matrix used in place of the prefit J-Lens matrix. I ran the full pipeline with the same prompts and the random matrix using the same positions, layers, activations and scoring. The resulting direction was 0.475-0.537 everywhere, and the correct city was a median rank of 130K-206K out of 248,320, versus 35 for the real matrix. So the trained matrix is what does the work.</w:t>
-      </w:r>
-      <w:r>
-        <w:t xml:space="preserve"> </w:t>
-      </w:r>
-      <w:r>
-        <w:t xml:space="preserve">## Experiment 3 — What replaced the causal test</w:t>
-      </w:r>
-    </w:p>
-    <w:p>
-      <w:pPr>
-        <w:pStyle w:val="BodyText"/>
-      </w:pPr>
-      <w:r>
-        <w:t xml:space="preserve">My original plan was to create a test that changes the part of the model’s internal state J-Lens reads and checks whether the model’s answer changes. The piece it needs wasn’t in the released code, and building it was out of scope for 20 hours. So instead, I used the records where the model was already leaning toward the wrong city. I then graded the lens readings I already had on just those records. The intuition here is that the correct answer is still sitting in the prompt, however if the lens still gets it wrong, it’s tending to follow the lean of the model, vs reading any binding information that is likely not present. I used the records where the model’s own guess pointed to the wrong city (32 records at the relation token, 40 at the question mark). A lens that reads binding should still get these right. J-Lens got 0.344 and 0.125, chance and below. A probe trained with the answer key read 0.525 at the same spot, so no method found a binding signal there. The simplest explanation that fits all three numbers is that the lens was guessing the model’s answer, not reading its memory.</w:t>
-      </w:r>
-      <w:r>
-        <w:t xml:space="preserve"> </w:t>
-      </w:r>
-      <w:r>
-        <w:t xml:space="preserve">## High-level takeaways</w:t>
+    </w:p>
+    <w:p>
+      <w:pPr>
+        <w:pStyle w:val="ImageCaption"/>
+      </w:pPr>
+      <w:r>
+        <w:t xml:space="preserve">Figure 2. J-Lens accuracy on held-out records, split by whether the model itself was leaning right or wrong. Where the model leaned wrong, every passive readout followed it below chance.</w:t>
+      </w:r>
+    </w:p>
+    <w:bookmarkEnd w:id="21"/>
+    <w:bookmarkStart w:id="22" w:name="high-level-takeaways"/>
+    <w:p>
+      <w:pPr>
+        <w:pStyle w:val="Heading2"/>
+      </w:pPr>
+      <w:r>
+        <w:t xml:space="preserve">High-level takeaways</w:t>
       </w:r>
     </w:p>
     <w:p>
@@ -268,9 +324,6 @@
       <w:r>
         <w:t xml:space="preserve">On the task I tested, J-Lens does NOT read what the model has stored for bindings - it simply guesses what the model is about to say. Where the model leaned wrong, J-Lens followed it: 0.344 and 0.125 against 0.500 chance.</w:t>
       </w:r>
-      <w:r>
-        <w:br/>
-      </w:r>
     </w:p>
     <w:p>
       <w:pPr>
@@ -307,11 +360,15 @@
       <w:r>
         <w:t xml:space="preserve">J-Lens is better than the logit lens at ranking the right words. J-Lens vs Logit Lens had a ranking of 35 vs 1000 out of 248K words.</w:t>
       </w:r>
-      <w:r>
-        <w:br/>
-      </w:r>
-      <w:r>
-        <w:t xml:space="preserve">## Biggest limitation</w:t>
+    </w:p>
+    <w:bookmarkEnd w:id="22"/>
+    <w:bookmarkStart w:id="23" w:name="biggest-limitation"/>
+    <w:p>
+      <w:pPr>
+        <w:pStyle w:val="Heading2"/>
+      </w:pPr>
+      <w:r>
+        <w:t xml:space="preserve">Biggest limitation</w:t>
       </w:r>
     </w:p>
     <w:p>
@@ -322,9 +379,9 @@
         <w:t xml:space="preserve">One model, one released lens, one small task with six cities. At the position that matters most, even a probe trained with the answers found nothing, so I cannot say whether the binding is stored at some layer or position I did not read. I also did not test whether changing the residual changes the answer, so my claims are correlation only.</w:t>
       </w:r>
     </w:p>
-    <w:bookmarkEnd w:id="16"/>
-    <w:bookmarkEnd w:id="17"/>
-    <w:bookmarkStart w:id="23" w:name="randomly-selected-raw-examples"/>
+    <w:bookmarkEnd w:id="23"/>
+    <w:bookmarkEnd w:id="24"/>
+    <w:bookmarkStart w:id="30" w:name="randomly-selected-raw-examples"/>
     <w:p>
       <w:pPr>
         <w:pStyle w:val="Heading1"/>
@@ -480,7 +537,7 @@
         <w:t xml:space="preserve">committed run output; agent-unverified.</w:t>
       </w:r>
     </w:p>
-    <w:bookmarkStart w:id="18" w:name="example-1-success-real-zero-035-bba-t6"/>
+    <w:bookmarkStart w:id="25" w:name="example-1-success-real-zero-035-bba-t6"/>
     <w:p>
       <w:pPr>
         <w:pStyle w:val="Heading3"/>
@@ -766,8 +823,8 @@
         </w:tc>
       </w:tr>
     </w:tbl>
-    <w:bookmarkEnd w:id="18"/>
-    <w:bookmarkStart w:id="19" w:name="example-2-success-real-zero-047-aba-t6"/>
+    <w:bookmarkEnd w:id="25"/>
+    <w:bookmarkStart w:id="26" w:name="example-2-success-real-zero-047-aba-t6"/>
     <w:p>
       <w:pPr>
         <w:pStyle w:val="Heading3"/>
@@ -1053,8 +1110,8 @@
         </w:tc>
       </w:tr>
     </w:tbl>
-    <w:bookmarkEnd w:id="19"/>
-    <w:bookmarkStart w:id="20" w:name="example-3-failure-real-zero-035-bab-t6"/>
+    <w:bookmarkEnd w:id="26"/>
+    <w:bookmarkStart w:id="27" w:name="example-3-failure-real-zero-035-bab-t6"/>
     <w:p>
       <w:pPr>
         <w:pStyle w:val="Heading3"/>
@@ -1340,8 +1397,8 @@
         </w:tc>
       </w:tr>
     </w:tbl>
-    <w:bookmarkEnd w:id="20"/>
-    <w:bookmarkStart w:id="21" w:name="example-4-failure-real-zero-023-bba-t6"/>
+    <w:bookmarkEnd w:id="27"/>
+    <w:bookmarkStart w:id="28" w:name="example-4-failure-real-zero-023-bba-t6"/>
     <w:p>
       <w:pPr>
         <w:pStyle w:val="Heading3"/>
@@ -1627,8 +1684,8 @@
         </w:tc>
       </w:tr>
     </w:tbl>
-    <w:bookmarkEnd w:id="21"/>
-    <w:bookmarkStart w:id="22" w:name="X08d12fc239e1304c729fa2c498dcd7bd419b671"/>
+    <w:bookmarkEnd w:id="28"/>
+    <w:bookmarkStart w:id="29" w:name="X08d12fc239e1304c729fa2c498dcd7bd419b671"/>
     <w:p>
       <w:pPr>
         <w:pStyle w:val="Heading3"/>
@@ -1921,9 +1978,9 @@
         </w:pict>
       </w:r>
     </w:p>
-    <w:bookmarkEnd w:id="22"/>
-    <w:bookmarkEnd w:id="23"/>
-    <w:bookmarkStart w:id="30" w:name="motivation-and-research-question"/>
+    <w:bookmarkEnd w:id="29"/>
+    <w:bookmarkEnd w:id="30"/>
+    <w:bookmarkStart w:id="37" w:name="motivation-and-research-question"/>
     <w:p>
       <w:pPr>
         <w:pStyle w:val="Heading1"/>
@@ -1968,7 +2025,7 @@
         <w:t xml:space="preserve">the model’s answer?</w:t>
       </w:r>
     </w:p>
-    <w:bookmarkStart w:id="24" w:name="what-j-lens-is-briefly"/>
+    <w:bookmarkStart w:id="31" w:name="what-j-lens-is-briefly"/>
     <w:p>
       <w:pPr>
         <w:pStyle w:val="Heading2"/>
@@ -1985,8 +2042,8 @@
         <w:t xml:space="preserve">J-Lens is defined from first principles in §2.1.</w:t>
       </w:r>
     </w:p>
-    <w:bookmarkEnd w:id="24"/>
-    <w:bookmarkStart w:id="28" w:name="X44758b870a0731464fb2764574cc64fea7fcb2d"/>
+    <w:bookmarkEnd w:id="31"/>
+    <w:bookmarkStart w:id="35" w:name="X44758b870a0731464fb2764574cc64fea7fcb2d"/>
     <w:p>
       <w:pPr>
         <w:pStyle w:val="Heading2"/>
@@ -2092,18 +2149,18 @@
           <wp:inline>
             <wp:extent cx="4373880" cy="2142308"/>
             <wp:effectExtent b="0" l="0" r="0" t="0"/>
-            <wp:docPr descr="The binding problem: two prompts, the same four concepts, opposite pairings. Only the pairing distinguishes them, so only a reader of the relation can tell them apart." title="" id="26" name="Picture"/>
+            <wp:docPr descr="The binding problem: two prompts, the same four concepts, opposite pairings. Only the pairing distinguishes them, so only a reader of the relation can tell them apart." title="" id="33" name="Picture"/>
             <a:graphic>
               <a:graphicData uri="http://schemas.openxmlformats.org/drawingml/2006/picture">
                 <pic:pic>
                   <pic:nvPicPr>
-                    <pic:cNvPr descr="results/figures/binding-concept/fig1-binding-problem.png" id="27" name="Picture"/>
+                    <pic:cNvPr descr="results/figures/binding-concept/fig1-binding-problem.png" id="34" name="Picture"/>
                     <pic:cNvPicPr>
                       <a:picLocks noChangeArrowheads="1" noChangeAspect="1"/>
                     </pic:cNvPicPr>
                   </pic:nvPicPr>
                   <pic:blipFill>
-                    <a:blip r:embed="rId25"/>
+                    <a:blip r:embed="rId32"/>
                     <a:stretch>
                       <a:fillRect/>
                     </a:stretch>
@@ -2341,8 +2398,8 @@
         <w:t xml:space="preserve">selection, not a linearly decodable stored binding.</w:t>
       </w:r>
     </w:p>
-    <w:bookmarkEnd w:id="28"/>
-    <w:bookmarkStart w:id="29" w:name="the-gap"/>
+    <w:bookmarkEnd w:id="35"/>
+    <w:bookmarkStart w:id="36" w:name="the-gap"/>
     <w:p>
       <w:pPr>
         <w:pStyle w:val="Heading2"/>
@@ -2420,9 +2477,9 @@
         </w:pict>
       </w:r>
     </w:p>
-    <w:bookmarkEnd w:id="29"/>
-    <w:bookmarkEnd w:id="30"/>
-    <w:bookmarkStart w:id="43" w:name="method"/>
+    <w:bookmarkEnd w:id="36"/>
+    <w:bookmarkEnd w:id="37"/>
+    <w:bookmarkStart w:id="50" w:name="method"/>
     <w:p>
       <w:pPr>
         <w:pStyle w:val="Heading1"/>
@@ -2533,7 +2590,7 @@
         <w:t xml:space="preserve">turns out to be the interesting part, this project has failed.</w:t>
       </w:r>
     </w:p>
-    <w:bookmarkStart w:id="31" w:name="X57525b78a038dd7677b74b2cd929c744f8e7d70"/>
+    <w:bookmarkStart w:id="38" w:name="X57525b78a038dd7677b74b2cd929c744f8e7d70"/>
     <w:p>
       <w:pPr>
         <w:pStyle w:val="Heading2"/>
@@ -2958,8 +3015,8 @@
         <w:t xml:space="preserve">question with no obvious answer in either direction.</w:t>
       </w:r>
     </w:p>
-    <w:bookmarkEnd w:id="31"/>
-    <w:bookmarkStart w:id="32" w:name="substrate-model-lens-and-environment"/>
+    <w:bookmarkEnd w:id="38"/>
+    <w:bookmarkStart w:id="39" w:name="substrate-model-lens-and-environment"/>
     <w:p>
       <w:pPr>
         <w:pStyle w:val="Heading2"/>
@@ -3633,8 +3690,8 @@
         <w:t xml:space="preserve">8.51 GB of 47.7 GB — headroom is not a constraint on this design.</w:t>
       </w:r>
     </w:p>
-    <w:bookmarkEnd w:id="32"/>
-    <w:bookmarkStart w:id="33" w:name="Xe108057b195fe3c9ce8721c4dbab2e15b618e33"/>
+    <w:bookmarkEnd w:id="39"/>
+    <w:bookmarkStart w:id="40" w:name="Xe108057b195fe3c9ce8721c4dbab2e15b618e33"/>
     <w:p>
       <w:pPr>
         <w:pStyle w:val="Heading2"/>
@@ -4262,8 +4319,8 @@
         <w:t xml:space="preserve">, and are never tuned on.</w:t>
       </w:r>
     </w:p>
-    <w:bookmarkEnd w:id="33"/>
-    <w:bookmarkStart w:id="34" w:name="Xca73d2c970aa0db9760c2d5b75ab5af6c348063"/>
+    <w:bookmarkEnd w:id="40"/>
+    <w:bookmarkStart w:id="41" w:name="Xca73d2c970aa0db9760c2d5b75ab5af6c348063"/>
     <w:p>
       <w:pPr>
         <w:pStyle w:val="Heading2"/>
@@ -4636,8 +4693,8 @@
         <w:t xml:space="preserve">contaminated and undetermined references respectively.</w:t>
       </w:r>
     </w:p>
-    <w:bookmarkEnd w:id="34"/>
-    <w:bookmarkStart w:id="42" w:name="arms-metrics-and-controls"/>
+    <w:bookmarkEnd w:id="41"/>
+    <w:bookmarkStart w:id="49" w:name="arms-metrics-and-controls"/>
     <w:p>
       <w:pPr>
         <w:pStyle w:val="Heading2"/>
@@ -4655,18 +4712,18 @@
           <wp:inline>
             <wp:extent cx="4373880" cy="2767148"/>
             <wp:effectExtent b="0" l="0" r="0" t="0"/>
-            <wp:docPr descr="Three instruments on the same residual: the supervised difference-in-means probe as ceiling, J-Lens as the unsupervised reader, and the logit lens as floor." title="" id="36" name="Picture"/>
+            <wp:docPr descr="Three instruments on the same residual: the supervised difference-in-means probe as ceiling, J-Lens as the unsupervised reader, and the logit lens as floor." title="" id="43" name="Picture"/>
             <a:graphic>
               <a:graphicData uri="http://schemas.openxmlformats.org/drawingml/2006/picture">
                 <pic:pic>
                   <pic:nvPicPr>
-                    <pic:cNvPr descr="results/figures/binding-concept/fig3-three-instruments.png" id="37" name="Picture"/>
+                    <pic:cNvPr descr="results/figures/binding-concept/fig3-three-instruments.png" id="44" name="Picture"/>
                     <pic:cNvPicPr>
                       <a:picLocks noChangeArrowheads="1" noChangeAspect="1"/>
                     </pic:cNvPicPr>
                   </pic:nvPicPr>
                   <pic:blipFill>
-                    <a:blip r:embed="rId35"/>
+                    <a:blip r:embed="rId42"/>
                     <a:stretch>
                       <a:fillRect/>
                     </a:stretch>
@@ -4701,7 +4758,7 @@
         <w:t xml:space="preserve">Three instruments on the same residual: the supervised difference-in-means probe as ceiling, J-Lens as the unsupervised reader, and the logit lens as floor.</w:t>
       </w:r>
     </w:p>
-    <w:bookmarkStart w:id="38" w:name="three-arms"/>
+    <w:bookmarkStart w:id="45" w:name="three-arms"/>
     <w:p>
       <w:pPr>
         <w:pStyle w:val="Heading3"/>
@@ -5083,8 +5140,8 @@
         <w:t xml:space="preserve">passive script.)</w:t>
       </w:r>
     </w:p>
-    <w:bookmarkEnd w:id="38"/>
-    <w:bookmarkStart w:id="39" w:name="metrics"/>
+    <w:bookmarkEnd w:id="45"/>
+    <w:bookmarkStart w:id="46" w:name="metrics"/>
     <w:p>
       <w:pPr>
         <w:pStyle w:val="Heading3"/>
@@ -5373,8 +5430,8 @@
         <w:t xml:space="preserve">never form a vocabulary rank and are unaffected.</w:t>
       </w:r>
     </w:p>
-    <w:bookmarkEnd w:id="39"/>
-    <w:bookmarkStart w:id="40" w:name="baselines-and-controls"/>
+    <w:bookmarkEnd w:id="46"/>
+    <w:bookmarkStart w:id="47" w:name="baselines-and-controls"/>
     <w:p>
       <w:pPr>
         <w:pStyle w:val="Heading3"/>
@@ -6334,8 +6391,8 @@
         <w:t xml:space="preserve">11–357 at its selected layers.</w:t>
       </w:r>
     </w:p>
-    <w:bookmarkEnd w:id="40"/>
-    <w:bookmarkStart w:id="41" w:name="Xf1357951e2d3a6b81edaa0ff5b599eb419d4d06"/>
+    <w:bookmarkEnd w:id="47"/>
+    <w:bookmarkStart w:id="48" w:name="Xf1357951e2d3a6b81edaa0ff5b599eb419d4d06"/>
     <w:p>
       <w:pPr>
         <w:pStyle w:val="Heading3"/>
@@ -6452,10 +6509,10 @@
         </w:pict>
       </w:r>
     </w:p>
-    <w:bookmarkEnd w:id="41"/>
-    <w:bookmarkEnd w:id="42"/>
-    <w:bookmarkEnd w:id="43"/>
-    <w:bookmarkStart w:id="44" w:name="preregistration-and-what-was-frozen-when"/>
+    <w:bookmarkEnd w:id="48"/>
+    <w:bookmarkEnd w:id="49"/>
+    <w:bookmarkEnd w:id="50"/>
+    <w:bookmarkStart w:id="51" w:name="preregistration-and-what-was-frozen-when"/>
     <w:p>
       <w:pPr>
         <w:pStyle w:val="Heading1"/>
@@ -6843,8 +6900,8 @@
         </w:pict>
       </w:r>
     </w:p>
-    <w:bookmarkEnd w:id="44"/>
-    <w:bookmarkStart w:id="54" w:name="results"/>
+    <w:bookmarkEnd w:id="51"/>
+    <w:bookmarkStart w:id="61" w:name="results-1"/>
     <w:p>
       <w:pPr>
         <w:pStyle w:val="Heading1"/>
@@ -6853,7 +6910,7 @@
         <w:t xml:space="preserve">4. Results</w:t>
       </w:r>
     </w:p>
-    <w:bookmarkStart w:id="45" w:name="behavioral-eligibility"/>
+    <w:bookmarkStart w:id="52" w:name="behavioral-eligibility"/>
     <w:p>
       <w:pPr>
         <w:pStyle w:val="Heading2"/>
@@ -7139,8 +7196,8 @@
         <w:t xml:space="preserve">already on its way.</w:t>
       </w:r>
     </w:p>
-    <w:bookmarkEnd w:id="45"/>
-    <w:bookmarkStart w:id="50" w:name="X6f6fe317ba0cb18ffb6dfc71314c6d0ee2f4a72"/>
+    <w:bookmarkEnd w:id="52"/>
+    <w:bookmarkStart w:id="57" w:name="X6f6fe317ba0cb18ffb6dfc71314c6d0ee2f4a72"/>
     <w:p>
       <w:pPr>
         <w:pStyle w:val="Heading2"/>
@@ -7448,18 +7505,18 @@
           <wp:inline>
             <wp:extent cx="4373880" cy="2672926"/>
             <wp:effectExtent b="0" l="0" r="0" t="0"/>
-            <wp:docPr descr="Direction score by position on frozen held-out: both lenses rise at the relation-completing token and track the model’s own next-token preference; the randomised transport stays at chance." title="" id="46" name="Picture"/>
+            <wp:docPr descr="Direction score by position on frozen held-out: both lenses rise at the relation-completing token and track the model’s own next-token preference; the randomised transport stays at chance." title="" id="53" name="Picture"/>
             <a:graphic>
               <a:graphicData uri="http://schemas.openxmlformats.org/drawingml/2006/picture">
                 <pic:pic>
                   <pic:nvPicPr>
-                    <pic:cNvPr descr="results/figures/stage3-frac-by-position.png" id="47" name="Picture"/>
+                    <pic:cNvPr descr="results/figures/stage3-frac-by-position.png" id="54" name="Picture"/>
                     <pic:cNvPicPr>
                       <a:picLocks noChangeArrowheads="1" noChangeAspect="1"/>
                     </pic:cNvPicPr>
                   </pic:nvPicPr>
                   <pic:blipFill>
-                    <a:blip r:embed="rId10"/>
+                    <a:blip r:embed="rId12"/>
                     <a:stretch>
                       <a:fillRect/>
                     </a:stretch>
@@ -7884,18 +7941,18 @@
           <wp:inline>
             <wp:extent cx="4373880" cy="2870358"/>
             <wp:effectExtent b="0" l="0" r="0" t="0"/>
-            <wp:docPr descr="On records where the model’s own developing preference is wrong, every passive readout is wrong with it." title="" id="48" name="Picture"/>
+            <wp:docPr descr="On records where the model’s own developing preference is wrong, every passive readout is wrong with it." title="" id="55" name="Picture"/>
             <a:graphic>
               <a:graphicData uri="http://schemas.openxmlformats.org/drawingml/2006/picture">
                 <pic:pic>
                   <pic:nvPicPr>
-                    <pic:cNvPr descr="results/figures/stage3-discriminating-set.png" id="49" name="Picture"/>
+                    <pic:cNvPr descr="results/figures/stage3-discriminating-set.png" id="56" name="Picture"/>
                     <pic:cNvPicPr>
                       <a:picLocks noChangeArrowheads="1" noChangeAspect="1"/>
                     </pic:cNvPicPr>
                   </pic:nvPicPr>
                   <pic:blipFill>
-                    <a:blip r:embed="rId13"/>
+                    <a:blip r:embed="rId18"/>
                     <a:stretch>
                       <a:fillRect/>
                     </a:stretch>
@@ -8367,8 +8424,8 @@
         <w:t xml:space="preserve">instrument, not the model.</w:t>
       </w:r>
     </w:p>
-    <w:bookmarkEnd w:id="50"/>
-    <w:bookmarkStart w:id="51" w:name="layerwise-structure"/>
+    <w:bookmarkEnd w:id="57"/>
+    <w:bookmarkStart w:id="58" w:name="layerwise-structure"/>
     <w:p>
       <w:pPr>
         <w:pStyle w:val="Heading2"/>
@@ -8502,8 +8559,8 @@
         <w:t xml:space="preserve">relation-completing token and is finished by the question mark.</w:t>
       </w:r>
     </w:p>
-    <w:bookmarkEnd w:id="51"/>
-    <w:bookmarkStart w:id="52" w:name="controls"/>
+    <w:bookmarkEnd w:id="58"/>
+    <w:bookmarkStart w:id="59" w:name="controls"/>
     <w:p>
       <w:pPr>
         <w:pStyle w:val="Heading2"/>
@@ -8780,8 +8837,8 @@
         </w:tc>
       </w:tr>
     </w:tbl>
-    <w:bookmarkEnd w:id="52"/>
-    <w:bookmarkStart w:id="53" w:name="causal-arm"/>
+    <w:bookmarkEnd w:id="59"/>
+    <w:bookmarkStart w:id="60" w:name="causal-arm"/>
     <w:p>
       <w:pPr>
         <w:pStyle w:val="Heading2"/>
@@ -8901,9 +8958,9 @@
         </w:pict>
       </w:r>
     </w:p>
-    <w:bookmarkEnd w:id="53"/>
-    <w:bookmarkEnd w:id="54"/>
-    <w:bookmarkStart w:id="55" w:name="error-analysis"/>
+    <w:bookmarkEnd w:id="60"/>
+    <w:bookmarkEnd w:id="61"/>
+    <w:bookmarkStart w:id="62" w:name="error-analysis"/>
     <w:p>
       <w:pPr>
         <w:pStyle w:val="Heading1"/>
@@ -9060,8 +9117,8 @@
         </w:pict>
       </w:r>
     </w:p>
-    <w:bookmarkEnd w:id="55"/>
-    <w:bookmarkStart w:id="56" w:name="sanity-checks-and-red-teaming"/>
+    <w:bookmarkEnd w:id="62"/>
+    <w:bookmarkStart w:id="63" w:name="sanity-checks-and-red-teaming"/>
     <w:p>
       <w:pPr>
         <w:pStyle w:val="Heading1"/>
@@ -9624,8 +9681,8 @@
         </w:pict>
       </w:r>
     </w:p>
-    <w:bookmarkEnd w:id="56"/>
-    <w:bookmarkStart w:id="57" w:name="limitations"/>
+    <w:bookmarkEnd w:id="63"/>
+    <w:bookmarkStart w:id="64" w:name="limitations"/>
     <w:p>
       <w:pPr>
         <w:pStyle w:val="Heading1"/>
@@ -9757,8 +9814,8 @@
         </w:pict>
       </w:r>
     </w:p>
-    <w:bookmarkEnd w:id="57"/>
-    <w:bookmarkStart w:id="58" w:name="what-i-would-do-next"/>
+    <w:bookmarkEnd w:id="64"/>
+    <w:bookmarkStart w:id="65" w:name="what-i-would-do-next"/>
     <w:p>
       <w:pPr>
         <w:pStyle w:val="Heading1"/>
@@ -9898,8 +9955,8 @@
         </w:pict>
       </w:r>
     </w:p>
-    <w:bookmarkEnd w:id="58"/>
-    <w:bookmarkStart w:id="59" w:name="reproducibility"/>
+    <w:bookmarkEnd w:id="65"/>
+    <w:bookmarkStart w:id="66" w:name="reproducibility"/>
     <w:p>
       <w:pPr>
         <w:pStyle w:val="Heading1"/>
@@ -10352,8 +10409,8 @@
         </w:pict>
       </w:r>
     </w:p>
-    <w:bookmarkEnd w:id="59"/>
-    <w:bookmarkStart w:id="60" w:name="time-accounting"/>
+    <w:bookmarkEnd w:id="66"/>
+    <w:bookmarkStart w:id="67" w:name="time-accounting"/>
     <w:p>
       <w:pPr>
         <w:pStyle w:val="Heading1"/>
@@ -10583,8 +10640,8 @@
         </w:pict>
       </w:r>
     </w:p>
-    <w:bookmarkEnd w:id="60"/>
-    <w:bookmarkStart w:id="61" w:name="appendix-where-everything-lives"/>
+    <w:bookmarkEnd w:id="67"/>
+    <w:bookmarkStart w:id="68" w:name="appendix-where-everything-lives"/>
     <w:p>
       <w:pPr>
         <w:pStyle w:val="Heading1"/>
@@ -10691,7 +10748,7 @@
         <w:t xml:space="preserve">.</w:t>
       </w:r>
     </w:p>
-    <w:bookmarkEnd w:id="61"/>
+    <w:bookmarkEnd w:id="68"/>
     <w:sectPr>
       <w:pgMar w:bottom="1020" w:left="1134" w:right="1134" w:top="1020"/>
     </w:sectPr>

</xml_diff>

<commit_message>
Rebuild report with split experiments and three figures
Co-Authored-By: Claude Fable 5.1 <noreply@anthropic.com>

Claude-Session: https://claude.ai/code/session_011eNoRh7HnqxwuUuQK5Y4fW
</commit_message>
<xml_diff>
--- a/writeup/mats12-report.docx
+++ b/writeup/mats12-report.docx
@@ -34,7 +34,7 @@
         <w:t xml:space="preserve">September 2026</w:t>
       </w:r>
     </w:p>
-    <w:bookmarkStart w:id="24" w:name="executive-summary"/>
+    <w:bookmarkStart w:id="30" w:name="executive-summary"/>
     <w:p>
       <w:pPr>
         <w:pStyle w:val="Heading1"/>
@@ -96,7 +96,7 @@
       </w:r>
     </w:p>
     <w:bookmarkEnd w:id="10"/>
-    <w:bookmarkStart w:id="11" w:name="methodology"/>
+    <w:bookmarkStart w:id="14" w:name="methodology"/>
     <w:p>
       <w:pPr>
         <w:pStyle w:val="Heading2"/>
@@ -121,8 +121,62 @@
         <w:t xml:space="preserve">Using the held-out data, I again probed at the frozen layers at each position to measure the margin. A positive value means the lens prefers the correct answer. The magnitude of that number measures how much it’s preferred. Of the 4 positions, the interesting one is the word in the question that first pins down the answer.</w:t>
       </w:r>
     </w:p>
+    <w:bookmarkStart w:id="11" w:name="X4a6fd96a50095f0c1c76a4f92280384136ed846"/>
+    <w:p>
+      <w:pPr>
+        <w:pStyle w:val="Heading3"/>
+      </w:pPr>
+      <w:r>
+        <w:t xml:space="preserve">Experiment 1 — Does J-Lens beat the logit lens at binding?</w:t>
+      </w:r>
+    </w:p>
+    <w:p>
+      <w:pPr>
+        <w:pStyle w:val="FirstParagraph"/>
+      </w:pPr>
+      <w:r>
+        <w:t xml:space="preserve">The dataset had 50 prompt pairs: 10 for development (40 records) and 40 held out (160 records), not looked at until the layers and positions were frozen. I ran J-Lens and the logit lens on the held-out records at the frozen positions and layers. The logit lens here is the same code with the Jacobian switched off, so the only thing that differs between the two is the Jacobian.</w:t>
+      </w:r>
+    </w:p>
     <w:bookmarkEnd w:id="11"/>
-    <w:bookmarkStart w:id="15" w:name="results"/>
+    <w:bookmarkStart w:id="12" w:name="experiment-2-do-the-controls-hold"/>
+    <w:p>
+      <w:pPr>
+        <w:pStyle w:val="Heading3"/>
+      </w:pPr>
+      <w:r>
+        <w:t xml:space="preserve">Experiment 2 — Do the controls hold?</w:t>
+      </w:r>
+    </w:p>
+    <w:p>
+      <w:pPr>
+        <w:pStyle w:val="FirstParagraph"/>
+      </w:pPr>
+      <w:r>
+        <w:t xml:space="preserve">In experiment 2, I used 2 controls. First I shuffled the labels. I took the 160 held-out records with the lens readings computed. For each record I randomly reassign which city is marked correct (drawn from the pool of 6 cities, using a fixed randomizer seed). Then I re-grade the lens reading against the shuffled key. The second control was a random matrix used in place of the prefit J-Lens matrix. I ran the full pipeline with the same prompts and the random matrix using the same positions, layers, activations and scoring.</w:t>
+      </w:r>
+    </w:p>
+    <w:bookmarkEnd w:id="12"/>
+    <w:bookmarkStart w:id="13" w:name="X444d33cdc79da0ce4be1444b3a46153c51831c6"/>
+    <w:p>
+      <w:pPr>
+        <w:pStyle w:val="Heading3"/>
+      </w:pPr>
+      <w:r>
+        <w:t xml:space="preserve">Experiment 3 — What replaced the causal test</w:t>
+      </w:r>
+    </w:p>
+    <w:p>
+      <w:pPr>
+        <w:pStyle w:val="FirstParagraph"/>
+      </w:pPr>
+      <w:r>
+        <w:t xml:space="preserve">My original plan was to create a test that changes the part of the model’s internal state J-Lens reads and checks whether the model’s answer changes. The piece it needs wasn’t in the released code, and building it was out of scope for 20 hours. So instead, I used the records where the model was already leaning toward the wrong city. I then graded the lens readings I already had on just those records. The intuition here is that the correct answer is still sitting in the prompt, however if the lens still gets it wrong, it’s tending to follow the lean of the model, vs reading any binding information that is likely not present.</w:t>
+      </w:r>
+    </w:p>
+    <w:bookmarkEnd w:id="13"/>
+    <w:bookmarkEnd w:id="14"/>
+    <w:bookmarkStart w:id="27" w:name="results"/>
     <w:p>
       <w:pPr>
         <w:pStyle w:val="Heading2"/>
@@ -137,6 +191,23 @@
       </w:pPr>
       <w:r>
         <w:t xml:space="preserve">J-Lens scored 0.781 vs 0.519 for a shuffled-label control at the relation token. But the model’s own next-token leaning was already right 0.800 of the time at that same spot. On the records where the model is wrong, the lens reduces to 0.344 and 0.125, to chance and below. A probe trained with the answer key read 0.525 at the same spot where J-Lens read 0.781, so there was no binding signal there for it to find. The simplest explanation that fits all three numbers is that the lens was guessing the model’s answer, not reading its memory.</w:t>
+      </w:r>
+    </w:p>
+    <w:bookmarkStart w:id="18" w:name="X37e29ec4fcbb26b6a24c8fbd0d64dce820a33b3"/>
+    <w:p>
+      <w:pPr>
+        <w:pStyle w:val="Heading3"/>
+      </w:pPr>
+      <w:r>
+        <w:t xml:space="preserve">Experiment 1 — Does J-Lens beat the logit lens at binding?</w:t>
+      </w:r>
+    </w:p>
+    <w:p>
+      <w:pPr>
+        <w:pStyle w:val="FirstParagraph"/>
+      </w:pPr>
+      <w:r>
+        <w:t xml:space="preserve">At the relation token J-Lens scored 0.781 and the logit lens 0.688, both against a 0.519 shuffled-label control; at the question mark the logit lens was ahead, 0.738 to 0.669. The model’s own next-token leaning was already right 80% of the time at that same spot. So on picking the right city it is a wash. Where J-Lens clearly wins is ranking: it puts the correct city at rank 35 of 248K, the logit lens near 1,000. Even so, it still does not appear to be reading any bindings at these layers.</w:t>
       </w:r>
     </w:p>
     <w:p>
@@ -148,18 +219,18 @@
           <wp:inline>
             <wp:extent cx="4267200" cy="2607733"/>
             <wp:effectExtent b="0" l="0" r="0" t="0"/>
-            <wp:docPr descr="Figure 1. Direction score by position on frozen held-out data (n=160): both lenses rise at the token that pins down the answer and track the model’s own next-token preference; the shuffled-label and random-transport controls stay at chance." title="" id="13" name="Picture"/>
+            <wp:docPr descr="Figure 1. Direction score by position on frozen held-out data (n=160): both lenses rise at the token that pins down the answer and track the model’s own next-token preference; the shuffled-label and random-transport controls stay at chance." title="" id="16" name="Picture"/>
             <a:graphic>
               <a:graphicData uri="http://schemas.openxmlformats.org/drawingml/2006/picture">
                 <pic:pic>
                   <pic:nvPicPr>
-                    <pic:cNvPr descr="results/figures/stage3-frac-by-position.png" id="14" name="Picture"/>
+                    <pic:cNvPr descr="results/figures/stage3-frac-by-position.png" id="17" name="Picture"/>
                     <pic:cNvPicPr>
                       <a:picLocks noChangeArrowheads="1" noChangeAspect="1"/>
                     </pic:cNvPicPr>
                   </pic:nvPicPr>
                   <pic:blipFill>
-                    <a:blip r:embed="rId12"/>
+                    <a:blip r:embed="rId15"/>
                     <a:stretch>
                       <a:fillRect/>
                     </a:stretch>
@@ -194,14 +265,14 @@
         <w:t xml:space="preserve">Figure 1. Direction score by position on frozen held-out data (n=160): both lenses rise at the token that pins down the answer and track the model’s own next-token preference; the shuffled-label and random-transport controls stay at chance.</w:t>
       </w:r>
     </w:p>
-    <w:bookmarkEnd w:id="15"/>
-    <w:bookmarkStart w:id="16" w:name="X4a6fd96a50095f0c1c76a4f92280384136ed846"/>
-    <w:p>
-      <w:pPr>
-        <w:pStyle w:val="Heading2"/>
-      </w:pPr>
-      <w:r>
-        <w:t xml:space="preserve">Experiment 1 — Does J-Lens beat the logit lens at binding?</w:t>
+    <w:bookmarkEnd w:id="18"/>
+    <w:bookmarkStart w:id="22" w:name="experiment-2-do-the-controls-hold-1"/>
+    <w:p>
+      <w:pPr>
+        <w:pStyle w:val="Heading3"/>
+      </w:pPr>
+      <w:r>
+        <w:t xml:space="preserve">Experiment 2 — Do the controls hold?</w:t>
       </w:r>
     </w:p>
     <w:p>
@@ -209,43 +280,7 @@
         <w:pStyle w:val="FirstParagraph"/>
       </w:pPr>
       <w:r>
-        <w:t xml:space="preserve">The dataset had 50 prompt pairs: 10 for development (40 records) and 40 held out (160 records), not looked at until the layers and positions were frozen. I ran J-Lens and the logit lens on the held-out records at the frozen positions and layers. The logit lens here is the same code with the Jacobian switched off, so the only thing that differs between the two is the Jacobian. At the relation token J-Lens scored 0.781 and the logit lens 0.688, both against a 0.519 shuffled-label control; at the question mark the logit lens was ahead, 0.738 to 0.669. The model’s own next-token leaning was already right 80% of the time at that same spot. So on picking the right city it is a wash. Where J-Lens clearly wins is ranking: it puts the correct city at rank 35 of 248K, the logit lens near 1,000. Even so, it still does not appear to be reading any bindings at these layers.</w:t>
-      </w:r>
-    </w:p>
-    <w:bookmarkEnd w:id="16"/>
-    <w:bookmarkStart w:id="17" w:name="experiment-2-do-the-controls-hold"/>
-    <w:p>
-      <w:pPr>
-        <w:pStyle w:val="Heading2"/>
-      </w:pPr>
-      <w:r>
-        <w:t xml:space="preserve">Experiment 2 — Do the controls hold?</w:t>
-      </w:r>
-    </w:p>
-    <w:p>
-      <w:pPr>
-        <w:pStyle w:val="FirstParagraph"/>
-      </w:pPr>
-      <w:r>
-        <w:t xml:space="preserve">In experiment 2, I used 2 controls. First I shuffled the labels. I took the 160 held-out records with the lens readings computed. For each record I randomly reassign which city is marked correct (drawn from the pool of 6 cities, using a fixed randomizer seed). Then I re-grade the lens reading against the shuffled key. The results were 0.52 at the relation token, 0.556 at the question mark, and 0.35 on the dev set. This rules out a scoring step that scores high without the real answer key. The second control was a random matrix used in place of the prefit J-Lens matrix. I ran the full pipeline with the same prompts and the random matrix using the same positions, layers, activations and scoring. The resulting direction was 0.475-0.537 everywhere, and the correct city was a median rank of 130K-206K out of 248,320, versus 35 for the real matrix. So the trained matrix is what does the work.</w:t>
-      </w:r>
-    </w:p>
-    <w:bookmarkEnd w:id="17"/>
-    <w:bookmarkStart w:id="21" w:name="X444d33cdc79da0ce4be1444b3a46153c51831c6"/>
-    <w:p>
-      <w:pPr>
-        <w:pStyle w:val="Heading2"/>
-      </w:pPr>
-      <w:r>
-        <w:t xml:space="preserve">Experiment 3 — What replaced the causal test</w:t>
-      </w:r>
-    </w:p>
-    <w:p>
-      <w:pPr>
-        <w:pStyle w:val="FirstParagraph"/>
-      </w:pPr>
-      <w:r>
-        <w:t xml:space="preserve">My original plan was to create a test that changes the part of the model’s internal state J-Lens reads and checks whether the model’s answer changes. The piece it needs wasn’t in the released code, and building it was out of scope for 20 hours. So instead, I used the records where the model was already leaning toward the wrong city. I then graded the lens readings I already had on just those records. The intuition here is that the correct answer is still sitting in the prompt, however if the lens still gets it wrong, it’s tending to follow the lean of the model, vs reading any binding information that is likely not present. I used the records where the model’s own guess pointed to the wrong city (32 records at the relation token, 40 at the question mark). A lens that reads binding should still get these right. J-Lens got 0.344 and 0.125, chance and below. A probe trained with the answer key read 0.525 at the same spot, so no method found a binding signal there. The simplest explanation that fits all three numbers is that the lens was guessing the model’s answer, not reading its memory.</w:t>
+        <w:t xml:space="preserve">With the shuffled labels, the results were 0.52 at the relation token, 0.556 at the question mark, and 0.35 on the dev set. This rules out a scoring step that scores high without the real answer key. With the random matrix, the resulting direction was 0.475-0.537 everywhere, and the correct city was a median rank of 130K-206K out of 248,320, versus 35 for the real matrix. So the trained matrix is what does the work.</w:t>
       </w:r>
     </w:p>
     <w:p>
@@ -255,20 +290,93 @@
       <w:r>
         <w:drawing>
           <wp:inline>
-            <wp:extent cx="4267200" cy="2800349"/>
+            <wp:extent cx="4267200" cy="2489199"/>
             <wp:effectExtent b="0" l="0" r="0" t="0"/>
-            <wp:docPr descr="Figure 2. J-Lens accuracy on held-out records, split by whether the model itself was leaning right or wrong. Where the model leaned wrong, every passive readout followed it below chance." title="" id="19" name="Picture"/>
+            <wp:docPr descr="Figure 2. Experiment 2 controls on frozen held-out data (n=160): shuffling the answer key drops J-Lens to chance, and a random matrix in place of the trained one drops both the direction score to chance and the median rank of the correct city from about a hundred to over a hundred thousand." title="" id="20" name="Picture"/>
             <a:graphic>
               <a:graphicData uri="http://schemas.openxmlformats.org/drawingml/2006/picture">
                 <pic:pic>
                   <pic:nvPicPr>
-                    <pic:cNvPr descr="results/figures/stage3-discriminating-set.png" id="20" name="Picture"/>
+                    <pic:cNvPr descr="results/figures/stage3-controls.png" id="21" name="Picture"/>
                     <pic:cNvPicPr>
                       <a:picLocks noChangeArrowheads="1" noChangeAspect="1"/>
                     </pic:cNvPicPr>
                   </pic:nvPicPr>
                   <pic:blipFill>
-                    <a:blip r:embed="rId18"/>
+                    <a:blip r:embed="rId19"/>
+                    <a:stretch>
+                      <a:fillRect/>
+                    </a:stretch>
+                  </pic:blipFill>
+                  <pic:spPr bwMode="auto">
+                    <a:xfrm>
+                      <a:off x="0" y="0"/>
+                      <a:ext cx="4267200" cy="2489199"/>
+                    </a:xfrm>
+                    <a:prstGeom prst="rect">
+                      <a:avLst/>
+                    </a:prstGeom>
+                    <a:noFill/>
+                    <a:ln w="9525">
+                      <a:noFill/>
+                      <a:headEnd/>
+                      <a:tailEnd/>
+                    </a:ln>
+                  </pic:spPr>
+                </pic:pic>
+              </a:graphicData>
+            </a:graphic>
+          </wp:inline>
+        </w:drawing>
+      </w:r>
+    </w:p>
+    <w:p>
+      <w:pPr>
+        <w:pStyle w:val="ImageCaption"/>
+      </w:pPr>
+      <w:r>
+        <w:t xml:space="preserve">Figure 2. Experiment 2 controls on frozen held-out data (n=160): shuffling the answer key drops J-Lens to chance, and a random matrix in place of the trained one drops both the direction score to chance and the median rank of the correct city from about a hundred to over a hundred thousand.</w:t>
+      </w:r>
+    </w:p>
+    <w:bookmarkEnd w:id="22"/>
+    <w:bookmarkStart w:id="26" w:name="Xc1b240b072d38eb22c13024c193503c134e0f50"/>
+    <w:p>
+      <w:pPr>
+        <w:pStyle w:val="Heading3"/>
+      </w:pPr>
+      <w:r>
+        <w:t xml:space="preserve">Experiment 3 — What replaced the causal test</w:t>
+      </w:r>
+    </w:p>
+    <w:p>
+      <w:pPr>
+        <w:pStyle w:val="FirstParagraph"/>
+      </w:pPr>
+      <w:r>
+        <w:t xml:space="preserve">I used the records where the model’s own guess pointed to the wrong city (32 records at the relation token, 40 at the question mark). A lens that reads binding should still get these right. J-Lens got 0.344 and 0.125, chance and below. A probe trained with the answer key read 0.525 at the same spot, so no method found a binding signal there. The simplest explanation that fits all three numbers is that the lens was guessing the model’s answer, not reading its memory.</w:t>
+      </w:r>
+    </w:p>
+    <w:p>
+      <w:pPr>
+        <w:pStyle w:val="CaptionedFigure"/>
+      </w:pPr>
+      <w:r>
+        <w:drawing>
+          <wp:inline>
+            <wp:extent cx="4267200" cy="2800349"/>
+            <wp:effectExtent b="0" l="0" r="0" t="0"/>
+            <wp:docPr descr="Figure 3. J-Lens accuracy on held-out records, split by whether the model itself was leaning right or wrong. Where the model leaned wrong, every passive readout followed it below chance." title="" id="24" name="Picture"/>
+            <a:graphic>
+              <a:graphicData uri="http://schemas.openxmlformats.org/drawingml/2006/picture">
+                <pic:pic>
+                  <pic:nvPicPr>
+                    <pic:cNvPr descr="results/figures/stage3-discriminating-set.png" id="25" name="Picture"/>
+                    <pic:cNvPicPr>
+                      <a:picLocks noChangeArrowheads="1" noChangeAspect="1"/>
+                    </pic:cNvPicPr>
+                  </pic:nvPicPr>
+                  <pic:blipFill>
+                    <a:blip r:embed="rId23"/>
                     <a:stretch>
                       <a:fillRect/>
                     </a:stretch>
@@ -300,11 +408,12 @@
         <w:pStyle w:val="ImageCaption"/>
       </w:pPr>
       <w:r>
-        <w:t xml:space="preserve">Figure 2. J-Lens accuracy on held-out records, split by whether the model itself was leaning right or wrong. Where the model leaned wrong, every passive readout followed it below chance.</w:t>
-      </w:r>
-    </w:p>
-    <w:bookmarkEnd w:id="21"/>
-    <w:bookmarkStart w:id="22" w:name="high-level-takeaways"/>
+        <w:t xml:space="preserve">Figure 3. J-Lens accuracy on held-out records, split by whether the model itself was leaning right or wrong. Where the model leaned wrong, every passive readout followed it below chance.</w:t>
+      </w:r>
+    </w:p>
+    <w:bookmarkEnd w:id="26"/>
+    <w:bookmarkEnd w:id="27"/>
+    <w:bookmarkStart w:id="28" w:name="high-level-takeaways"/>
     <w:p>
       <w:pPr>
         <w:pStyle w:val="Heading2"/>
@@ -361,8 +470,8 @@
         <w:t xml:space="preserve">J-Lens is better than the logit lens at ranking the right words. J-Lens vs Logit Lens had a ranking of 35 vs 1000 out of 248K words.</w:t>
       </w:r>
     </w:p>
-    <w:bookmarkEnd w:id="22"/>
-    <w:bookmarkStart w:id="23" w:name="biggest-limitation"/>
+    <w:bookmarkEnd w:id="28"/>
+    <w:bookmarkStart w:id="29" w:name="biggest-limitation"/>
     <w:p>
       <w:pPr>
         <w:pStyle w:val="Heading2"/>
@@ -379,9 +488,9 @@
         <w:t xml:space="preserve">One model, one released lens, one small task with six cities. At the position that matters most, even a probe trained with the answers found nothing, so I cannot say whether the binding is stored at some layer or position I did not read. I also did not test whether changing the residual changes the answer, so my claims are correlation only.</w:t>
       </w:r>
     </w:p>
-    <w:bookmarkEnd w:id="23"/>
-    <w:bookmarkEnd w:id="24"/>
-    <w:bookmarkStart w:id="30" w:name="randomly-selected-raw-examples"/>
+    <w:bookmarkEnd w:id="29"/>
+    <w:bookmarkEnd w:id="30"/>
+    <w:bookmarkStart w:id="36" w:name="randomly-selected-raw-examples"/>
     <w:p>
       <w:pPr>
         <w:pStyle w:val="Heading1"/>
@@ -537,7 +646,7 @@
         <w:t xml:space="preserve">committed run output; agent-unverified.</w:t>
       </w:r>
     </w:p>
-    <w:bookmarkStart w:id="25" w:name="example-1-success-real-zero-035-bba-t6"/>
+    <w:bookmarkStart w:id="31" w:name="example-1-success-real-zero-035-bba-t6"/>
     <w:p>
       <w:pPr>
         <w:pStyle w:val="Heading3"/>
@@ -823,8 +932,8 @@
         </w:tc>
       </w:tr>
     </w:tbl>
-    <w:bookmarkEnd w:id="25"/>
-    <w:bookmarkStart w:id="26" w:name="example-2-success-real-zero-047-aba-t6"/>
+    <w:bookmarkEnd w:id="31"/>
+    <w:bookmarkStart w:id="32" w:name="example-2-success-real-zero-047-aba-t6"/>
     <w:p>
       <w:pPr>
         <w:pStyle w:val="Heading3"/>
@@ -1110,8 +1219,8 @@
         </w:tc>
       </w:tr>
     </w:tbl>
-    <w:bookmarkEnd w:id="26"/>
-    <w:bookmarkStart w:id="27" w:name="example-3-failure-real-zero-035-bab-t6"/>
+    <w:bookmarkEnd w:id="32"/>
+    <w:bookmarkStart w:id="33" w:name="example-3-failure-real-zero-035-bab-t6"/>
     <w:p>
       <w:pPr>
         <w:pStyle w:val="Heading3"/>
@@ -1397,8 +1506,8 @@
         </w:tc>
       </w:tr>
     </w:tbl>
-    <w:bookmarkEnd w:id="27"/>
-    <w:bookmarkStart w:id="28" w:name="example-4-failure-real-zero-023-bba-t6"/>
+    <w:bookmarkEnd w:id="33"/>
+    <w:bookmarkStart w:id="34" w:name="example-4-failure-real-zero-023-bba-t6"/>
     <w:p>
       <w:pPr>
         <w:pStyle w:val="Heading3"/>
@@ -1684,8 +1793,8 @@
         </w:tc>
       </w:tr>
     </w:tbl>
-    <w:bookmarkEnd w:id="28"/>
-    <w:bookmarkStart w:id="29" w:name="X08d12fc239e1304c729fa2c498dcd7bd419b671"/>
+    <w:bookmarkEnd w:id="34"/>
+    <w:bookmarkStart w:id="35" w:name="X08d12fc239e1304c729fa2c498dcd7bd419b671"/>
     <w:p>
       <w:pPr>
         <w:pStyle w:val="Heading3"/>
@@ -1978,9 +2087,9 @@
         </w:pict>
       </w:r>
     </w:p>
-    <w:bookmarkEnd w:id="29"/>
-    <w:bookmarkEnd w:id="30"/>
-    <w:bookmarkStart w:id="37" w:name="motivation-and-research-question"/>
+    <w:bookmarkEnd w:id="35"/>
+    <w:bookmarkEnd w:id="36"/>
+    <w:bookmarkStart w:id="43" w:name="motivation-and-research-question"/>
     <w:p>
       <w:pPr>
         <w:pStyle w:val="Heading1"/>
@@ -2025,7 +2134,7 @@
         <w:t xml:space="preserve">the model’s answer?</w:t>
       </w:r>
     </w:p>
-    <w:bookmarkStart w:id="31" w:name="what-j-lens-is-briefly"/>
+    <w:bookmarkStart w:id="37" w:name="what-j-lens-is-briefly"/>
     <w:p>
       <w:pPr>
         <w:pStyle w:val="Heading2"/>
@@ -2042,8 +2151,8 @@
         <w:t xml:space="preserve">J-Lens is defined from first principles in §2.1.</w:t>
       </w:r>
     </w:p>
-    <w:bookmarkEnd w:id="31"/>
-    <w:bookmarkStart w:id="35" w:name="X44758b870a0731464fb2764574cc64fea7fcb2d"/>
+    <w:bookmarkEnd w:id="37"/>
+    <w:bookmarkStart w:id="41" w:name="X44758b870a0731464fb2764574cc64fea7fcb2d"/>
     <w:p>
       <w:pPr>
         <w:pStyle w:val="Heading2"/>
@@ -2149,18 +2258,18 @@
           <wp:inline>
             <wp:extent cx="4373880" cy="2142308"/>
             <wp:effectExtent b="0" l="0" r="0" t="0"/>
-            <wp:docPr descr="The binding problem: two prompts, the same four concepts, opposite pairings. Only the pairing distinguishes them, so only a reader of the relation can tell them apart." title="" id="33" name="Picture"/>
+            <wp:docPr descr="The binding problem: two prompts, the same four concepts, opposite pairings. Only the pairing distinguishes them, so only a reader of the relation can tell them apart." title="" id="39" name="Picture"/>
             <a:graphic>
               <a:graphicData uri="http://schemas.openxmlformats.org/drawingml/2006/picture">
                 <pic:pic>
                   <pic:nvPicPr>
-                    <pic:cNvPr descr="results/figures/binding-concept/fig1-binding-problem.png" id="34" name="Picture"/>
+                    <pic:cNvPr descr="results/figures/binding-concept/fig1-binding-problem.png" id="40" name="Picture"/>
                     <pic:cNvPicPr>
                       <a:picLocks noChangeArrowheads="1" noChangeAspect="1"/>
                     </pic:cNvPicPr>
                   </pic:nvPicPr>
                   <pic:blipFill>
-                    <a:blip r:embed="rId32"/>
+                    <a:blip r:embed="rId38"/>
                     <a:stretch>
                       <a:fillRect/>
                     </a:stretch>
@@ -2398,8 +2507,8 @@
         <w:t xml:space="preserve">selection, not a linearly decodable stored binding.</w:t>
       </w:r>
     </w:p>
-    <w:bookmarkEnd w:id="35"/>
-    <w:bookmarkStart w:id="36" w:name="the-gap"/>
+    <w:bookmarkEnd w:id="41"/>
+    <w:bookmarkStart w:id="42" w:name="the-gap"/>
     <w:p>
       <w:pPr>
         <w:pStyle w:val="Heading2"/>
@@ -2477,9 +2586,9 @@
         </w:pict>
       </w:r>
     </w:p>
-    <w:bookmarkEnd w:id="36"/>
-    <w:bookmarkEnd w:id="37"/>
-    <w:bookmarkStart w:id="50" w:name="method"/>
+    <w:bookmarkEnd w:id="42"/>
+    <w:bookmarkEnd w:id="43"/>
+    <w:bookmarkStart w:id="56" w:name="method"/>
     <w:p>
       <w:pPr>
         <w:pStyle w:val="Heading1"/>
@@ -2590,7 +2699,7 @@
         <w:t xml:space="preserve">turns out to be the interesting part, this project has failed.</w:t>
       </w:r>
     </w:p>
-    <w:bookmarkStart w:id="38" w:name="X57525b78a038dd7677b74b2cd929c744f8e7d70"/>
+    <w:bookmarkStart w:id="44" w:name="X57525b78a038dd7677b74b2cd929c744f8e7d70"/>
     <w:p>
       <w:pPr>
         <w:pStyle w:val="Heading2"/>
@@ -3015,8 +3124,8 @@
         <w:t xml:space="preserve">question with no obvious answer in either direction.</w:t>
       </w:r>
     </w:p>
-    <w:bookmarkEnd w:id="38"/>
-    <w:bookmarkStart w:id="39" w:name="substrate-model-lens-and-environment"/>
+    <w:bookmarkEnd w:id="44"/>
+    <w:bookmarkStart w:id="45" w:name="substrate-model-lens-and-environment"/>
     <w:p>
       <w:pPr>
         <w:pStyle w:val="Heading2"/>
@@ -3690,8 +3799,8 @@
         <w:t xml:space="preserve">8.51 GB of 47.7 GB — headroom is not a constraint on this design.</w:t>
       </w:r>
     </w:p>
-    <w:bookmarkEnd w:id="39"/>
-    <w:bookmarkStart w:id="40" w:name="Xe108057b195fe3c9ce8721c4dbab2e15b618e33"/>
+    <w:bookmarkEnd w:id="45"/>
+    <w:bookmarkStart w:id="46" w:name="Xe108057b195fe3c9ce8721c4dbab2e15b618e33"/>
     <w:p>
       <w:pPr>
         <w:pStyle w:val="Heading2"/>
@@ -4319,8 +4428,8 @@
         <w:t xml:space="preserve">, and are never tuned on.</w:t>
       </w:r>
     </w:p>
-    <w:bookmarkEnd w:id="40"/>
-    <w:bookmarkStart w:id="41" w:name="Xca73d2c970aa0db9760c2d5b75ab5af6c348063"/>
+    <w:bookmarkEnd w:id="46"/>
+    <w:bookmarkStart w:id="47" w:name="Xca73d2c970aa0db9760c2d5b75ab5af6c348063"/>
     <w:p>
       <w:pPr>
         <w:pStyle w:val="Heading2"/>
@@ -4693,8 +4802,8 @@
         <w:t xml:space="preserve">contaminated and undetermined references respectively.</w:t>
       </w:r>
     </w:p>
-    <w:bookmarkEnd w:id="41"/>
-    <w:bookmarkStart w:id="49" w:name="arms-metrics-and-controls"/>
+    <w:bookmarkEnd w:id="47"/>
+    <w:bookmarkStart w:id="55" w:name="arms-metrics-and-controls"/>
     <w:p>
       <w:pPr>
         <w:pStyle w:val="Heading2"/>
@@ -4712,18 +4821,18 @@
           <wp:inline>
             <wp:extent cx="4373880" cy="2767148"/>
             <wp:effectExtent b="0" l="0" r="0" t="0"/>
-            <wp:docPr descr="Three instruments on the same residual: the supervised difference-in-means probe as ceiling, J-Lens as the unsupervised reader, and the logit lens as floor." title="" id="43" name="Picture"/>
+            <wp:docPr descr="Three instruments on the same residual: the supervised difference-in-means probe as ceiling, J-Lens as the unsupervised reader, and the logit lens as floor." title="" id="49" name="Picture"/>
             <a:graphic>
               <a:graphicData uri="http://schemas.openxmlformats.org/drawingml/2006/picture">
                 <pic:pic>
                   <pic:nvPicPr>
-                    <pic:cNvPr descr="results/figures/binding-concept/fig3-three-instruments.png" id="44" name="Picture"/>
+                    <pic:cNvPr descr="results/figures/binding-concept/fig3-three-instruments.png" id="50" name="Picture"/>
                     <pic:cNvPicPr>
                       <a:picLocks noChangeArrowheads="1" noChangeAspect="1"/>
                     </pic:cNvPicPr>
                   </pic:nvPicPr>
                   <pic:blipFill>
-                    <a:blip r:embed="rId42"/>
+                    <a:blip r:embed="rId48"/>
                     <a:stretch>
                       <a:fillRect/>
                     </a:stretch>
@@ -4758,7 +4867,7 @@
         <w:t xml:space="preserve">Three instruments on the same residual: the supervised difference-in-means probe as ceiling, J-Lens as the unsupervised reader, and the logit lens as floor.</w:t>
       </w:r>
     </w:p>
-    <w:bookmarkStart w:id="45" w:name="three-arms"/>
+    <w:bookmarkStart w:id="51" w:name="three-arms"/>
     <w:p>
       <w:pPr>
         <w:pStyle w:val="Heading3"/>
@@ -5140,8 +5249,8 @@
         <w:t xml:space="preserve">passive script.)</w:t>
       </w:r>
     </w:p>
-    <w:bookmarkEnd w:id="45"/>
-    <w:bookmarkStart w:id="46" w:name="metrics"/>
+    <w:bookmarkEnd w:id="51"/>
+    <w:bookmarkStart w:id="52" w:name="metrics"/>
     <w:p>
       <w:pPr>
         <w:pStyle w:val="Heading3"/>
@@ -5430,8 +5539,8 @@
         <w:t xml:space="preserve">never form a vocabulary rank and are unaffected.</w:t>
       </w:r>
     </w:p>
-    <w:bookmarkEnd w:id="46"/>
-    <w:bookmarkStart w:id="47" w:name="baselines-and-controls"/>
+    <w:bookmarkEnd w:id="52"/>
+    <w:bookmarkStart w:id="53" w:name="baselines-and-controls"/>
     <w:p>
       <w:pPr>
         <w:pStyle w:val="Heading3"/>
@@ -6391,8 +6500,8 @@
         <w:t xml:space="preserve">11–357 at its selected layers.</w:t>
       </w:r>
     </w:p>
-    <w:bookmarkEnd w:id="47"/>
-    <w:bookmarkStart w:id="48" w:name="Xf1357951e2d3a6b81edaa0ff5b599eb419d4d06"/>
+    <w:bookmarkEnd w:id="53"/>
+    <w:bookmarkStart w:id="54" w:name="Xf1357951e2d3a6b81edaa0ff5b599eb419d4d06"/>
     <w:p>
       <w:pPr>
         <w:pStyle w:val="Heading3"/>
@@ -6509,10 +6618,10 @@
         </w:pict>
       </w:r>
     </w:p>
-    <w:bookmarkEnd w:id="48"/>
-    <w:bookmarkEnd w:id="49"/>
-    <w:bookmarkEnd w:id="50"/>
-    <w:bookmarkStart w:id="51" w:name="preregistration-and-what-was-frozen-when"/>
+    <w:bookmarkEnd w:id="54"/>
+    <w:bookmarkEnd w:id="55"/>
+    <w:bookmarkEnd w:id="56"/>
+    <w:bookmarkStart w:id="57" w:name="preregistration-and-what-was-frozen-when"/>
     <w:p>
       <w:pPr>
         <w:pStyle w:val="Heading1"/>
@@ -6900,8 +7009,8 @@
         </w:pict>
       </w:r>
     </w:p>
-    <w:bookmarkEnd w:id="51"/>
-    <w:bookmarkStart w:id="61" w:name="results-1"/>
+    <w:bookmarkEnd w:id="57"/>
+    <w:bookmarkStart w:id="67" w:name="results-1"/>
     <w:p>
       <w:pPr>
         <w:pStyle w:val="Heading1"/>
@@ -6910,7 +7019,7 @@
         <w:t xml:space="preserve">4. Results</w:t>
       </w:r>
     </w:p>
-    <w:bookmarkStart w:id="52" w:name="behavioral-eligibility"/>
+    <w:bookmarkStart w:id="58" w:name="behavioral-eligibility"/>
     <w:p>
       <w:pPr>
         <w:pStyle w:val="Heading2"/>
@@ -7196,8 +7305,8 @@
         <w:t xml:space="preserve">already on its way.</w:t>
       </w:r>
     </w:p>
-    <w:bookmarkEnd w:id="52"/>
-    <w:bookmarkStart w:id="57" w:name="X6f6fe317ba0cb18ffb6dfc71314c6d0ee2f4a72"/>
+    <w:bookmarkEnd w:id="58"/>
+    <w:bookmarkStart w:id="63" w:name="X6f6fe317ba0cb18ffb6dfc71314c6d0ee2f4a72"/>
     <w:p>
       <w:pPr>
         <w:pStyle w:val="Heading2"/>
@@ -7505,18 +7614,18 @@
           <wp:inline>
             <wp:extent cx="4373880" cy="2672926"/>
             <wp:effectExtent b="0" l="0" r="0" t="0"/>
-            <wp:docPr descr="Direction score by position on frozen held-out: both lenses rise at the relation-completing token and track the model’s own next-token preference; the randomised transport stays at chance." title="" id="53" name="Picture"/>
+            <wp:docPr descr="Direction score by position on frozen held-out: both lenses rise at the relation-completing token and track the model’s own next-token preference; the randomised transport stays at chance." title="" id="59" name="Picture"/>
             <a:graphic>
               <a:graphicData uri="http://schemas.openxmlformats.org/drawingml/2006/picture">
                 <pic:pic>
                   <pic:nvPicPr>
-                    <pic:cNvPr descr="results/figures/stage3-frac-by-position.png" id="54" name="Picture"/>
+                    <pic:cNvPr descr="results/figures/stage3-frac-by-position.png" id="60" name="Picture"/>
                     <pic:cNvPicPr>
                       <a:picLocks noChangeArrowheads="1" noChangeAspect="1"/>
                     </pic:cNvPicPr>
                   </pic:nvPicPr>
                   <pic:blipFill>
-                    <a:blip r:embed="rId12"/>
+                    <a:blip r:embed="rId15"/>
                     <a:stretch>
                       <a:fillRect/>
                     </a:stretch>
@@ -7941,18 +8050,18 @@
           <wp:inline>
             <wp:extent cx="4373880" cy="2870358"/>
             <wp:effectExtent b="0" l="0" r="0" t="0"/>
-            <wp:docPr descr="On records where the model’s own developing preference is wrong, every passive readout is wrong with it." title="" id="55" name="Picture"/>
+            <wp:docPr descr="On records where the model’s own developing preference is wrong, every passive readout is wrong with it." title="" id="61" name="Picture"/>
             <a:graphic>
               <a:graphicData uri="http://schemas.openxmlformats.org/drawingml/2006/picture">
                 <pic:pic>
                   <pic:nvPicPr>
-                    <pic:cNvPr descr="results/figures/stage3-discriminating-set.png" id="56" name="Picture"/>
+                    <pic:cNvPr descr="results/figures/stage3-discriminating-set.png" id="62" name="Picture"/>
                     <pic:cNvPicPr>
                       <a:picLocks noChangeArrowheads="1" noChangeAspect="1"/>
                     </pic:cNvPicPr>
                   </pic:nvPicPr>
                   <pic:blipFill>
-                    <a:blip r:embed="rId18"/>
+                    <a:blip r:embed="rId23"/>
                     <a:stretch>
                       <a:fillRect/>
                     </a:stretch>
@@ -8424,8 +8533,8 @@
         <w:t xml:space="preserve">instrument, not the model.</w:t>
       </w:r>
     </w:p>
-    <w:bookmarkEnd w:id="57"/>
-    <w:bookmarkStart w:id="58" w:name="layerwise-structure"/>
+    <w:bookmarkEnd w:id="63"/>
+    <w:bookmarkStart w:id="64" w:name="layerwise-structure"/>
     <w:p>
       <w:pPr>
         <w:pStyle w:val="Heading2"/>
@@ -8559,8 +8668,8 @@
         <w:t xml:space="preserve">relation-completing token and is finished by the question mark.</w:t>
       </w:r>
     </w:p>
-    <w:bookmarkEnd w:id="58"/>
-    <w:bookmarkStart w:id="59" w:name="controls"/>
+    <w:bookmarkEnd w:id="64"/>
+    <w:bookmarkStart w:id="65" w:name="controls"/>
     <w:p>
       <w:pPr>
         <w:pStyle w:val="Heading2"/>
@@ -8837,8 +8946,8 @@
         </w:tc>
       </w:tr>
     </w:tbl>
-    <w:bookmarkEnd w:id="59"/>
-    <w:bookmarkStart w:id="60" w:name="causal-arm"/>
+    <w:bookmarkEnd w:id="65"/>
+    <w:bookmarkStart w:id="66" w:name="causal-arm"/>
     <w:p>
       <w:pPr>
         <w:pStyle w:val="Heading2"/>
@@ -8958,9 +9067,9 @@
         </w:pict>
       </w:r>
     </w:p>
-    <w:bookmarkEnd w:id="60"/>
-    <w:bookmarkEnd w:id="61"/>
-    <w:bookmarkStart w:id="62" w:name="error-analysis"/>
+    <w:bookmarkEnd w:id="66"/>
+    <w:bookmarkEnd w:id="67"/>
+    <w:bookmarkStart w:id="68" w:name="error-analysis"/>
     <w:p>
       <w:pPr>
         <w:pStyle w:val="Heading1"/>
@@ -9117,8 +9226,8 @@
         </w:pict>
       </w:r>
     </w:p>
-    <w:bookmarkEnd w:id="62"/>
-    <w:bookmarkStart w:id="63" w:name="sanity-checks-and-red-teaming"/>
+    <w:bookmarkEnd w:id="68"/>
+    <w:bookmarkStart w:id="69" w:name="sanity-checks-and-red-teaming"/>
     <w:p>
       <w:pPr>
         <w:pStyle w:val="Heading1"/>
@@ -9681,8 +9790,8 @@
         </w:pict>
       </w:r>
     </w:p>
-    <w:bookmarkEnd w:id="63"/>
-    <w:bookmarkStart w:id="64" w:name="limitations"/>
+    <w:bookmarkEnd w:id="69"/>
+    <w:bookmarkStart w:id="70" w:name="limitations"/>
     <w:p>
       <w:pPr>
         <w:pStyle w:val="Heading1"/>
@@ -9814,8 +9923,8 @@
         </w:pict>
       </w:r>
     </w:p>
-    <w:bookmarkEnd w:id="64"/>
-    <w:bookmarkStart w:id="65" w:name="what-i-would-do-next"/>
+    <w:bookmarkEnd w:id="70"/>
+    <w:bookmarkStart w:id="71" w:name="what-i-would-do-next"/>
     <w:p>
       <w:pPr>
         <w:pStyle w:val="Heading1"/>
@@ -9955,8 +10064,8 @@
         </w:pict>
       </w:r>
     </w:p>
-    <w:bookmarkEnd w:id="65"/>
-    <w:bookmarkStart w:id="66" w:name="reproducibility"/>
+    <w:bookmarkEnd w:id="71"/>
+    <w:bookmarkStart w:id="72" w:name="reproducibility"/>
     <w:p>
       <w:pPr>
         <w:pStyle w:val="Heading1"/>
@@ -10409,8 +10518,8 @@
         </w:pict>
       </w:r>
     </w:p>
-    <w:bookmarkEnd w:id="66"/>
-    <w:bookmarkStart w:id="67" w:name="time-accounting"/>
+    <w:bookmarkEnd w:id="72"/>
+    <w:bookmarkStart w:id="73" w:name="time-accounting"/>
     <w:p>
       <w:pPr>
         <w:pStyle w:val="Heading1"/>
@@ -10640,8 +10749,8 @@
         </w:pict>
       </w:r>
     </w:p>
-    <w:bookmarkEnd w:id="67"/>
-    <w:bookmarkStart w:id="68" w:name="appendix-where-everything-lives"/>
+    <w:bookmarkEnd w:id="73"/>
+    <w:bookmarkStart w:id="74" w:name="appendix-where-everything-lives"/>
     <w:p>
       <w:pPr>
         <w:pStyle w:val="Heading1"/>
@@ -10748,7 +10857,7 @@
         <w:t xml:space="preserve">.</w:t>
       </w:r>
     </w:p>
-    <w:bookmarkEnd w:id="68"/>
+    <w:bookmarkEnd w:id="74"/>
     <w:sectPr>
       <w:pgMar w:bottom="1020" w:left="1134" w:right="1134" w:top="1020"/>
     </w:sectPr>

</xml_diff>

<commit_message>
Time ledger: Jason-stated hours replace the reconstructed write-up estimates (4.0 write-up, 2.0 exec summary); total 19.3 of 20
Co-Authored-By: Claude Fable 5.1 <noreply@anthropic.com>

Claude-Session: https://claude.ai/code/session_011eNoRh7HnqxwuUuQK5Y4fW
</commit_message>
<xml_diff>
--- a/writeup/mats12-report.docx
+++ b/writeup/mats12-report.docx
@@ -5327,18 +5327,18 @@
               <w:pStyle w:val="Compact"/>
             </w:pPr>
             <w:r>
-              <w:t xml:space="preserve">Write-up drafting (agent: sections, figures, condensation)</w:t>
-            </w:r>
-          </w:p>
-        </w:tc>
-        <w:tc>
-          <w:tcPr/>
-          <w:p>
-            <w:pPr>
-              <w:pStyle w:val="Compact"/>
-            </w:pPr>
-            <w:r>
-              <w:t xml:space="preserve">4.5</w:t>
+              <w:t xml:space="preserve">Main write-up (Jason-stated wall-clock; agent drafting sessions ran inside it)</w:t>
+            </w:r>
+          </w:p>
+        </w:tc>
+        <w:tc>
+          <w:tcPr/>
+          <w:p>
+            <w:pPr>
+              <w:pStyle w:val="Compact"/>
+            </w:pPr>
+            <w:r>
+              <w:t xml:space="preserve">4.0</w:t>
             </w:r>
           </w:p>
         </w:tc>
@@ -5370,13 +5370,13 @@
                 <w:b/>
                 <w:bCs/>
               </w:rPr>
-              <w:t xml:space="preserve">19.8</w:t>
+              <w:t xml:space="preserve">19.3</w:t>
             </w:r>
             <w:r>
               <w:t xml:space="preserve"> </w:t>
             </w:r>
             <w:r>
-              <w:t xml:space="preserve">— 7.1 verified, 12.7 estimated</w:t>
+              <w:t xml:space="preserve">— 7.1 verified, 8.2 estimated, 4.0 stated</w:t>
             </w:r>
           </w:p>
         </w:tc>
@@ -5400,7 +5400,7 @@
               <w:pStyle w:val="Compact"/>
             </w:pPr>
             <w:r>
-              <w:t xml:space="preserve">Jason’s prose, drafted 2026-09-03 to 09-05; hours entered by Jason</w:t>
+              <w:t xml:space="preserve">2.0 of 2.0 — Jason’s prose, Jason-stated</w:t>
             </w:r>
           </w:p>
         </w:tc>

</xml_diff>